<commit_message>
Add Docker Compose requirements for Nginx and MySQL containers
</commit_message>
<xml_diff>
--- a/Tuan05/Baocao_LamNgocThanhPhu_22650381.docx
+++ b/Tuan05/Baocao_LamNgocThanhPhu_22650381.docx
@@ -96,17 +96,145 @@
       </w:r>
     </w:p>
     <w:p>
-      <w:r>
-        <w:tab/>
-      </w:r>
-      <w:r>
-        <w:tab/>
-      </w:r>
-      <w:r>
-        <w:tab/>
-      </w:r>
-      <w:r>
-        <w:tab/>
+      <w:pPr>
+        <w:rPr>
+          <w:lang w:val="en-US"/>
+        </w:rPr>
+      </w:pPr>
+      <w:r>
+        <w:tab/>
+      </w:r>
+      <w:r>
+        <w:drawing>
+          <wp:inline distT="0" distB="0" distL="0" distR="0" wp14:anchorId="0A754A16" wp14:editId="0435957A">
+            <wp:extent cx="5943600" cy="3653790"/>
+            <wp:effectExtent l="0" t="0" r="0" b="3810"/>
+            <wp:docPr id="1125110290" name="Picture 1"/>
+            <wp:cNvGraphicFramePr>
+              <a:graphicFrameLocks xmlns:a="http://schemas.openxmlformats.org/drawingml/2006/main" noChangeAspect="1"/>
+            </wp:cNvGraphicFramePr>
+            <a:graphic xmlns:a="http://schemas.openxmlformats.org/drawingml/2006/main">
+              <a:graphicData uri="http://schemas.openxmlformats.org/drawingml/2006/picture">
+                <pic:pic xmlns:pic="http://schemas.openxmlformats.org/drawingml/2006/picture">
+                  <pic:nvPicPr>
+                    <pic:cNvPr id="1125110290" name=""/>
+                    <pic:cNvPicPr/>
+                  </pic:nvPicPr>
+                  <pic:blipFill>
+                    <a:blip r:embed="rId4"/>
+                    <a:stretch>
+                      <a:fillRect/>
+                    </a:stretch>
+                  </pic:blipFill>
+                  <pic:spPr>
+                    <a:xfrm>
+                      <a:off x="0" y="0"/>
+                      <a:ext cx="5943600" cy="3653790"/>
+                    </a:xfrm>
+                    <a:prstGeom prst="rect">
+                      <a:avLst/>
+                    </a:prstGeom>
+                  </pic:spPr>
+                </pic:pic>
+              </a:graphicData>
+            </a:graphic>
+          </wp:inline>
+        </w:drawing>
+      </w:r>
+    </w:p>
+    <w:p>
+      <w:pPr>
+        <w:rPr>
+          <w:lang w:val="en-US"/>
+        </w:rPr>
+      </w:pPr>
+      <w:r>
+        <w:rPr>
+          <w:lang w:val="en-US"/>
+        </w:rPr>
+        <w:drawing>
+          <wp:inline distT="0" distB="0" distL="0" distR="0" wp14:anchorId="17816816" wp14:editId="48D394CD">
+            <wp:extent cx="5943600" cy="1983105"/>
+            <wp:effectExtent l="0" t="0" r="0" b="0"/>
+            <wp:docPr id="2135493567" name="Picture 1"/>
+            <wp:cNvGraphicFramePr>
+              <a:graphicFrameLocks xmlns:a="http://schemas.openxmlformats.org/drawingml/2006/main" noChangeAspect="1"/>
+            </wp:cNvGraphicFramePr>
+            <a:graphic xmlns:a="http://schemas.openxmlformats.org/drawingml/2006/main">
+              <a:graphicData uri="http://schemas.openxmlformats.org/drawingml/2006/picture">
+                <pic:pic xmlns:pic="http://schemas.openxmlformats.org/drawingml/2006/picture">
+                  <pic:nvPicPr>
+                    <pic:cNvPr id="2135493567" name=""/>
+                    <pic:cNvPicPr/>
+                  </pic:nvPicPr>
+                  <pic:blipFill>
+                    <a:blip r:embed="rId5"/>
+                    <a:stretch>
+                      <a:fillRect/>
+                    </a:stretch>
+                  </pic:blipFill>
+                  <pic:spPr>
+                    <a:xfrm>
+                      <a:off x="0" y="0"/>
+                      <a:ext cx="5943600" cy="1983105"/>
+                    </a:xfrm>
+                    <a:prstGeom prst="rect">
+                      <a:avLst/>
+                    </a:prstGeom>
+                  </pic:spPr>
+                </pic:pic>
+              </a:graphicData>
+            </a:graphic>
+          </wp:inline>
+        </w:drawing>
+      </w:r>
+    </w:p>
+    <w:p>
+      <w:pPr>
+        <w:rPr>
+          <w:lang w:val="en-US"/>
+        </w:rPr>
+      </w:pPr>
+      <w:r>
+        <w:rPr>
+          <w:lang w:val="en-US"/>
+        </w:rPr>
+        <w:lastRenderedPageBreak/>
+        <w:drawing>
+          <wp:inline distT="0" distB="0" distL="0" distR="0" wp14:anchorId="26B6C04C" wp14:editId="25135DB0">
+            <wp:extent cx="5943600" cy="1901825"/>
+            <wp:effectExtent l="0" t="0" r="0" b="3175"/>
+            <wp:docPr id="1387893598" name="Picture 1"/>
+            <wp:cNvGraphicFramePr>
+              <a:graphicFrameLocks xmlns:a="http://schemas.openxmlformats.org/drawingml/2006/main" noChangeAspect="1"/>
+            </wp:cNvGraphicFramePr>
+            <a:graphic xmlns:a="http://schemas.openxmlformats.org/drawingml/2006/main">
+              <a:graphicData uri="http://schemas.openxmlformats.org/drawingml/2006/picture">
+                <pic:pic xmlns:pic="http://schemas.openxmlformats.org/drawingml/2006/picture">
+                  <pic:nvPicPr>
+                    <pic:cNvPr id="1387893598" name=""/>
+                    <pic:cNvPicPr/>
+                  </pic:nvPicPr>
+                  <pic:blipFill>
+                    <a:blip r:embed="rId6"/>
+                    <a:stretch>
+                      <a:fillRect/>
+                    </a:stretch>
+                  </pic:blipFill>
+                  <pic:spPr>
+                    <a:xfrm>
+                      <a:off x="0" y="0"/>
+                      <a:ext cx="5943600" cy="1901825"/>
+                    </a:xfrm>
+                    <a:prstGeom prst="rect">
+                      <a:avLst/>
+                    </a:prstGeom>
+                  </pic:spPr>
+                </pic:pic>
+              </a:graphicData>
+            </a:graphic>
+          </wp:inline>
+        </w:drawing>
       </w:r>
     </w:p>
     <w:p>
@@ -751,6 +879,7 @@
     </w:p>
     <w:p>
       <w:r>
+        <w:lastRenderedPageBreak/>
         <w:tab/>
       </w:r>
       <w:r>
@@ -822,7 +951,6 @@
     </w:p>
     <w:p>
       <w:r>
-        <w:lastRenderedPageBreak/>
         <w:tab/>
       </w:r>
       <w:r>
@@ -1772,6 +1900,7 @@
   <w:style w:type="character" w:default="1" w:styleId="DefaultParagraphFont">
     <w:name w:val="Default Paragraph Font"/>
     <w:uiPriority w:val="1"/>
+    <w:semiHidden/>
     <w:unhideWhenUsed/>
   </w:style>
   <w:style w:type="table" w:default="1" w:styleId="TableNormal">

</xml_diff>

<commit_message>
phan 2: bai 2,3,4
</commit_message>
<xml_diff>
--- a/Tuan05/Baocao_LamNgocThanhPhu_22650381.docx
+++ b/Tuan05/Baocao_LamNgocThanhPhu_22650381.docx
@@ -105,6 +105,9 @@
         <w:tab/>
       </w:r>
       <w:r>
+        <w:rPr>
+          <w:noProof/>
+        </w:rPr>
         <w:drawing>
           <wp:inline distT="0" distB="0" distL="0" distR="0" wp14:anchorId="0A754A16" wp14:editId="0435957A">
             <wp:extent cx="5943600" cy="3653790"/>
@@ -150,6 +153,7 @@
       </w:pPr>
       <w:r>
         <w:rPr>
+          <w:noProof/>
           <w:lang w:val="en-US"/>
         </w:rPr>
         <w:drawing>
@@ -197,6 +201,7 @@
       </w:pPr>
       <w:r>
         <w:rPr>
+          <w:noProof/>
           <w:lang w:val="en-US"/>
         </w:rPr>
         <w:lastRenderedPageBreak/>
@@ -314,7 +319,41 @@
         <w:tab/>
       </w:r>
       <w:r>
-        <w:tab/>
+        <w:drawing>
+          <wp:inline distT="0" distB="0" distL="0" distR="0" wp14:anchorId="1F04A3DC" wp14:editId="247EBC8D">
+            <wp:extent cx="5943600" cy="2253615"/>
+            <wp:effectExtent l="0" t="0" r="0" b="0"/>
+            <wp:docPr id="1310367170" name="Picture 1"/>
+            <wp:cNvGraphicFramePr>
+              <a:graphicFrameLocks xmlns:a="http://schemas.openxmlformats.org/drawingml/2006/main" noChangeAspect="1"/>
+            </wp:cNvGraphicFramePr>
+            <a:graphic xmlns:a="http://schemas.openxmlformats.org/drawingml/2006/main">
+              <a:graphicData uri="http://schemas.openxmlformats.org/drawingml/2006/picture">
+                <pic:pic xmlns:pic="http://schemas.openxmlformats.org/drawingml/2006/picture">
+                  <pic:nvPicPr>
+                    <pic:cNvPr id="1310367170" name=""/>
+                    <pic:cNvPicPr/>
+                  </pic:nvPicPr>
+                  <pic:blipFill>
+                    <a:blip r:embed="rId7"/>
+                    <a:stretch>
+                      <a:fillRect/>
+                    </a:stretch>
+                  </pic:blipFill>
+                  <pic:spPr>
+                    <a:xfrm>
+                      <a:off x="0" y="0"/>
+                      <a:ext cx="5943600" cy="2253615"/>
+                    </a:xfrm>
+                    <a:prstGeom prst="rect">
+                      <a:avLst/>
+                    </a:prstGeom>
+                  </pic:spPr>
+                </pic:pic>
+              </a:graphicData>
+            </a:graphic>
+          </wp:inline>
+        </w:drawing>
       </w:r>
       <w:r>
         <w:tab/>
@@ -400,10 +439,45 @@
     </w:p>
     <w:p>
       <w:r>
-        <w:tab/>
-      </w:r>
-      <w:r>
-        <w:tab/>
+        <w:lastRenderedPageBreak/>
+        <w:tab/>
+      </w:r>
+      <w:r>
+        <w:drawing>
+          <wp:inline distT="0" distB="0" distL="0" distR="0" wp14:anchorId="00D6B129" wp14:editId="4C10538F">
+            <wp:extent cx="5943600" cy="4948555"/>
+            <wp:effectExtent l="0" t="0" r="0" b="4445"/>
+            <wp:docPr id="1040684543" name="Picture 1"/>
+            <wp:cNvGraphicFramePr>
+              <a:graphicFrameLocks xmlns:a="http://schemas.openxmlformats.org/drawingml/2006/main" noChangeAspect="1"/>
+            </wp:cNvGraphicFramePr>
+            <a:graphic xmlns:a="http://schemas.openxmlformats.org/drawingml/2006/main">
+              <a:graphicData uri="http://schemas.openxmlformats.org/drawingml/2006/picture">
+                <pic:pic xmlns:pic="http://schemas.openxmlformats.org/drawingml/2006/picture">
+                  <pic:nvPicPr>
+                    <pic:cNvPr id="1040684543" name=""/>
+                    <pic:cNvPicPr/>
+                  </pic:nvPicPr>
+                  <pic:blipFill>
+                    <a:blip r:embed="rId8"/>
+                    <a:stretch>
+                      <a:fillRect/>
+                    </a:stretch>
+                  </pic:blipFill>
+                  <pic:spPr>
+                    <a:xfrm>
+                      <a:off x="0" y="0"/>
+                      <a:ext cx="5943600" cy="4948555"/>
+                    </a:xfrm>
+                    <a:prstGeom prst="rect">
+                      <a:avLst/>
+                    </a:prstGeom>
+                  </pic:spPr>
+                </pic:pic>
+              </a:graphicData>
+            </a:graphic>
+          </wp:inline>
+        </w:drawing>
       </w:r>
       <w:r>
         <w:tab/>
@@ -471,10 +545,82 @@
     </w:p>
     <w:p>
       <w:r>
-        <w:tab/>
-      </w:r>
-      <w:r>
-        <w:tab/>
+        <w:lastRenderedPageBreak/>
+        <w:tab/>
+      </w:r>
+      <w:r>
+        <w:drawing>
+          <wp:inline distT="0" distB="0" distL="0" distR="0" wp14:anchorId="7D9A78F3" wp14:editId="01FC7B3E">
+            <wp:extent cx="5943600" cy="3027680"/>
+            <wp:effectExtent l="0" t="0" r="0" b="1270"/>
+            <wp:docPr id="976509603" name="Picture 1"/>
+            <wp:cNvGraphicFramePr>
+              <a:graphicFrameLocks xmlns:a="http://schemas.openxmlformats.org/drawingml/2006/main" noChangeAspect="1"/>
+            </wp:cNvGraphicFramePr>
+            <a:graphic xmlns:a="http://schemas.openxmlformats.org/drawingml/2006/main">
+              <a:graphicData uri="http://schemas.openxmlformats.org/drawingml/2006/picture">
+                <pic:pic xmlns:pic="http://schemas.openxmlformats.org/drawingml/2006/picture">
+                  <pic:nvPicPr>
+                    <pic:cNvPr id="976509603" name=""/>
+                    <pic:cNvPicPr/>
+                  </pic:nvPicPr>
+                  <pic:blipFill>
+                    <a:blip r:embed="rId9"/>
+                    <a:stretch>
+                      <a:fillRect/>
+                    </a:stretch>
+                  </pic:blipFill>
+                  <pic:spPr>
+                    <a:xfrm>
+                      <a:off x="0" y="0"/>
+                      <a:ext cx="5943600" cy="3027680"/>
+                    </a:xfrm>
+                    <a:prstGeom prst="rect">
+                      <a:avLst/>
+                    </a:prstGeom>
+                  </pic:spPr>
+                </pic:pic>
+              </a:graphicData>
+            </a:graphic>
+          </wp:inline>
+        </w:drawing>
+      </w:r>
+      <w:r>
+        <w:drawing>
+          <wp:inline distT="0" distB="0" distL="0" distR="0" wp14:anchorId="0F91CCE5" wp14:editId="60F44171">
+            <wp:extent cx="5943600" cy="924560"/>
+            <wp:effectExtent l="0" t="0" r="0" b="8890"/>
+            <wp:docPr id="1766400588" name="Picture 1"/>
+            <wp:cNvGraphicFramePr>
+              <a:graphicFrameLocks xmlns:a="http://schemas.openxmlformats.org/drawingml/2006/main" noChangeAspect="1"/>
+            </wp:cNvGraphicFramePr>
+            <a:graphic xmlns:a="http://schemas.openxmlformats.org/drawingml/2006/main">
+              <a:graphicData uri="http://schemas.openxmlformats.org/drawingml/2006/picture">
+                <pic:pic xmlns:pic="http://schemas.openxmlformats.org/drawingml/2006/picture">
+                  <pic:nvPicPr>
+                    <pic:cNvPr id="1766400588" name=""/>
+                    <pic:cNvPicPr/>
+                  </pic:nvPicPr>
+                  <pic:blipFill>
+                    <a:blip r:embed="rId10"/>
+                    <a:stretch>
+                      <a:fillRect/>
+                    </a:stretch>
+                  </pic:blipFill>
+                  <pic:spPr>
+                    <a:xfrm>
+                      <a:off x="0" y="0"/>
+                      <a:ext cx="5943600" cy="924560"/>
+                    </a:xfrm>
+                    <a:prstGeom prst="rect">
+                      <a:avLst/>
+                    </a:prstGeom>
+                  </pic:spPr>
+                </pic:pic>
+              </a:graphicData>
+            </a:graphic>
+          </wp:inline>
+        </w:drawing>
       </w:r>
       <w:r>
         <w:tab/>

</xml_diff>

<commit_message>
phan 2 bai 6
</commit_message>
<xml_diff>
--- a/Tuan05/Baocao_LamNgocThanhPhu_22650381.docx
+++ b/Tuan05/Baocao_LamNgocThanhPhu_22650381.docx
@@ -691,7 +691,41 @@
         <w:tab/>
       </w:r>
       <w:r>
-        <w:tab/>
+        <w:drawing>
+          <wp:inline distT="0" distB="0" distL="0" distR="0" wp14:anchorId="71751C35" wp14:editId="10144B46">
+            <wp:extent cx="5943600" cy="2679065"/>
+            <wp:effectExtent l="0" t="0" r="0" b="6985"/>
+            <wp:docPr id="683938993" name="Picture 1"/>
+            <wp:cNvGraphicFramePr>
+              <a:graphicFrameLocks xmlns:a="http://schemas.openxmlformats.org/drawingml/2006/main" noChangeAspect="1"/>
+            </wp:cNvGraphicFramePr>
+            <a:graphic xmlns:a="http://schemas.openxmlformats.org/drawingml/2006/main">
+              <a:graphicData uri="http://schemas.openxmlformats.org/drawingml/2006/picture">
+                <pic:pic xmlns:pic="http://schemas.openxmlformats.org/drawingml/2006/picture">
+                  <pic:nvPicPr>
+                    <pic:cNvPr id="683938993" name=""/>
+                    <pic:cNvPicPr/>
+                  </pic:nvPicPr>
+                  <pic:blipFill>
+                    <a:blip r:embed="rId11"/>
+                    <a:stretch>
+                      <a:fillRect/>
+                    </a:stretch>
+                  </pic:blipFill>
+                  <pic:spPr>
+                    <a:xfrm>
+                      <a:off x="0" y="0"/>
+                      <a:ext cx="5943600" cy="2679065"/>
+                    </a:xfrm>
+                    <a:prstGeom prst="rect">
+                      <a:avLst/>
+                    </a:prstGeom>
+                  </pic:spPr>
+                </pic:pic>
+              </a:graphicData>
+            </a:graphic>
+          </wp:inline>
+        </w:drawing>
       </w:r>
       <w:r>
         <w:tab/>
@@ -741,6 +775,7 @@
     </w:p>
     <w:p>
       <w:r>
+        <w:lastRenderedPageBreak/>
         <w:tab/>
       </w:r>
       <w:r>
@@ -762,6 +797,80 @@
         <w:tab/>
       </w:r>
       <w:r>
+        <w:drawing>
+          <wp:inline distT="0" distB="0" distL="0" distR="0" wp14:anchorId="5CD11CD7" wp14:editId="476FDACD">
+            <wp:extent cx="5943600" cy="3551555"/>
+            <wp:effectExtent l="0" t="0" r="0" b="0"/>
+            <wp:docPr id="416070716" name="Picture 1"/>
+            <wp:cNvGraphicFramePr>
+              <a:graphicFrameLocks xmlns:a="http://schemas.openxmlformats.org/drawingml/2006/main" noChangeAspect="1"/>
+            </wp:cNvGraphicFramePr>
+            <a:graphic xmlns:a="http://schemas.openxmlformats.org/drawingml/2006/main">
+              <a:graphicData uri="http://schemas.openxmlformats.org/drawingml/2006/picture">
+                <pic:pic xmlns:pic="http://schemas.openxmlformats.org/drawingml/2006/picture">
+                  <pic:nvPicPr>
+                    <pic:cNvPr id="416070716" name=""/>
+                    <pic:cNvPicPr/>
+                  </pic:nvPicPr>
+                  <pic:blipFill>
+                    <a:blip r:embed="rId12"/>
+                    <a:stretch>
+                      <a:fillRect/>
+                    </a:stretch>
+                  </pic:blipFill>
+                  <pic:spPr>
+                    <a:xfrm>
+                      <a:off x="0" y="0"/>
+                      <a:ext cx="5943600" cy="3551555"/>
+                    </a:xfrm>
+                    <a:prstGeom prst="rect">
+                      <a:avLst/>
+                    </a:prstGeom>
+                  </pic:spPr>
+                </pic:pic>
+              </a:graphicData>
+            </a:graphic>
+          </wp:inline>
+        </w:drawing>
+      </w:r>
+      <w:r>
+        <w:drawing>
+          <wp:inline distT="0" distB="0" distL="0" distR="0" wp14:anchorId="61AC11EB" wp14:editId="12B003E4">
+            <wp:extent cx="5943600" cy="3063240"/>
+            <wp:effectExtent l="0" t="0" r="0" b="3810"/>
+            <wp:docPr id="1828875351" name="Picture 1"/>
+            <wp:cNvGraphicFramePr>
+              <a:graphicFrameLocks xmlns:a="http://schemas.openxmlformats.org/drawingml/2006/main" noChangeAspect="1"/>
+            </wp:cNvGraphicFramePr>
+            <a:graphic xmlns:a="http://schemas.openxmlformats.org/drawingml/2006/main">
+              <a:graphicData uri="http://schemas.openxmlformats.org/drawingml/2006/picture">
+                <pic:pic xmlns:pic="http://schemas.openxmlformats.org/drawingml/2006/picture">
+                  <pic:nvPicPr>
+                    <pic:cNvPr id="1828875351" name=""/>
+                    <pic:cNvPicPr/>
+                  </pic:nvPicPr>
+                  <pic:blipFill>
+                    <a:blip r:embed="rId13"/>
+                    <a:stretch>
+                      <a:fillRect/>
+                    </a:stretch>
+                  </pic:blipFill>
+                  <pic:spPr>
+                    <a:xfrm>
+                      <a:off x="0" y="0"/>
+                      <a:ext cx="5943600" cy="3063240"/>
+                    </a:xfrm>
+                    <a:prstGeom prst="rect">
+                      <a:avLst/>
+                    </a:prstGeom>
+                  </pic:spPr>
+                </pic:pic>
+              </a:graphicData>
+            </a:graphic>
+          </wp:inline>
+        </w:drawing>
+      </w:r>
+      <w:r>
         <w:tab/>
       </w:r>
       <w:r>
@@ -883,6 +992,7 @@
     </w:p>
     <w:p>
       <w:r>
+        <w:lastRenderedPageBreak/>
         <w:tab/>
       </w:r>
       <w:r>
@@ -1025,7 +1135,6 @@
     </w:p>
     <w:p>
       <w:r>
-        <w:lastRenderedPageBreak/>
         <w:tab/>
       </w:r>
       <w:r>

</xml_diff>

<commit_message>
phan 2 bai 7
</commit_message>
<xml_diff>
--- a/Tuan05/Baocao_LamNgocThanhPhu_22650381.docx
+++ b/Tuan05/Baocao_LamNgocThanhPhu_22650381.docx
@@ -920,6 +920,11 @@
       </w:r>
     </w:p>
     <w:p>
+      <w:pPr>
+        <w:rPr>
+          <w:lang w:val="en-US"/>
+        </w:rPr>
+      </w:pPr>
       <w:r>
         <w:tab/>
       </w:r>
@@ -927,25 +932,96 @@
         <w:tab/>
         <w:t>Chạy MongoDB và Mongo Express để quản lý.</w:t>
       </w:r>
-      <w:r>
-        <w:tab/>
-      </w:r>
-      <w:r>
-        <w:tab/>
-      </w:r>
-      <w:r>
-        <w:tab/>
-      </w:r>
-    </w:p>
-    <w:p>
-      <w:r>
-        <w:tab/>
-      </w:r>
-      <w:r>
-        <w:tab/>
-      </w:r>
-      <w:r>
-        <w:tab/>
+    </w:p>
+    <w:p>
+      <w:r>
+        <w:lastRenderedPageBreak/>
+        <w:drawing>
+          <wp:inline distT="0" distB="0" distL="0" distR="0" wp14:anchorId="76CAFFA9" wp14:editId="68BAC2ED">
+            <wp:extent cx="5943600" cy="2997200"/>
+            <wp:effectExtent l="0" t="0" r="0" b="0"/>
+            <wp:docPr id="1540517195" name="Picture 1"/>
+            <wp:cNvGraphicFramePr>
+              <a:graphicFrameLocks xmlns:a="http://schemas.openxmlformats.org/drawingml/2006/main" noChangeAspect="1"/>
+            </wp:cNvGraphicFramePr>
+            <a:graphic xmlns:a="http://schemas.openxmlformats.org/drawingml/2006/main">
+              <a:graphicData uri="http://schemas.openxmlformats.org/drawingml/2006/picture">
+                <pic:pic xmlns:pic="http://schemas.openxmlformats.org/drawingml/2006/picture">
+                  <pic:nvPicPr>
+                    <pic:cNvPr id="1540517195" name=""/>
+                    <pic:cNvPicPr/>
+                  </pic:nvPicPr>
+                  <pic:blipFill>
+                    <a:blip r:embed="rId14"/>
+                    <a:stretch>
+                      <a:fillRect/>
+                    </a:stretch>
+                  </pic:blipFill>
+                  <pic:spPr>
+                    <a:xfrm>
+                      <a:off x="0" y="0"/>
+                      <a:ext cx="5943600" cy="2997200"/>
+                    </a:xfrm>
+                    <a:prstGeom prst="rect">
+                      <a:avLst/>
+                    </a:prstGeom>
+                  </pic:spPr>
+                </pic:pic>
+              </a:graphicData>
+            </a:graphic>
+          </wp:inline>
+        </w:drawing>
+      </w:r>
+      <w:r>
+        <w:tab/>
+      </w:r>
+      <w:r>
+        <w:tab/>
+      </w:r>
+      <w:r>
+        <w:tab/>
+      </w:r>
+    </w:p>
+    <w:p>
+      <w:r>
+        <w:tab/>
+      </w:r>
+      <w:r>
+        <w:drawing>
+          <wp:inline distT="0" distB="0" distL="0" distR="0" wp14:anchorId="0812CF4F" wp14:editId="54A7C09F">
+            <wp:extent cx="3858163" cy="2962688"/>
+            <wp:effectExtent l="0" t="0" r="9525" b="9525"/>
+            <wp:docPr id="1841201049" name="Picture 1"/>
+            <wp:cNvGraphicFramePr>
+              <a:graphicFrameLocks xmlns:a="http://schemas.openxmlformats.org/drawingml/2006/main" noChangeAspect="1"/>
+            </wp:cNvGraphicFramePr>
+            <a:graphic xmlns:a="http://schemas.openxmlformats.org/drawingml/2006/main">
+              <a:graphicData uri="http://schemas.openxmlformats.org/drawingml/2006/picture">
+                <pic:pic xmlns:pic="http://schemas.openxmlformats.org/drawingml/2006/picture">
+                  <pic:nvPicPr>
+                    <pic:cNvPr id="1841201049" name=""/>
+                    <pic:cNvPicPr/>
+                  </pic:nvPicPr>
+                  <pic:blipFill>
+                    <a:blip r:embed="rId15"/>
+                    <a:stretch>
+                      <a:fillRect/>
+                    </a:stretch>
+                  </pic:blipFill>
+                  <pic:spPr>
+                    <a:xfrm>
+                      <a:off x="0" y="0"/>
+                      <a:ext cx="3858163" cy="2962688"/>
+                    </a:xfrm>
+                    <a:prstGeom prst="rect">
+                      <a:avLst/>
+                    </a:prstGeom>
+                  </pic:spPr>
+                </pic:pic>
+              </a:graphicData>
+            </a:graphic>
+          </wp:inline>
+        </w:drawing>
       </w:r>
       <w:r>
         <w:tab/>
@@ -992,167 +1068,167 @@
     </w:p>
     <w:p>
       <w:r>
+        <w:tab/>
+      </w:r>
+      <w:r>
+        <w:tab/>
+        <w:t>Chạy Node.js kết nối với MySQL.</w:t>
+      </w:r>
+      <w:r>
+        <w:tab/>
+      </w:r>
+      <w:r>
+        <w:tab/>
+      </w:r>
+      <w:r>
+        <w:tab/>
+      </w:r>
+    </w:p>
+    <w:p>
+      <w:r>
+        <w:tab/>
+      </w:r>
+      <w:r>
+        <w:tab/>
+      </w:r>
+      <w:r>
+        <w:tab/>
+      </w:r>
+      <w:r>
+        <w:tab/>
+      </w:r>
+      <w:r>
+        <w:tab/>
+      </w:r>
+    </w:p>
+    <w:p>
+      <w:r>
+        <w:tab/>
+        <w:t>Bài 9: Chạy ứng dụng Python Flask với Docker Compose</w:t>
+      </w:r>
+      <w:r>
+        <w:tab/>
+      </w:r>
+      <w:r>
+        <w:tab/>
+      </w:r>
+      <w:r>
+        <w:tab/>
+      </w:r>
+      <w:r>
+        <w:tab/>
+      </w:r>
+    </w:p>
+    <w:p>
+      <w:r>
+        <w:tab/>
+      </w:r>
+      <w:r>
+        <w:tab/>
+        <w:t>Yêu cầu:</w:t>
+      </w:r>
+      <w:r>
+        <w:tab/>
+      </w:r>
+      <w:r>
+        <w:tab/>
+      </w:r>
+      <w:r>
+        <w:tab/>
+      </w:r>
+    </w:p>
+    <w:p>
+      <w:r>
+        <w:tab/>
+      </w:r>
+      <w:r>
+        <w:tab/>
+        <w:t>Chạy ứng dụng Flask đơn giản với Docker Compose.</w:t>
+      </w:r>
+      <w:r>
+        <w:tab/>
+      </w:r>
+      <w:r>
+        <w:tab/>
+      </w:r>
+      <w:r>
+        <w:tab/>
+      </w:r>
+    </w:p>
+    <w:p>
+      <w:r>
+        <w:tab/>
+      </w:r>
+      <w:r>
+        <w:tab/>
+      </w:r>
+      <w:r>
+        <w:tab/>
+      </w:r>
+      <w:r>
+        <w:tab/>
+      </w:r>
+      <w:r>
+        <w:tab/>
+      </w:r>
+    </w:p>
+    <w:p>
+      <w:r>
+        <w:tab/>
+        <w:t>Bài 10: Lưu trữ dữ liệu với Docker Volumes</w:t>
+      </w:r>
+      <w:r>
+        <w:tab/>
+      </w:r>
+      <w:r>
+        <w:tab/>
+      </w:r>
+      <w:r>
+        <w:tab/>
+      </w:r>
+      <w:r>
+        <w:tab/>
+      </w:r>
+    </w:p>
+    <w:p>
+      <w:r>
+        <w:tab/>
+      </w:r>
+      <w:r>
+        <w:tab/>
+        <w:t>Yêu cầu:</w:t>
+      </w:r>
+      <w:r>
+        <w:tab/>
+      </w:r>
+      <w:r>
+        <w:tab/>
+      </w:r>
+      <w:r>
+        <w:tab/>
+      </w:r>
+    </w:p>
+    <w:p>
+      <w:r>
+        <w:tab/>
+      </w:r>
+      <w:r>
+        <w:tab/>
+        <w:t>Chạy MySQL và gắn volume để dữ liệu không bị mất.</w:t>
+      </w:r>
+      <w:r>
+        <w:tab/>
+      </w:r>
+      <w:r>
+        <w:tab/>
+      </w:r>
+      <w:r>
+        <w:tab/>
+      </w:r>
+    </w:p>
+    <w:p>
+      <w:r>
         <w:lastRenderedPageBreak/>
-        <w:tab/>
-      </w:r>
-      <w:r>
-        <w:tab/>
-        <w:t>Chạy Node.js kết nối với MySQL.</w:t>
-      </w:r>
-      <w:r>
-        <w:tab/>
-      </w:r>
-      <w:r>
-        <w:tab/>
-      </w:r>
-      <w:r>
-        <w:tab/>
-      </w:r>
-    </w:p>
-    <w:p>
-      <w:r>
-        <w:tab/>
-      </w:r>
-      <w:r>
-        <w:tab/>
-      </w:r>
-      <w:r>
-        <w:tab/>
-      </w:r>
-      <w:r>
-        <w:tab/>
-      </w:r>
-      <w:r>
-        <w:tab/>
-      </w:r>
-    </w:p>
-    <w:p>
-      <w:r>
-        <w:tab/>
-        <w:t>Bài 9: Chạy ứng dụng Python Flask với Docker Compose</w:t>
-      </w:r>
-      <w:r>
-        <w:tab/>
-      </w:r>
-      <w:r>
-        <w:tab/>
-      </w:r>
-      <w:r>
-        <w:tab/>
-      </w:r>
-      <w:r>
-        <w:tab/>
-      </w:r>
-    </w:p>
-    <w:p>
-      <w:r>
-        <w:tab/>
-      </w:r>
-      <w:r>
-        <w:tab/>
-        <w:t>Yêu cầu:</w:t>
-      </w:r>
-      <w:r>
-        <w:tab/>
-      </w:r>
-      <w:r>
-        <w:tab/>
-      </w:r>
-      <w:r>
-        <w:tab/>
-      </w:r>
-    </w:p>
-    <w:p>
-      <w:r>
-        <w:tab/>
-      </w:r>
-      <w:r>
-        <w:tab/>
-        <w:t>Chạy ứng dụng Flask đơn giản với Docker Compose.</w:t>
-      </w:r>
-      <w:r>
-        <w:tab/>
-      </w:r>
-      <w:r>
-        <w:tab/>
-      </w:r>
-      <w:r>
-        <w:tab/>
-      </w:r>
-    </w:p>
-    <w:p>
-      <w:r>
-        <w:tab/>
-      </w:r>
-      <w:r>
-        <w:tab/>
-      </w:r>
-      <w:r>
-        <w:tab/>
-      </w:r>
-      <w:r>
-        <w:tab/>
-      </w:r>
-      <w:r>
-        <w:tab/>
-      </w:r>
-    </w:p>
-    <w:p>
-      <w:r>
-        <w:tab/>
-        <w:t>Bài 10: Lưu trữ dữ liệu với Docker Volumes</w:t>
-      </w:r>
-      <w:r>
-        <w:tab/>
-      </w:r>
-      <w:r>
-        <w:tab/>
-      </w:r>
-      <w:r>
-        <w:tab/>
-      </w:r>
-      <w:r>
-        <w:tab/>
-      </w:r>
-    </w:p>
-    <w:p>
-      <w:r>
-        <w:tab/>
-      </w:r>
-      <w:r>
-        <w:tab/>
-        <w:t>Yêu cầu:</w:t>
-      </w:r>
-      <w:r>
-        <w:tab/>
-      </w:r>
-      <w:r>
-        <w:tab/>
-      </w:r>
-      <w:r>
-        <w:tab/>
-      </w:r>
-    </w:p>
-    <w:p>
-      <w:r>
-        <w:tab/>
-      </w:r>
-      <w:r>
-        <w:tab/>
-        <w:t>Chạy MySQL và gắn volume để dữ liệu không bị mất.</w:t>
-      </w:r>
-      <w:r>
-        <w:tab/>
-      </w:r>
-      <w:r>
-        <w:tab/>
-      </w:r>
-      <w:r>
-        <w:tab/>
-      </w:r>
-    </w:p>
-    <w:p>
-      <w:r>
         <w:tab/>
       </w:r>
       <w:r>

</xml_diff>

<commit_message>
phan 2 bai 8
</commit_message>
<xml_diff>
--- a/Tuan05/Baocao_LamNgocThanhPhu_22650381.docx
+++ b/Tuan05/Baocao_LamNgocThanhPhu_22650381.docx
@@ -1085,20 +1085,51 @@
       </w:r>
     </w:p>
     <w:p>
-      <w:r>
-        <w:tab/>
-      </w:r>
-      <w:r>
-        <w:tab/>
-      </w:r>
-      <w:r>
-        <w:tab/>
-      </w:r>
-      <w:r>
-        <w:tab/>
-      </w:r>
-      <w:r>
-        <w:tab/>
+      <w:pPr>
+        <w:rPr>
+          <w:lang w:val="en-US"/>
+        </w:rPr>
+      </w:pPr>
+      <w:r>
+        <w:lastRenderedPageBreak/>
+        <w:tab/>
+      </w:r>
+      <w:r>
+        <w:drawing>
+          <wp:inline distT="0" distB="0" distL="0" distR="0" wp14:anchorId="1E198DDA" wp14:editId="7F4FE547">
+            <wp:extent cx="5943600" cy="3382645"/>
+            <wp:effectExtent l="0" t="0" r="0" b="8255"/>
+            <wp:docPr id="1553562861" name="Picture 1"/>
+            <wp:cNvGraphicFramePr>
+              <a:graphicFrameLocks xmlns:a="http://schemas.openxmlformats.org/drawingml/2006/main" noChangeAspect="1"/>
+            </wp:cNvGraphicFramePr>
+            <a:graphic xmlns:a="http://schemas.openxmlformats.org/drawingml/2006/main">
+              <a:graphicData uri="http://schemas.openxmlformats.org/drawingml/2006/picture">
+                <pic:pic xmlns:pic="http://schemas.openxmlformats.org/drawingml/2006/picture">
+                  <pic:nvPicPr>
+                    <pic:cNvPr id="1553562861" name=""/>
+                    <pic:cNvPicPr/>
+                  </pic:nvPicPr>
+                  <pic:blipFill>
+                    <a:blip r:embed="rId16"/>
+                    <a:stretch>
+                      <a:fillRect/>
+                    </a:stretch>
+                  </pic:blipFill>
+                  <pic:spPr>
+                    <a:xfrm>
+                      <a:off x="0" y="0"/>
+                      <a:ext cx="5943600" cy="3382645"/>
+                    </a:xfrm>
+                    <a:prstGeom prst="rect">
+                      <a:avLst/>
+                    </a:prstGeom>
+                  </pic:spPr>
+                </pic:pic>
+              </a:graphicData>
+            </a:graphic>
+          </wp:inline>
+        </w:drawing>
       </w:r>
     </w:p>
     <w:p>
@@ -1228,291 +1259,291 @@
     </w:p>
     <w:p>
       <w:r>
+        <w:tab/>
+      </w:r>
+      <w:r>
+        <w:tab/>
+      </w:r>
+      <w:r>
+        <w:tab/>
+      </w:r>
+      <w:r>
+        <w:tab/>
+      </w:r>
+      <w:r>
+        <w:tab/>
+      </w:r>
+    </w:p>
+    <w:p>
+      <w:r>
+        <w:tab/>
+        <w:t>Bài 11: Chạy dịch vụ Postgres với Adminer</w:t>
+      </w:r>
+      <w:r>
+        <w:tab/>
+      </w:r>
+      <w:r>
+        <w:tab/>
+      </w:r>
+      <w:r>
+        <w:tab/>
+      </w:r>
+      <w:r>
+        <w:tab/>
+      </w:r>
+    </w:p>
+    <w:p>
+      <w:r>
+        <w:tab/>
+      </w:r>
+      <w:r>
+        <w:tab/>
+        <w:t>Yêu cầu:</w:t>
+      </w:r>
+      <w:r>
+        <w:tab/>
+      </w:r>
+      <w:r>
+        <w:tab/>
+      </w:r>
+      <w:r>
+        <w:tab/>
+      </w:r>
+    </w:p>
+    <w:p>
+      <w:r>
+        <w:tab/>
+      </w:r>
+      <w:r>
+        <w:tab/>
+        <w:t>Chạy PostgreSQL và Adminer (công cụ quản lý database) bằng Docker Compose.</w:t>
+      </w:r>
+      <w:r>
+        <w:tab/>
+      </w:r>
+      <w:r>
+        <w:tab/>
+      </w:r>
+      <w:r>
+        <w:tab/>
+      </w:r>
+    </w:p>
+    <w:p>
+      <w:r>
+        <w:tab/>
+      </w:r>
+      <w:r>
+        <w:tab/>
+        <w:t>PostgreSQL phải có database tên mydb, user là user, password là password.</w:t>
+      </w:r>
+      <w:r>
+        <w:tab/>
+      </w:r>
+      <w:r>
+        <w:tab/>
+      </w:r>
+      <w:r>
+        <w:tab/>
+      </w:r>
+    </w:p>
+    <w:p>
+      <w:r>
+        <w:tab/>
+      </w:r>
+      <w:r>
+        <w:tab/>
+        <w:t>Adminer chạy trên cổng 8083</w:t>
+      </w:r>
+      <w:r>
+        <w:tab/>
+      </w:r>
+      <w:r>
+        <w:tab/>
+      </w:r>
+      <w:r>
+        <w:tab/>
+      </w:r>
+    </w:p>
+    <w:p>
+      <w:r>
+        <w:tab/>
+      </w:r>
+      <w:r>
+        <w:tab/>
+      </w:r>
+      <w:r>
+        <w:tab/>
+      </w:r>
+      <w:r>
+        <w:tab/>
+      </w:r>
+      <w:r>
+        <w:tab/>
+      </w:r>
+    </w:p>
+    <w:p>
+      <w:r>
+        <w:tab/>
+        <w:t>Bài 12: Giám sát container với Prometheus và Grafana</w:t>
+      </w:r>
+      <w:r>
+        <w:tab/>
+      </w:r>
+      <w:r>
+        <w:tab/>
+      </w:r>
+      <w:r>
+        <w:tab/>
+      </w:r>
+      <w:r>
+        <w:tab/>
+      </w:r>
+    </w:p>
+    <w:p>
+      <w:r>
+        <w:tab/>
+      </w:r>
+      <w:r>
+        <w:tab/>
+        <w:t>Yêu cầu:</w:t>
+      </w:r>
+      <w:r>
+        <w:tab/>
+      </w:r>
+      <w:r>
+        <w:tab/>
+      </w:r>
+      <w:r>
+        <w:tab/>
+      </w:r>
+    </w:p>
+    <w:p>
+      <w:r>
+        <w:tab/>
+      </w:r>
+      <w:r>
+        <w:tab/>
+        <w:t>Chạy Prometheus, Grafana và Node Exporter bằng Docker Compose để giám sát hệ thống.</w:t>
+      </w:r>
+      <w:r>
+        <w:tab/>
+      </w:r>
+      <w:r>
+        <w:tab/>
+      </w:r>
+      <w:r>
+        <w:tab/>
+      </w:r>
+    </w:p>
+    <w:p>
+      <w:r>
+        <w:tab/>
+      </w:r>
+      <w:r>
+        <w:tab/>
+      </w:r>
+      <w:r>
+        <w:tab/>
+      </w:r>
+      <w:r>
+        <w:tab/>
+      </w:r>
+      <w:r>
+        <w:tab/>
+      </w:r>
+    </w:p>
+    <w:p>
+      <w:r>
+        <w:tab/>
+        <w:t>Bài 13: Chạy ứng dụng React với Nginx</w:t>
+      </w:r>
+      <w:r>
+        <w:tab/>
+      </w:r>
+      <w:r>
+        <w:tab/>
+      </w:r>
+      <w:r>
+        <w:tab/>
+      </w:r>
+      <w:r>
+        <w:tab/>
+      </w:r>
+    </w:p>
+    <w:p>
+      <w:r>
+        <w:tab/>
+      </w:r>
+      <w:r>
+        <w:tab/>
+        <w:t>Yêu cầu:</w:t>
+      </w:r>
+      <w:r>
+        <w:tab/>
+      </w:r>
+      <w:r>
+        <w:tab/>
+      </w:r>
+      <w:r>
+        <w:tab/>
+      </w:r>
+    </w:p>
+    <w:p>
+      <w:r>
+        <w:tab/>
+      </w:r>
+      <w:r>
+        <w:tab/>
+        <w:t>Chạy một ứng dụng React và serve nó bằng Nginx.</w:t>
+      </w:r>
+      <w:r>
+        <w:tab/>
+      </w:r>
+      <w:r>
+        <w:tab/>
+      </w:r>
+      <w:r>
+        <w:tab/>
+      </w:r>
+    </w:p>
+    <w:p>
+      <w:r>
+        <w:tab/>
+      </w:r>
+      <w:r>
+        <w:tab/>
+      </w:r>
+      <w:r>
+        <w:tab/>
+      </w:r>
+      <w:r>
+        <w:tab/>
+      </w:r>
+      <w:r>
+        <w:tab/>
+      </w:r>
+    </w:p>
+    <w:p>
+      <w:r>
+        <w:tab/>
+        <w:t>Bài 14: Cấu hình mạng riêng giữa các container</w:t>
+      </w:r>
+      <w:r>
+        <w:tab/>
+      </w:r>
+      <w:r>
+        <w:tab/>
+      </w:r>
+      <w:r>
+        <w:tab/>
+      </w:r>
+      <w:r>
+        <w:tab/>
+      </w:r>
+    </w:p>
+    <w:p>
+      <w:r>
         <w:lastRenderedPageBreak/>
-        <w:tab/>
-      </w:r>
-      <w:r>
-        <w:tab/>
-      </w:r>
-      <w:r>
-        <w:tab/>
-      </w:r>
-      <w:r>
-        <w:tab/>
-      </w:r>
-      <w:r>
-        <w:tab/>
-      </w:r>
-    </w:p>
-    <w:p>
-      <w:r>
-        <w:tab/>
-        <w:t>Bài 11: Chạy dịch vụ Postgres với Adminer</w:t>
-      </w:r>
-      <w:r>
-        <w:tab/>
-      </w:r>
-      <w:r>
-        <w:tab/>
-      </w:r>
-      <w:r>
-        <w:tab/>
-      </w:r>
-      <w:r>
-        <w:tab/>
-      </w:r>
-    </w:p>
-    <w:p>
-      <w:r>
-        <w:tab/>
-      </w:r>
-      <w:r>
-        <w:tab/>
-        <w:t>Yêu cầu:</w:t>
-      </w:r>
-      <w:r>
-        <w:tab/>
-      </w:r>
-      <w:r>
-        <w:tab/>
-      </w:r>
-      <w:r>
-        <w:tab/>
-      </w:r>
-    </w:p>
-    <w:p>
-      <w:r>
-        <w:tab/>
-      </w:r>
-      <w:r>
-        <w:tab/>
-        <w:t>Chạy PostgreSQL và Adminer (công cụ quản lý database) bằng Docker Compose.</w:t>
-      </w:r>
-      <w:r>
-        <w:tab/>
-      </w:r>
-      <w:r>
-        <w:tab/>
-      </w:r>
-      <w:r>
-        <w:tab/>
-      </w:r>
-    </w:p>
-    <w:p>
-      <w:r>
-        <w:tab/>
-      </w:r>
-      <w:r>
-        <w:tab/>
-        <w:t>PostgreSQL phải có database tên mydb, user là user, password là password.</w:t>
-      </w:r>
-      <w:r>
-        <w:tab/>
-      </w:r>
-      <w:r>
-        <w:tab/>
-      </w:r>
-      <w:r>
-        <w:tab/>
-      </w:r>
-    </w:p>
-    <w:p>
-      <w:r>
-        <w:tab/>
-      </w:r>
-      <w:r>
-        <w:tab/>
-        <w:t>Adminer chạy trên cổng 8083</w:t>
-      </w:r>
-      <w:r>
-        <w:tab/>
-      </w:r>
-      <w:r>
-        <w:tab/>
-      </w:r>
-      <w:r>
-        <w:tab/>
-      </w:r>
-    </w:p>
-    <w:p>
-      <w:r>
-        <w:tab/>
-      </w:r>
-      <w:r>
-        <w:tab/>
-      </w:r>
-      <w:r>
-        <w:tab/>
-      </w:r>
-      <w:r>
-        <w:tab/>
-      </w:r>
-      <w:r>
-        <w:tab/>
-      </w:r>
-    </w:p>
-    <w:p>
-      <w:r>
-        <w:tab/>
-        <w:t>Bài 12: Giám sát container với Prometheus và Grafana</w:t>
-      </w:r>
-      <w:r>
-        <w:tab/>
-      </w:r>
-      <w:r>
-        <w:tab/>
-      </w:r>
-      <w:r>
-        <w:tab/>
-      </w:r>
-      <w:r>
-        <w:tab/>
-      </w:r>
-    </w:p>
-    <w:p>
-      <w:r>
-        <w:tab/>
-      </w:r>
-      <w:r>
-        <w:tab/>
-        <w:t>Yêu cầu:</w:t>
-      </w:r>
-      <w:r>
-        <w:tab/>
-      </w:r>
-      <w:r>
-        <w:tab/>
-      </w:r>
-      <w:r>
-        <w:tab/>
-      </w:r>
-    </w:p>
-    <w:p>
-      <w:r>
-        <w:tab/>
-      </w:r>
-      <w:r>
-        <w:tab/>
-        <w:t>Chạy Prometheus, Grafana và Node Exporter bằng Docker Compose để giám sát hệ thống.</w:t>
-      </w:r>
-      <w:r>
-        <w:tab/>
-      </w:r>
-      <w:r>
-        <w:tab/>
-      </w:r>
-      <w:r>
-        <w:tab/>
-      </w:r>
-    </w:p>
-    <w:p>
-      <w:r>
-        <w:tab/>
-      </w:r>
-      <w:r>
-        <w:tab/>
-      </w:r>
-      <w:r>
-        <w:tab/>
-      </w:r>
-      <w:r>
-        <w:tab/>
-      </w:r>
-      <w:r>
-        <w:tab/>
-      </w:r>
-    </w:p>
-    <w:p>
-      <w:r>
-        <w:tab/>
-        <w:t>Bài 13: Chạy ứng dụng React với Nginx</w:t>
-      </w:r>
-      <w:r>
-        <w:tab/>
-      </w:r>
-      <w:r>
-        <w:tab/>
-      </w:r>
-      <w:r>
-        <w:tab/>
-      </w:r>
-      <w:r>
-        <w:tab/>
-      </w:r>
-    </w:p>
-    <w:p>
-      <w:r>
-        <w:tab/>
-      </w:r>
-      <w:r>
-        <w:tab/>
-        <w:t>Yêu cầu:</w:t>
-      </w:r>
-      <w:r>
-        <w:tab/>
-      </w:r>
-      <w:r>
-        <w:tab/>
-      </w:r>
-      <w:r>
-        <w:tab/>
-      </w:r>
-    </w:p>
-    <w:p>
-      <w:r>
-        <w:tab/>
-      </w:r>
-      <w:r>
-        <w:tab/>
-        <w:t>Chạy một ứng dụng React và serve nó bằng Nginx.</w:t>
-      </w:r>
-      <w:r>
-        <w:tab/>
-      </w:r>
-      <w:r>
-        <w:tab/>
-      </w:r>
-      <w:r>
-        <w:tab/>
-      </w:r>
-    </w:p>
-    <w:p>
-      <w:r>
-        <w:tab/>
-      </w:r>
-      <w:r>
-        <w:tab/>
-      </w:r>
-      <w:r>
-        <w:tab/>
-      </w:r>
-      <w:r>
-        <w:tab/>
-      </w:r>
-      <w:r>
-        <w:tab/>
-      </w:r>
-    </w:p>
-    <w:p>
-      <w:r>
-        <w:tab/>
-        <w:t>Bài 14: Cấu hình mạng riêng giữa các container</w:t>
-      </w:r>
-      <w:r>
-        <w:tab/>
-      </w:r>
-      <w:r>
-        <w:tab/>
-      </w:r>
-      <w:r>
-        <w:tab/>
-      </w:r>
-      <w:r>
-        <w:tab/>
-      </w:r>
-    </w:p>
-    <w:p>
-      <w:r>
         <w:tab/>
       </w:r>
       <w:r>

</xml_diff>

<commit_message>
phan 2 bai 9,10
</commit_message>
<xml_diff>
--- a/Tuan05/Baocao_LamNgocThanhPhu_22650381.docx
+++ b/Tuan05/Baocao_LamNgocThanhPhu_22650381.docx
@@ -1191,6 +1191,43 @@
         <w:tab/>
       </w:r>
       <w:r>
+        <w:drawing>
+          <wp:inline distT="0" distB="0" distL="0" distR="0" wp14:anchorId="5F8DD0F8" wp14:editId="0EE172EA">
+            <wp:extent cx="5943600" cy="3245485"/>
+            <wp:effectExtent l="0" t="0" r="0" b="0"/>
+            <wp:docPr id="1353255984" name="Picture 1"/>
+            <wp:cNvGraphicFramePr>
+              <a:graphicFrameLocks xmlns:a="http://schemas.openxmlformats.org/drawingml/2006/main" noChangeAspect="1"/>
+            </wp:cNvGraphicFramePr>
+            <a:graphic xmlns:a="http://schemas.openxmlformats.org/drawingml/2006/main">
+              <a:graphicData uri="http://schemas.openxmlformats.org/drawingml/2006/picture">
+                <pic:pic xmlns:pic="http://schemas.openxmlformats.org/drawingml/2006/picture">
+                  <pic:nvPicPr>
+                    <pic:cNvPr id="1353255984" name=""/>
+                    <pic:cNvPicPr/>
+                  </pic:nvPicPr>
+                  <pic:blipFill>
+                    <a:blip r:embed="rId17"/>
+                    <a:stretch>
+                      <a:fillRect/>
+                    </a:stretch>
+                  </pic:blipFill>
+                  <pic:spPr>
+                    <a:xfrm>
+                      <a:off x="0" y="0"/>
+                      <a:ext cx="5943600" cy="3245485"/>
+                    </a:xfrm>
+                    <a:prstGeom prst="rect">
+                      <a:avLst/>
+                    </a:prstGeom>
+                  </pic:spPr>
+                </pic:pic>
+              </a:graphicData>
+            </a:graphic>
+          </wp:inline>
+        </w:drawing>
+      </w:r>
+      <w:r>
         <w:tab/>
       </w:r>
       <w:r>
@@ -1240,6 +1277,11 @@
       </w:r>
     </w:p>
     <w:p>
+      <w:pPr>
+        <w:rPr>
+          <w:lang w:val="en-US"/>
+        </w:rPr>
+      </w:pPr>
       <w:r>
         <w:tab/>
       </w:r>
@@ -1247,8 +1289,45 @@
         <w:tab/>
         <w:t>Chạy MySQL và gắn volume để dữ liệu không bị mất.</w:t>
       </w:r>
-      <w:r>
-        <w:tab/>
+    </w:p>
+    <w:p>
+      <w:r>
+        <w:lastRenderedPageBreak/>
+        <w:drawing>
+          <wp:inline distT="0" distB="0" distL="0" distR="0" wp14:anchorId="2F9CB2CD" wp14:editId="0FF0621C">
+            <wp:extent cx="5943600" cy="3804285"/>
+            <wp:effectExtent l="0" t="0" r="0" b="5715"/>
+            <wp:docPr id="1520311151" name="Picture 1"/>
+            <wp:cNvGraphicFramePr>
+              <a:graphicFrameLocks xmlns:a="http://schemas.openxmlformats.org/drawingml/2006/main" noChangeAspect="1"/>
+            </wp:cNvGraphicFramePr>
+            <a:graphic xmlns:a="http://schemas.openxmlformats.org/drawingml/2006/main">
+              <a:graphicData uri="http://schemas.openxmlformats.org/drawingml/2006/picture">
+                <pic:pic xmlns:pic="http://schemas.openxmlformats.org/drawingml/2006/picture">
+                  <pic:nvPicPr>
+                    <pic:cNvPr id="1520311151" name=""/>
+                    <pic:cNvPicPr/>
+                  </pic:nvPicPr>
+                  <pic:blipFill>
+                    <a:blip r:embed="rId18"/>
+                    <a:stretch>
+                      <a:fillRect/>
+                    </a:stretch>
+                  </pic:blipFill>
+                  <pic:spPr>
+                    <a:xfrm>
+                      <a:off x="0" y="0"/>
+                      <a:ext cx="5943600" cy="3804285"/>
+                    </a:xfrm>
+                    <a:prstGeom prst="rect">
+                      <a:avLst/>
+                    </a:prstGeom>
+                  </pic:spPr>
+                </pic:pic>
+              </a:graphicData>
+            </a:graphic>
+          </wp:inline>
+        </w:drawing>
       </w:r>
       <w:r>
         <w:tab/>
@@ -1543,96 +1622,96 @@
     </w:p>
     <w:p>
       <w:r>
+        <w:tab/>
+      </w:r>
+      <w:r>
+        <w:tab/>
+        <w:t>Yêu cầu:</w:t>
+      </w:r>
+      <w:r>
+        <w:tab/>
+      </w:r>
+      <w:r>
+        <w:tab/>
+      </w:r>
+      <w:r>
+        <w:tab/>
+      </w:r>
+    </w:p>
+    <w:p>
+      <w:r>
+        <w:tab/>
+      </w:r>
+      <w:r>
+        <w:tab/>
+        <w:t>Chạy 2 container có thể giao tiếp với nhau trong một mạng riêng.</w:t>
+      </w:r>
+      <w:r>
+        <w:tab/>
+      </w:r>
+      <w:r>
+        <w:tab/>
+      </w:r>
+      <w:r>
+        <w:tab/>
+      </w:r>
+    </w:p>
+    <w:p>
+      <w:r>
+        <w:tab/>
+      </w:r>
+      <w:r>
+        <w:tab/>
+      </w:r>
+      <w:r>
+        <w:tab/>
+      </w:r>
+      <w:r>
+        <w:tab/>
+      </w:r>
+      <w:r>
+        <w:tab/>
+      </w:r>
+    </w:p>
+    <w:p>
+      <w:r>
+        <w:tab/>
+        <w:t>Bài 15: Giới hạn tài nguyên cho container</w:t>
+      </w:r>
+      <w:r>
+        <w:tab/>
+      </w:r>
+      <w:r>
+        <w:tab/>
+      </w:r>
+      <w:r>
+        <w:tab/>
+      </w:r>
+      <w:r>
+        <w:tab/>
+      </w:r>
+    </w:p>
+    <w:p>
+      <w:r>
+        <w:tab/>
+      </w:r>
+      <w:r>
+        <w:tab/>
+        <w:t>Yêu cầu:</w:t>
+      </w:r>
+      <w:r>
+        <w:tab/>
+      </w:r>
+      <w:r>
+        <w:tab/>
+      </w:r>
+      <w:r>
+        <w:tab/>
+      </w:r>
+    </w:p>
+    <w:p>
+      <w:r>
         <w:lastRenderedPageBreak/>
-        <w:tab/>
-      </w:r>
-      <w:r>
-        <w:tab/>
-        <w:t>Yêu cầu:</w:t>
-      </w:r>
-      <w:r>
-        <w:tab/>
-      </w:r>
-      <w:r>
-        <w:tab/>
-      </w:r>
-      <w:r>
-        <w:tab/>
-      </w:r>
-    </w:p>
-    <w:p>
-      <w:r>
-        <w:tab/>
-      </w:r>
-      <w:r>
-        <w:tab/>
-        <w:t>Chạy 2 container có thể giao tiếp với nhau trong một mạng riêng.</w:t>
-      </w:r>
-      <w:r>
-        <w:tab/>
-      </w:r>
-      <w:r>
-        <w:tab/>
-      </w:r>
-      <w:r>
-        <w:tab/>
-      </w:r>
-    </w:p>
-    <w:p>
-      <w:r>
-        <w:tab/>
-      </w:r>
-      <w:r>
-        <w:tab/>
-      </w:r>
-      <w:r>
-        <w:tab/>
-      </w:r>
-      <w:r>
-        <w:tab/>
-      </w:r>
-      <w:r>
-        <w:tab/>
-      </w:r>
-    </w:p>
-    <w:p>
-      <w:r>
-        <w:tab/>
-        <w:t>Bài 15: Giới hạn tài nguyên cho container</w:t>
-      </w:r>
-      <w:r>
-        <w:tab/>
-      </w:r>
-      <w:r>
-        <w:tab/>
-      </w:r>
-      <w:r>
-        <w:tab/>
-      </w:r>
-      <w:r>
-        <w:tab/>
-      </w:r>
-    </w:p>
-    <w:p>
-      <w:r>
-        <w:tab/>
-      </w:r>
-      <w:r>
-        <w:tab/>
-        <w:t>Yêu cầu:</w:t>
-      </w:r>
-      <w:r>
-        <w:tab/>
-      </w:r>
-      <w:r>
-        <w:tab/>
-      </w:r>
-      <w:r>
-        <w:tab/>
-      </w:r>
-    </w:p>
-    <w:p>
-      <w:r>
         <w:tab/>
       </w:r>
       <w:r>

</xml_diff>

<commit_message>
phan 12 bai 11
</commit_message>
<xml_diff>
--- a/Tuan05/Baocao_LamNgocThanhPhu_22650381.docx
+++ b/Tuan05/Baocao_LamNgocThanhPhu_22650381.docx
@@ -1445,13 +1445,85 @@
     </w:p>
     <w:p>
       <w:r>
-        <w:tab/>
-      </w:r>
-      <w:r>
-        <w:tab/>
-      </w:r>
-      <w:r>
-        <w:tab/>
+        <w:lastRenderedPageBreak/>
+        <w:tab/>
+      </w:r>
+      <w:r>
+        <w:drawing>
+          <wp:inline distT="0" distB="0" distL="0" distR="0" wp14:anchorId="254ECACC" wp14:editId="01B3B7BA">
+            <wp:extent cx="5943600" cy="3743325"/>
+            <wp:effectExtent l="0" t="0" r="0" b="9525"/>
+            <wp:docPr id="471093703" name="Picture 1"/>
+            <wp:cNvGraphicFramePr>
+              <a:graphicFrameLocks xmlns:a="http://schemas.openxmlformats.org/drawingml/2006/main" noChangeAspect="1"/>
+            </wp:cNvGraphicFramePr>
+            <a:graphic xmlns:a="http://schemas.openxmlformats.org/drawingml/2006/main">
+              <a:graphicData uri="http://schemas.openxmlformats.org/drawingml/2006/picture">
+                <pic:pic xmlns:pic="http://schemas.openxmlformats.org/drawingml/2006/picture">
+                  <pic:nvPicPr>
+                    <pic:cNvPr id="471093703" name=""/>
+                    <pic:cNvPicPr/>
+                  </pic:nvPicPr>
+                  <pic:blipFill>
+                    <a:blip r:embed="rId19"/>
+                    <a:stretch>
+                      <a:fillRect/>
+                    </a:stretch>
+                  </pic:blipFill>
+                  <pic:spPr>
+                    <a:xfrm>
+                      <a:off x="0" y="0"/>
+                      <a:ext cx="5943600" cy="3743325"/>
+                    </a:xfrm>
+                    <a:prstGeom prst="rect">
+                      <a:avLst/>
+                    </a:prstGeom>
+                  </pic:spPr>
+                </pic:pic>
+              </a:graphicData>
+            </a:graphic>
+          </wp:inline>
+        </w:drawing>
+      </w:r>
+      <w:r>
+        <w:tab/>
+      </w:r>
+      <w:r>
+        <w:drawing>
+          <wp:inline distT="0" distB="0" distL="0" distR="0" wp14:anchorId="4D7DBBF4" wp14:editId="33F3E702">
+            <wp:extent cx="5943600" cy="2221865"/>
+            <wp:effectExtent l="0" t="0" r="0" b="6985"/>
+            <wp:docPr id="143338277" name="Picture 1"/>
+            <wp:cNvGraphicFramePr>
+              <a:graphicFrameLocks xmlns:a="http://schemas.openxmlformats.org/drawingml/2006/main" noChangeAspect="1"/>
+            </wp:cNvGraphicFramePr>
+            <a:graphic xmlns:a="http://schemas.openxmlformats.org/drawingml/2006/main">
+              <a:graphicData uri="http://schemas.openxmlformats.org/drawingml/2006/picture">
+                <pic:pic xmlns:pic="http://schemas.openxmlformats.org/drawingml/2006/picture">
+                  <pic:nvPicPr>
+                    <pic:cNvPr id="143338277" name=""/>
+                    <pic:cNvPicPr/>
+                  </pic:nvPicPr>
+                  <pic:blipFill>
+                    <a:blip r:embed="rId20"/>
+                    <a:stretch>
+                      <a:fillRect/>
+                    </a:stretch>
+                  </pic:blipFill>
+                  <pic:spPr>
+                    <a:xfrm>
+                      <a:off x="0" y="0"/>
+                      <a:ext cx="5943600" cy="2221865"/>
+                    </a:xfrm>
+                    <a:prstGeom prst="rect">
+                      <a:avLst/>
+                    </a:prstGeom>
+                  </pic:spPr>
+                </pic:pic>
+              </a:graphicData>
+            </a:graphic>
+          </wp:inline>
+        </w:drawing>
       </w:r>
       <w:r>
         <w:tab/>
@@ -1604,6 +1676,7 @@
     </w:p>
     <w:p>
       <w:r>
+        <w:lastRenderedPageBreak/>
         <w:tab/>
         <w:t>Bài 14: Cấu hình mạng riêng giữa các container</w:t>
       </w:r>
@@ -1711,7 +1784,6 @@
     </w:p>
     <w:p>
       <w:r>
-        <w:lastRenderedPageBreak/>
         <w:tab/>
       </w:r>
       <w:r>

</xml_diff>

<commit_message>
phan 2: bai 12,13
</commit_message>
<xml_diff>
--- a/Tuan05/Baocao_LamNgocThanhPhu_22650381.docx
+++ b/Tuan05/Baocao_LamNgocThanhPhu_22650381.docx
@@ -1588,13 +1588,42 @@
     </w:p>
     <w:p>
       <w:r>
-        <w:tab/>
-      </w:r>
-      <w:r>
-        <w:tab/>
-      </w:r>
-      <w:r>
-        <w:tab/>
+        <w:lastRenderedPageBreak/>
+        <w:drawing>
+          <wp:inline distT="0" distB="0" distL="0" distR="0" wp14:anchorId="4A72C472" wp14:editId="11BF8F86">
+            <wp:extent cx="5943600" cy="3651250"/>
+            <wp:effectExtent l="0" t="0" r="0" b="6350"/>
+            <wp:docPr id="398536100" name="Picture 1"/>
+            <wp:cNvGraphicFramePr>
+              <a:graphicFrameLocks xmlns:a="http://schemas.openxmlformats.org/drawingml/2006/main" noChangeAspect="1"/>
+            </wp:cNvGraphicFramePr>
+            <a:graphic xmlns:a="http://schemas.openxmlformats.org/drawingml/2006/main">
+              <a:graphicData uri="http://schemas.openxmlformats.org/drawingml/2006/picture">
+                <pic:pic xmlns:pic="http://schemas.openxmlformats.org/drawingml/2006/picture">
+                  <pic:nvPicPr>
+                    <pic:cNvPr id="398536100" name=""/>
+                    <pic:cNvPicPr/>
+                  </pic:nvPicPr>
+                  <pic:blipFill>
+                    <a:blip r:embed="rId21"/>
+                    <a:stretch>
+                      <a:fillRect/>
+                    </a:stretch>
+                  </pic:blipFill>
+                  <pic:spPr>
+                    <a:xfrm>
+                      <a:off x="0" y="0"/>
+                      <a:ext cx="5943600" cy="3651250"/>
+                    </a:xfrm>
+                    <a:prstGeom prst="rect">
+                      <a:avLst/>
+                    </a:prstGeom>
+                  </pic:spPr>
+                </pic:pic>
+              </a:graphicData>
+            </a:graphic>
+          </wp:inline>
+        </w:drawing>
       </w:r>
       <w:r>
         <w:tab/>
@@ -1659,24 +1688,61 @@
     </w:p>
     <w:p>
       <w:r>
-        <w:tab/>
-      </w:r>
-      <w:r>
-        <w:tab/>
-      </w:r>
-      <w:r>
-        <w:tab/>
-      </w:r>
-      <w:r>
-        <w:tab/>
-      </w:r>
-      <w:r>
-        <w:tab/>
-      </w:r>
-    </w:p>
-    <w:p>
-      <w:r>
         <w:lastRenderedPageBreak/>
+        <w:tab/>
+      </w:r>
+      <w:r>
+        <w:drawing>
+          <wp:inline distT="0" distB="0" distL="0" distR="0" wp14:anchorId="00ADD16D" wp14:editId="7A528C61">
+            <wp:extent cx="5943600" cy="4514215"/>
+            <wp:effectExtent l="0" t="0" r="0" b="635"/>
+            <wp:docPr id="959418761" name="Picture 1"/>
+            <wp:cNvGraphicFramePr>
+              <a:graphicFrameLocks xmlns:a="http://schemas.openxmlformats.org/drawingml/2006/main" noChangeAspect="1"/>
+            </wp:cNvGraphicFramePr>
+            <a:graphic xmlns:a="http://schemas.openxmlformats.org/drawingml/2006/main">
+              <a:graphicData uri="http://schemas.openxmlformats.org/drawingml/2006/picture">
+                <pic:pic xmlns:pic="http://schemas.openxmlformats.org/drawingml/2006/picture">
+                  <pic:nvPicPr>
+                    <pic:cNvPr id="959418761" name=""/>
+                    <pic:cNvPicPr/>
+                  </pic:nvPicPr>
+                  <pic:blipFill>
+                    <a:blip r:embed="rId22"/>
+                    <a:stretch>
+                      <a:fillRect/>
+                    </a:stretch>
+                  </pic:blipFill>
+                  <pic:spPr>
+                    <a:xfrm>
+                      <a:off x="0" y="0"/>
+                      <a:ext cx="5943600" cy="4514215"/>
+                    </a:xfrm>
+                    <a:prstGeom prst="rect">
+                      <a:avLst/>
+                    </a:prstGeom>
+                  </pic:spPr>
+                </pic:pic>
+              </a:graphicData>
+            </a:graphic>
+          </wp:inline>
+        </w:drawing>
+      </w:r>
+      <w:r>
+        <w:tab/>
+      </w:r>
+      <w:r>
+        <w:tab/>
+      </w:r>
+      <w:r>
+        <w:tab/>
+      </w:r>
+      <w:r>
+        <w:tab/>
+      </w:r>
+    </w:p>
+    <w:p>
+      <w:r>
         <w:tab/>
         <w:t>Bài 14: Cấu hình mạng riêng giữa các container</w:t>
       </w:r>

</xml_diff>

<commit_message>
phan 3 bai 1
</commit_message>
<xml_diff>
--- a/Tuan05/Baocao_LamNgocThanhPhu_22650381.docx
+++ b/Tuan05/Baocao_LamNgocThanhPhu_22650381.docx
@@ -1989,6 +1989,1911 @@
             </a:graphic>
           </wp:inline>
         </w:drawing>
+      </w:r>
+    </w:p>
+    <w:p>
+      <w:pPr>
+        <w:ind w:firstLine="272"/>
+      </w:pPr>
+      <w:r>
+        <w:br w:type="page"/>
+      </w:r>
+    </w:p>
+    <w:p>
+      <w:r>
+        <w:lastRenderedPageBreak/>
+        <w:t>Phần 3:</w:t>
+      </w:r>
+      <w:r>
+        <w:tab/>
+        <w:t>Docker Compose file</w:t>
+      </w:r>
+      <w:r>
+        <w:tab/>
+      </w:r>
+      <w:r>
+        <w:tab/>
+      </w:r>
+      <w:r>
+        <w:tab/>
+      </w:r>
+      <w:r>
+        <w:tab/>
+      </w:r>
+      <w:r>
+        <w:tab/>
+      </w:r>
+    </w:p>
+    <w:p>
+      <w:r>
+        <w:tab/>
+      </w:r>
+      <w:r>
+        <w:tab/>
+      </w:r>
+      <w:r>
+        <w:tab/>
+      </w:r>
+      <w:r>
+        <w:tab/>
+      </w:r>
+      <w:r>
+        <w:tab/>
+      </w:r>
+      <w:r>
+        <w:tab/>
+      </w:r>
+    </w:p>
+    <w:p>
+      <w:r>
+        <w:tab/>
+        <w:t>Bài tập 1: Triển khai WordPress với MySQL</w:t>
+      </w:r>
+      <w:r>
+        <w:tab/>
+      </w:r>
+      <w:r>
+        <w:tab/>
+      </w:r>
+      <w:r>
+        <w:tab/>
+      </w:r>
+      <w:r>
+        <w:tab/>
+      </w:r>
+      <w:r>
+        <w:tab/>
+      </w:r>
+    </w:p>
+    <w:p>
+      <w:r>
+        <w:tab/>
+        <w:t>Mục tiêu: Tạo stack WordPress kết nối với MySQL, sử dụng volumes để lưu trữ dữ liệu.</w:t>
+      </w:r>
+      <w:r>
+        <w:tab/>
+      </w:r>
+      <w:r>
+        <w:tab/>
+      </w:r>
+      <w:r>
+        <w:tab/>
+      </w:r>
+      <w:r>
+        <w:tab/>
+      </w:r>
+      <w:r>
+        <w:tab/>
+      </w:r>
+    </w:p>
+    <w:p>
+      <w:r>
+        <w:tab/>
+        <w:t>Yêu cầu:</w:t>
+      </w:r>
+      <w:r>
+        <w:tab/>
+      </w:r>
+      <w:r>
+        <w:tab/>
+      </w:r>
+      <w:r>
+        <w:tab/>
+      </w:r>
+      <w:r>
+        <w:tab/>
+      </w:r>
+      <w:r>
+        <w:tab/>
+      </w:r>
+    </w:p>
+    <w:p>
+      <w:r>
+        <w:tab/>
+      </w:r>
+      <w:r>
+        <w:tab/>
+        <w:t>1. Sử dụng image wordpress:latest (port 80).</w:t>
+      </w:r>
+      <w:r>
+        <w:tab/>
+      </w:r>
+      <w:r>
+        <w:tab/>
+      </w:r>
+      <w:r>
+        <w:tab/>
+      </w:r>
+      <w:r>
+        <w:tab/>
+      </w:r>
+    </w:p>
+    <w:p>
+      <w:r>
+        <w:tab/>
+      </w:r>
+      <w:r>
+        <w:tab/>
+        <w:t>2. Sử dụng image mysql:5.7 (port 3306).</w:t>
+      </w:r>
+      <w:r>
+        <w:tab/>
+      </w:r>
+      <w:r>
+        <w:tab/>
+      </w:r>
+      <w:r>
+        <w:tab/>
+      </w:r>
+      <w:r>
+        <w:tab/>
+      </w:r>
+    </w:p>
+    <w:p>
+      <w:r>
+        <w:tab/>
+      </w:r>
+      <w:r>
+        <w:tab/>
+        <w:t>3. Volume cho database (/var/lib/mysql).</w:t>
+      </w:r>
+      <w:r>
+        <w:tab/>
+      </w:r>
+      <w:r>
+        <w:tab/>
+      </w:r>
+      <w:r>
+        <w:tab/>
+      </w:r>
+      <w:r>
+        <w:tab/>
+      </w:r>
+    </w:p>
+    <w:p>
+      <w:r>
+        <w:tab/>
+      </w:r>
+      <w:r>
+        <w:tab/>
+        <w:t>4. Biến môi trường cho MySQL:</w:t>
+      </w:r>
+      <w:r>
+        <w:tab/>
+      </w:r>
+      <w:r>
+        <w:tab/>
+      </w:r>
+      <w:r>
+        <w:tab/>
+      </w:r>
+      <w:r>
+        <w:tab/>
+      </w:r>
+    </w:p>
+    <w:p>
+      <w:r>
+        <w:tab/>
+      </w:r>
+      <w:r>
+        <w:tab/>
+      </w:r>
+      <w:r>
+        <w:tab/>
+        <w:t>MYSQL_ROOT_PASSWORD, MYSQL_DATABASE, MYSQL_USER, MYSQL_PASSWORD</w:t>
+      </w:r>
+      <w:r>
+        <w:tab/>
+      </w:r>
+      <w:r>
+        <w:tab/>
+      </w:r>
+      <w:r>
+        <w:tab/>
+      </w:r>
+    </w:p>
+    <w:p>
+      <w:r>
+        <w:tab/>
+      </w:r>
+      <w:r>
+        <w:tab/>
+        <w:t>Gợi ý:</w:t>
+      </w:r>
+      <w:r>
+        <w:tab/>
+      </w:r>
+      <w:r>
+        <w:tab/>
+      </w:r>
+      <w:r>
+        <w:tab/>
+      </w:r>
+      <w:r>
+        <w:tab/>
+      </w:r>
+    </w:p>
+    <w:p>
+      <w:r>
+        <w:tab/>
+      </w:r>
+      <w:r>
+        <w:tab/>
+      </w:r>
+      <w:r>
+        <w:tab/>
+        <w:t>WordPress cần khai báo depends_on MySQL.</w:t>
+      </w:r>
+      <w:r>
+        <w:tab/>
+      </w:r>
+      <w:r>
+        <w:tab/>
+      </w:r>
+      <w:r>
+        <w:tab/>
+      </w:r>
+    </w:p>
+    <w:p>
+      <w:r>
+        <w:tab/>
+      </w:r>
+      <w:r>
+        <w:tab/>
+      </w:r>
+      <w:r>
+        <w:tab/>
+        <w:t>Sử dụng network tùy chỉnh để kết nối giữa 2 service.</w:t>
+      </w:r>
+      <w:r>
+        <w:tab/>
+      </w:r>
+      <w:r>
+        <w:tab/>
+      </w:r>
+      <w:r>
+        <w:tab/>
+      </w:r>
+    </w:p>
+    <w:p>
+      <w:r>
+        <w:tab/>
+      </w:r>
+      <w:r>
+        <w:rPr>
+          <w:noProof/>
+        </w:rPr>
+        <w:drawing>
+          <wp:inline distT="0" distB="0" distL="0" distR="0" wp14:anchorId="25040CF5" wp14:editId="6CF09FA9">
+            <wp:extent cx="5943600" cy="3916045"/>
+            <wp:effectExtent l="0" t="0" r="0" b="8255"/>
+            <wp:docPr id="668272948" name="Picture 1"/>
+            <wp:cNvGraphicFramePr>
+              <a:graphicFrameLocks xmlns:a="http://schemas.openxmlformats.org/drawingml/2006/main" noChangeAspect="1"/>
+            </wp:cNvGraphicFramePr>
+            <a:graphic xmlns:a="http://schemas.openxmlformats.org/drawingml/2006/main">
+              <a:graphicData uri="http://schemas.openxmlformats.org/drawingml/2006/picture">
+                <pic:pic xmlns:pic="http://schemas.openxmlformats.org/drawingml/2006/picture">
+                  <pic:nvPicPr>
+                    <pic:cNvPr id="668272948" name=""/>
+                    <pic:cNvPicPr/>
+                  </pic:nvPicPr>
+                  <pic:blipFill>
+                    <a:blip r:embed="rId25"/>
+                    <a:stretch>
+                      <a:fillRect/>
+                    </a:stretch>
+                  </pic:blipFill>
+                  <pic:spPr>
+                    <a:xfrm>
+                      <a:off x="0" y="0"/>
+                      <a:ext cx="5943600" cy="3916045"/>
+                    </a:xfrm>
+                    <a:prstGeom prst="rect">
+                      <a:avLst/>
+                    </a:prstGeom>
+                  </pic:spPr>
+                </pic:pic>
+              </a:graphicData>
+            </a:graphic>
+          </wp:inline>
+        </w:drawing>
+      </w:r>
+      <w:r>
+        <w:lastRenderedPageBreak/>
+        <w:drawing>
+          <wp:inline distT="0" distB="0" distL="0" distR="0" wp14:anchorId="07A48A0D" wp14:editId="7F551CB3">
+            <wp:extent cx="5943600" cy="3690620"/>
+            <wp:effectExtent l="0" t="0" r="0" b="5080"/>
+            <wp:docPr id="1226974789" name="Picture 1"/>
+            <wp:cNvGraphicFramePr>
+              <a:graphicFrameLocks xmlns:a="http://schemas.openxmlformats.org/drawingml/2006/main" noChangeAspect="1"/>
+            </wp:cNvGraphicFramePr>
+            <a:graphic xmlns:a="http://schemas.openxmlformats.org/drawingml/2006/main">
+              <a:graphicData uri="http://schemas.openxmlformats.org/drawingml/2006/picture">
+                <pic:pic xmlns:pic="http://schemas.openxmlformats.org/drawingml/2006/picture">
+                  <pic:nvPicPr>
+                    <pic:cNvPr id="1226974789" name=""/>
+                    <pic:cNvPicPr/>
+                  </pic:nvPicPr>
+                  <pic:blipFill>
+                    <a:blip r:embed="rId26"/>
+                    <a:stretch>
+                      <a:fillRect/>
+                    </a:stretch>
+                  </pic:blipFill>
+                  <pic:spPr>
+                    <a:xfrm>
+                      <a:off x="0" y="0"/>
+                      <a:ext cx="5943600" cy="3690620"/>
+                    </a:xfrm>
+                    <a:prstGeom prst="rect">
+                      <a:avLst/>
+                    </a:prstGeom>
+                  </pic:spPr>
+                </pic:pic>
+              </a:graphicData>
+            </a:graphic>
+          </wp:inline>
+        </w:drawing>
+      </w:r>
+      <w:r>
+        <w:tab/>
+      </w:r>
+      <w:r>
+        <w:tab/>
+      </w:r>
+      <w:r>
+        <w:tab/>
+      </w:r>
+      <w:r>
+        <w:tab/>
+      </w:r>
+    </w:p>
+    <w:p>
+      <w:r>
+        <w:tab/>
+        <w:t>Bài tập 2: Ứng dụng Node.js + MongoDB</w:t>
+      </w:r>
+      <w:r>
+        <w:tab/>
+      </w:r>
+      <w:r>
+        <w:tab/>
+      </w:r>
+      <w:r>
+        <w:tab/>
+      </w:r>
+      <w:r>
+        <w:tab/>
+      </w:r>
+      <w:r>
+        <w:tab/>
+      </w:r>
+    </w:p>
+    <w:p>
+      <w:r>
+        <w:tab/>
+        <w:t>Mục tiêu: Triển khai ứng dụng Node.js (lưu dữ liệu vào MongoDB) và MongoDB với volume.</w:t>
+      </w:r>
+      <w:r>
+        <w:tab/>
+      </w:r>
+      <w:r>
+        <w:tab/>
+      </w:r>
+      <w:r>
+        <w:tab/>
+      </w:r>
+      <w:r>
+        <w:tab/>
+      </w:r>
+      <w:r>
+        <w:tab/>
+      </w:r>
+    </w:p>
+    <w:p>
+      <w:r>
+        <w:tab/>
+        <w:t>Yêu cầu:</w:t>
+      </w:r>
+      <w:r>
+        <w:tab/>
+      </w:r>
+      <w:r>
+        <w:tab/>
+      </w:r>
+      <w:r>
+        <w:tab/>
+      </w:r>
+      <w:r>
+        <w:tab/>
+      </w:r>
+      <w:r>
+        <w:tab/>
+      </w:r>
+    </w:p>
+    <w:p>
+      <w:r>
+        <w:tab/>
+      </w:r>
+      <w:r>
+        <w:tab/>
+        <w:t>1. Viết Dockerfile cho ứng dụng Node.js (ví dụ: REST API đơn giản).</w:t>
+      </w:r>
+      <w:r>
+        <w:tab/>
+      </w:r>
+      <w:r>
+        <w:tab/>
+      </w:r>
+      <w:r>
+        <w:tab/>
+      </w:r>
+      <w:r>
+        <w:tab/>
+      </w:r>
+    </w:p>
+    <w:p>
+      <w:r>
+        <w:tab/>
+      </w:r>
+      <w:r>
+        <w:tab/>
+        <w:t>2. Sử dụng image mongo:latest (port 27017).</w:t>
+      </w:r>
+      <w:r>
+        <w:tab/>
+      </w:r>
+      <w:r>
+        <w:tab/>
+      </w:r>
+      <w:r>
+        <w:tab/>
+      </w:r>
+      <w:r>
+        <w:tab/>
+      </w:r>
+    </w:p>
+    <w:p>
+      <w:r>
+        <w:tab/>
+      </w:r>
+      <w:r>
+        <w:tab/>
+        <w:t>3. Volume cho MongoDB (/data/db).</w:t>
+      </w:r>
+      <w:r>
+        <w:tab/>
+      </w:r>
+      <w:r>
+        <w:tab/>
+      </w:r>
+      <w:r>
+        <w:tab/>
+      </w:r>
+      <w:r>
+        <w:tab/>
+      </w:r>
+    </w:p>
+    <w:p>
+      <w:r>
+        <w:tab/>
+      </w:r>
+      <w:r>
+        <w:tab/>
+        <w:t>4. Đảm bảo Node.js service khởi động sau MongoDB (depends_on + healthcheck).</w:t>
+      </w:r>
+      <w:r>
+        <w:tab/>
+      </w:r>
+      <w:r>
+        <w:tab/>
+      </w:r>
+      <w:r>
+        <w:tab/>
+      </w:r>
+      <w:r>
+        <w:tab/>
+      </w:r>
+    </w:p>
+    <w:p>
+      <w:r>
+        <w:tab/>
+      </w:r>
+      <w:r>
+        <w:tab/>
+      </w:r>
+      <w:r>
+        <w:tab/>
+      </w:r>
+      <w:r>
+        <w:tab/>
+      </w:r>
+      <w:r>
+        <w:tab/>
+      </w:r>
+      <w:r>
+        <w:tab/>
+      </w:r>
+    </w:p>
+    <w:p>
+      <w:r>
+        <w:tab/>
+        <w:t>Bài tập 3: Load Balancing với Nginx + Flask</w:t>
+      </w:r>
+      <w:r>
+        <w:tab/>
+      </w:r>
+      <w:r>
+        <w:tab/>
+      </w:r>
+      <w:r>
+        <w:tab/>
+      </w:r>
+      <w:r>
+        <w:tab/>
+      </w:r>
+      <w:r>
+        <w:tab/>
+      </w:r>
+    </w:p>
+    <w:p>
+      <w:r>
+        <w:tab/>
+        <w:t>Mục tiêu: Cân bằng tải giữa 2 instance Flask dùng Nginx.</w:t>
+      </w:r>
+      <w:r>
+        <w:tab/>
+      </w:r>
+      <w:r>
+        <w:tab/>
+      </w:r>
+      <w:r>
+        <w:tab/>
+      </w:r>
+      <w:r>
+        <w:tab/>
+      </w:r>
+      <w:r>
+        <w:tab/>
+      </w:r>
+    </w:p>
+    <w:p>
+      <w:r>
+        <w:tab/>
+        <w:t>Yêu cầu:</w:t>
+      </w:r>
+      <w:r>
+        <w:tab/>
+      </w:r>
+      <w:r>
+        <w:tab/>
+      </w:r>
+      <w:r>
+        <w:tab/>
+      </w:r>
+      <w:r>
+        <w:tab/>
+      </w:r>
+      <w:r>
+        <w:tab/>
+      </w:r>
+    </w:p>
+    <w:p>
+      <w:r>
+        <w:tab/>
+      </w:r>
+      <w:r>
+        <w:tab/>
+        <w:t>1. 2 service Flask (sử dụng app.py từ bài tập trước, port 5000).</w:t>
+      </w:r>
+      <w:r>
+        <w:tab/>
+      </w:r>
+      <w:r>
+        <w:tab/>
+      </w:r>
+      <w:r>
+        <w:tab/>
+      </w:r>
+      <w:r>
+        <w:tab/>
+      </w:r>
+    </w:p>
+    <w:p>
+      <w:r>
+        <w:tab/>
+      </w:r>
+      <w:r>
+        <w:tab/>
+        <w:t>2. 1 service Nginx (port 8080) cấu hình làm reverse proxy:</w:t>
+      </w:r>
+      <w:r>
+        <w:tab/>
+      </w:r>
+      <w:r>
+        <w:tab/>
+      </w:r>
+      <w:r>
+        <w:tab/>
+      </w:r>
+      <w:r>
+        <w:tab/>
+      </w:r>
+    </w:p>
+    <w:p>
+      <w:r>
+        <w:tab/>
+      </w:r>
+      <w:r>
+        <w:tab/>
+      </w:r>
+      <w:r>
+        <w:tab/>
+        <w:t>Chuyển request / đến các Flask instance (round-robin).</w:t>
+      </w:r>
+      <w:r>
+        <w:tab/>
+      </w:r>
+      <w:r>
+        <w:tab/>
+      </w:r>
+      <w:r>
+        <w:tab/>
+      </w:r>
+    </w:p>
+    <w:p>
+      <w:r>
+        <w:tab/>
+      </w:r>
+      <w:r>
+        <w:tab/>
+        <w:t>3. Tạo custom network và Nginx config.</w:t>
+      </w:r>
+      <w:r>
+        <w:tab/>
+      </w:r>
+      <w:r>
+        <w:tab/>
+      </w:r>
+      <w:r>
+        <w:tab/>
+      </w:r>
+      <w:r>
+        <w:tab/>
+      </w:r>
+    </w:p>
+    <w:p>
+      <w:r>
+        <w:tab/>
+      </w:r>
+      <w:r>
+        <w:tab/>
+      </w:r>
+      <w:r>
+        <w:tab/>
+      </w:r>
+      <w:r>
+        <w:tab/>
+      </w:r>
+      <w:r>
+        <w:tab/>
+      </w:r>
+      <w:r>
+        <w:tab/>
+      </w:r>
+    </w:p>
+    <w:p>
+      <w:r>
+        <w:tab/>
+        <w:t>Bài tập 4: Prometheus + Grafana Monitoring</w:t>
+      </w:r>
+      <w:r>
+        <w:tab/>
+      </w:r>
+      <w:r>
+        <w:tab/>
+      </w:r>
+      <w:r>
+        <w:tab/>
+      </w:r>
+      <w:r>
+        <w:tab/>
+      </w:r>
+      <w:r>
+        <w:tab/>
+      </w:r>
+    </w:p>
+    <w:p>
+      <w:r>
+        <w:tab/>
+        <w:t>Mục tiêu: Giám sát Docker containers dùng Prometheus và Grafana.</w:t>
+      </w:r>
+      <w:r>
+        <w:tab/>
+      </w:r>
+      <w:r>
+        <w:tab/>
+      </w:r>
+      <w:r>
+        <w:tab/>
+      </w:r>
+      <w:r>
+        <w:tab/>
+      </w:r>
+      <w:r>
+        <w:tab/>
+      </w:r>
+    </w:p>
+    <w:p>
+      <w:r>
+        <w:tab/>
+        <w:t>Yêu cầu:</w:t>
+      </w:r>
+      <w:r>
+        <w:tab/>
+      </w:r>
+      <w:r>
+        <w:tab/>
+      </w:r>
+      <w:r>
+        <w:tab/>
+      </w:r>
+      <w:r>
+        <w:tab/>
+      </w:r>
+      <w:r>
+        <w:tab/>
+      </w:r>
+    </w:p>
+    <w:p>
+      <w:r>
+        <w:lastRenderedPageBreak/>
+        <w:tab/>
+      </w:r>
+      <w:r>
+        <w:tab/>
+        <w:t>1. Service Prometheus (port 9090) với file cấu hình thu thập metrics từ Docker.</w:t>
+      </w:r>
+      <w:r>
+        <w:tab/>
+      </w:r>
+      <w:r>
+        <w:tab/>
+      </w:r>
+      <w:r>
+        <w:tab/>
+      </w:r>
+      <w:r>
+        <w:tab/>
+      </w:r>
+    </w:p>
+    <w:p>
+      <w:r>
+        <w:tab/>
+      </w:r>
+      <w:r>
+        <w:tab/>
+        <w:t>2. Service Grafana (port 3000) kết nối đến Prometheus.</w:t>
+      </w:r>
+      <w:r>
+        <w:tab/>
+      </w:r>
+      <w:r>
+        <w:tab/>
+      </w:r>
+      <w:r>
+        <w:tab/>
+      </w:r>
+      <w:r>
+        <w:tab/>
+      </w:r>
+    </w:p>
+    <w:p>
+      <w:r>
+        <w:tab/>
+      </w:r>
+      <w:r>
+        <w:tab/>
+        <w:t>3. Volume để lưu dữ liệu Prometheus và Grafana.</w:t>
+      </w:r>
+      <w:r>
+        <w:tab/>
+      </w:r>
+      <w:r>
+        <w:tab/>
+      </w:r>
+      <w:r>
+        <w:tab/>
+      </w:r>
+      <w:r>
+        <w:tab/>
+      </w:r>
+    </w:p>
+    <w:p>
+      <w:r>
+        <w:tab/>
+      </w:r>
+      <w:r>
+        <w:tab/>
+      </w:r>
+      <w:r>
+        <w:tab/>
+      </w:r>
+      <w:r>
+        <w:tab/>
+      </w:r>
+      <w:r>
+        <w:tab/>
+      </w:r>
+      <w:r>
+        <w:tab/>
+      </w:r>
+    </w:p>
+    <w:p>
+      <w:r>
+        <w:tab/>
+        <w:t>Bài tập 5: Multi-tier Voting App</w:t>
+      </w:r>
+      <w:r>
+        <w:tab/>
+      </w:r>
+      <w:r>
+        <w:tab/>
+      </w:r>
+      <w:r>
+        <w:tab/>
+      </w:r>
+      <w:r>
+        <w:tab/>
+      </w:r>
+      <w:r>
+        <w:tab/>
+      </w:r>
+    </w:p>
+    <w:p>
+      <w:r>
+        <w:tab/>
+        <w:t>Mục tiêu: Triển khai ứng dụng voting gồm 5 services (Tham khảo từ Docker Docs).</w:t>
+      </w:r>
+      <w:r>
+        <w:tab/>
+      </w:r>
+      <w:r>
+        <w:tab/>
+      </w:r>
+      <w:r>
+        <w:tab/>
+      </w:r>
+      <w:r>
+        <w:tab/>
+      </w:r>
+      <w:r>
+        <w:tab/>
+      </w:r>
+    </w:p>
+    <w:p>
+      <w:r>
+        <w:tab/>
+        <w:t>Yêu cầu:</w:t>
+      </w:r>
+      <w:r>
+        <w:tab/>
+      </w:r>
+      <w:r>
+        <w:tab/>
+      </w:r>
+      <w:r>
+        <w:tab/>
+      </w:r>
+      <w:r>
+        <w:tab/>
+      </w:r>
+      <w:r>
+        <w:tab/>
+      </w:r>
+    </w:p>
+    <w:p>
+      <w:r>
+        <w:tab/>
+      </w:r>
+      <w:r>
+        <w:tab/>
+        <w:t>1. Frontend: vote (Python, port 5000).</w:t>
+      </w:r>
+      <w:r>
+        <w:tab/>
+      </w:r>
+      <w:r>
+        <w:tab/>
+      </w:r>
+      <w:r>
+        <w:tab/>
+      </w:r>
+      <w:r>
+        <w:tab/>
+      </w:r>
+    </w:p>
+    <w:p>
+      <w:r>
+        <w:tab/>
+      </w:r>
+      <w:r>
+        <w:tab/>
+        <w:t>2. Backend: result (Node.js, port 5001).</w:t>
+      </w:r>
+      <w:r>
+        <w:tab/>
+      </w:r>
+      <w:r>
+        <w:tab/>
+      </w:r>
+      <w:r>
+        <w:tab/>
+      </w:r>
+      <w:r>
+        <w:tab/>
+      </w:r>
+    </w:p>
+    <w:p>
+      <w:r>
+        <w:tab/>
+      </w:r>
+      <w:r>
+        <w:tab/>
+        <w:t>3. Redis (lưu tạm vote).</w:t>
+      </w:r>
+      <w:r>
+        <w:tab/>
+      </w:r>
+      <w:r>
+        <w:tab/>
+      </w:r>
+      <w:r>
+        <w:tab/>
+      </w:r>
+      <w:r>
+        <w:tab/>
+      </w:r>
+    </w:p>
+    <w:p>
+      <w:r>
+        <w:tab/>
+      </w:r>
+      <w:r>
+        <w:tab/>
+        <w:t>4. Worker (Java) xử lý vote từ Redis sang DB.</w:t>
+      </w:r>
+      <w:r>
+        <w:tab/>
+      </w:r>
+      <w:r>
+        <w:tab/>
+      </w:r>
+      <w:r>
+        <w:tab/>
+      </w:r>
+      <w:r>
+        <w:tab/>
+      </w:r>
+    </w:p>
+    <w:p>
+      <w:r>
+        <w:tab/>
+      </w:r>
+      <w:r>
+        <w:tab/>
+        <w:t>5. Postgres (lưu kết quả).</w:t>
+      </w:r>
+      <w:r>
+        <w:tab/>
+      </w:r>
+      <w:r>
+        <w:tab/>
+      </w:r>
+      <w:r>
+        <w:tab/>
+      </w:r>
+      <w:r>
+        <w:tab/>
+      </w:r>
+    </w:p>
+    <w:p>
+      <w:r>
+        <w:tab/>
+      </w:r>
+      <w:r>
+        <w:tab/>
+      </w:r>
+      <w:r>
+        <w:tab/>
+      </w:r>
+      <w:r>
+        <w:tab/>
+      </w:r>
+      <w:r>
+        <w:tab/>
+      </w:r>
+      <w:r>
+        <w:tab/>
+      </w:r>
+    </w:p>
+    <w:p>
+      <w:r>
+        <w:tab/>
+        <w:t>Bài tập 6: CI/CD Pipeline với Docker Compose</w:t>
+      </w:r>
+      <w:r>
+        <w:tab/>
+      </w:r>
+      <w:r>
+        <w:tab/>
+      </w:r>
+      <w:r>
+        <w:tab/>
+      </w:r>
+      <w:r>
+        <w:tab/>
+      </w:r>
+      <w:r>
+        <w:tab/>
+      </w:r>
+    </w:p>
+    <w:p>
+      <w:r>
+        <w:tab/>
+        <w:t>Mục tiêu: Mô phỏng pipeline dev/test bằng Docker Compose.</w:t>
+      </w:r>
+      <w:r>
+        <w:tab/>
+      </w:r>
+      <w:r>
+        <w:tab/>
+      </w:r>
+      <w:r>
+        <w:tab/>
+      </w:r>
+      <w:r>
+        <w:tab/>
+      </w:r>
+      <w:r>
+        <w:tab/>
+      </w:r>
+    </w:p>
+    <w:p>
+      <w:r>
+        <w:tab/>
+        <w:t>Yêu cầu:</w:t>
+      </w:r>
+      <w:r>
+        <w:tab/>
+      </w:r>
+      <w:r>
+        <w:tab/>
+      </w:r>
+      <w:r>
+        <w:tab/>
+      </w:r>
+      <w:r>
+        <w:tab/>
+      </w:r>
+      <w:r>
+        <w:tab/>
+      </w:r>
+    </w:p>
+    <w:p>
+      <w:r>
+        <w:tab/>
+      </w:r>
+      <w:r>
+        <w:tab/>
+        <w:t>1. Service app (Python/Node.js) với code được mount từ host (development mode).</w:t>
+      </w:r>
+      <w:r>
+        <w:tab/>
+      </w:r>
+      <w:r>
+        <w:tab/>
+      </w:r>
+      <w:r>
+        <w:tab/>
+      </w:r>
+      <w:r>
+        <w:tab/>
+      </w:r>
+    </w:p>
+    <w:p>
+      <w:r>
+        <w:tab/>
+      </w:r>
+      <w:r>
+        <w:tab/>
+        <w:t>2. Service tests chạy unit tests khi code thay đổi (sử dụng volumes + entrypoint).</w:t>
+      </w:r>
+      <w:r>
+        <w:tab/>
+      </w:r>
+      <w:r>
+        <w:tab/>
+      </w:r>
+      <w:r>
+        <w:tab/>
+      </w:r>
+      <w:r>
+        <w:tab/>
+      </w:r>
+    </w:p>
+    <w:p>
+      <w:r>
+        <w:tab/>
+      </w:r>
+      <w:r>
+        <w:tab/>
+        <w:t>3. Service nginx (production mode) dùng image build sẵn từ app.</w:t>
+      </w:r>
+      <w:r>
+        <w:tab/>
+      </w:r>
+      <w:r>
+        <w:tab/>
+      </w:r>
+      <w:r>
+        <w:tab/>
+      </w:r>
+      <w:r>
+        <w:tab/>
+      </w:r>
+    </w:p>
+    <w:p>
+      <w:r>
+        <w:tab/>
+        <w:t>Gợi ý:</w:t>
+      </w:r>
+      <w:r>
+        <w:tab/>
+      </w:r>
+      <w:r>
+        <w:tab/>
+      </w:r>
+      <w:r>
+        <w:tab/>
+      </w:r>
+      <w:r>
+        <w:tab/>
+      </w:r>
+      <w:r>
+        <w:tab/>
+      </w:r>
+    </w:p>
+    <w:p>
+      <w:r>
+        <w:tab/>
+      </w:r>
+      <w:r>
+        <w:tab/>
+        <w:t>1. Dùng 2 file compose khác nhau (docker-compose-dev.yml và docker-compose-prod.yml).</w:t>
+      </w:r>
+      <w:r>
+        <w:tab/>
+      </w:r>
+      <w:r>
+        <w:tab/>
+      </w:r>
+      <w:r>
+        <w:tab/>
+      </w:r>
+      <w:r>
+        <w:tab/>
+      </w:r>
+    </w:p>
+    <w:p>
+      <w:r>
+        <w:tab/>
+      </w:r>
+      <w:r>
+        <w:tab/>
+        <w:t>2. Sử dụng docker-compose -f &lt;file&gt; up để chọn môi trường.</w:t>
+      </w:r>
+      <w:r>
+        <w:tab/>
+      </w:r>
+      <w:r>
+        <w:tab/>
+      </w:r>
+      <w:r>
+        <w:tab/>
+      </w:r>
+      <w:r>
+        <w:tab/>
+      </w:r>
+    </w:p>
+    <w:p>
+      <w:r>
+        <w:tab/>
+      </w:r>
+      <w:r>
+        <w:tab/>
+      </w:r>
+      <w:r>
+        <w:tab/>
+      </w:r>
+      <w:r>
+        <w:tab/>
+      </w:r>
+      <w:r>
+        <w:tab/>
+      </w:r>
+      <w:r>
+        <w:tab/>
+      </w:r>
+    </w:p>
+    <w:p>
+      <w:r>
+        <w:tab/>
+        <w:t>Bài tập 7: Elasticsearch + Kibana</w:t>
+      </w:r>
+      <w:r>
+        <w:tab/>
+      </w:r>
+      <w:r>
+        <w:tab/>
+      </w:r>
+      <w:r>
+        <w:tab/>
+      </w:r>
+      <w:r>
+        <w:tab/>
+      </w:r>
+      <w:r>
+        <w:tab/>
+      </w:r>
+    </w:p>
+    <w:p>
+      <w:r>
+        <w:tab/>
+        <w:t>Mục tiêu: Triển khai ELK stack đơn giản.</w:t>
+      </w:r>
+      <w:r>
+        <w:tab/>
+      </w:r>
+      <w:r>
+        <w:tab/>
+      </w:r>
+      <w:r>
+        <w:tab/>
+      </w:r>
+      <w:r>
+        <w:tab/>
+      </w:r>
+      <w:r>
+        <w:tab/>
+      </w:r>
+    </w:p>
+    <w:p>
+      <w:r>
+        <w:tab/>
+        <w:t>Yêu cầu:</w:t>
+      </w:r>
+      <w:r>
+        <w:tab/>
+      </w:r>
+      <w:r>
+        <w:tab/>
+      </w:r>
+      <w:r>
+        <w:tab/>
+      </w:r>
+      <w:r>
+        <w:tab/>
+      </w:r>
+      <w:r>
+        <w:tab/>
+      </w:r>
+    </w:p>
+    <w:p>
+      <w:r>
+        <w:tab/>
+      </w:r>
+      <w:r>
+        <w:tab/>
+        <w:t>1. Service Elasticsearch (port 9200) với volume.</w:t>
+      </w:r>
+      <w:r>
+        <w:tab/>
+      </w:r>
+      <w:r>
+        <w:tab/>
+      </w:r>
+      <w:r>
+        <w:tab/>
+      </w:r>
+      <w:r>
+        <w:tab/>
+      </w:r>
+    </w:p>
+    <w:p>
+      <w:r>
+        <w:tab/>
+      </w:r>
+      <w:r>
+        <w:tab/>
+        <w:t>2. Service Kibana (port 5601) kết nối với Elasticsearch.</w:t>
+      </w:r>
+      <w:r>
+        <w:tab/>
+      </w:r>
+      <w:r>
+        <w:tab/>
+      </w:r>
+      <w:r>
+        <w:tab/>
+      </w:r>
+      <w:r>
+        <w:tab/>
+      </w:r>
+    </w:p>
+    <w:p>
+      <w:r>
+        <w:tab/>
+      </w:r>
+      <w:r>
+        <w:tab/>
+        <w:t>3. Thiết lập environment variables cho credentials.</w:t>
+      </w:r>
+      <w:r>
+        <w:tab/>
+      </w:r>
+      <w:r>
+        <w:tab/>
+      </w:r>
+      <w:r>
+        <w:tab/>
+      </w:r>
+      <w:r>
+        <w:tab/>
+      </w:r>
+    </w:p>
+    <w:p>
+      <w:r>
+        <w:tab/>
+      </w:r>
+      <w:r>
+        <w:tab/>
+      </w:r>
+      <w:r>
+        <w:tab/>
+      </w:r>
+      <w:r>
+        <w:tab/>
+      </w:r>
+      <w:r>
+        <w:tab/>
+      </w:r>
+      <w:r>
+        <w:tab/>
+      </w:r>
+    </w:p>
+    <w:p>
+      <w:r>
+        <w:tab/>
+        <w:t>Bài tập 8: Django + Celery + Redis</w:t>
+      </w:r>
+      <w:r>
+        <w:tab/>
+      </w:r>
+      <w:r>
+        <w:tab/>
+      </w:r>
+      <w:r>
+        <w:tab/>
+      </w:r>
+      <w:r>
+        <w:tab/>
+      </w:r>
+      <w:r>
+        <w:tab/>
+      </w:r>
+    </w:p>
+    <w:p>
+      <w:r>
+        <w:tab/>
+        <w:t>Mục tiêu: Triển khai Django với Celery worker và Redis làm message broker.</w:t>
+      </w:r>
+      <w:r>
+        <w:tab/>
+      </w:r>
+      <w:r>
+        <w:tab/>
+      </w:r>
+      <w:r>
+        <w:tab/>
+      </w:r>
+      <w:r>
+        <w:tab/>
+      </w:r>
+      <w:r>
+        <w:tab/>
+      </w:r>
+    </w:p>
+    <w:p>
+      <w:r>
+        <w:tab/>
+        <w:t>Yêu cầu:</w:t>
+      </w:r>
+      <w:r>
+        <w:tab/>
+      </w:r>
+      <w:r>
+        <w:tab/>
+      </w:r>
+      <w:r>
+        <w:tab/>
+      </w:r>
+      <w:r>
+        <w:tab/>
+      </w:r>
+      <w:r>
+        <w:tab/>
+      </w:r>
+    </w:p>
+    <w:p>
+      <w:r>
+        <w:tab/>
+      </w:r>
+      <w:r>
+        <w:tab/>
+        <w:t>1. Django app (port 8000).</w:t>
+      </w:r>
+      <w:r>
+        <w:tab/>
+      </w:r>
+      <w:r>
+        <w:tab/>
+      </w:r>
+      <w:r>
+        <w:tab/>
+      </w:r>
+      <w:r>
+        <w:tab/>
+      </w:r>
+    </w:p>
+    <w:p>
+      <w:r>
+        <w:tab/>
+      </w:r>
+      <w:r>
+        <w:tab/>
+        <w:t>2. Celery worker chạy song song.</w:t>
+      </w:r>
+      <w:r>
+        <w:tab/>
+      </w:r>
+      <w:r>
+        <w:tab/>
+      </w:r>
+      <w:r>
+        <w:tab/>
+      </w:r>
+      <w:r>
+        <w:tab/>
+      </w:r>
+    </w:p>
+    <w:p>
+      <w:r>
+        <w:tab/>
+      </w:r>
+      <w:r>
+        <w:tab/>
+        <w:t>3. Redis service cho task queue.</w:t>
+      </w:r>
+      <w:r>
+        <w:tab/>
+      </w:r>
+      <w:r>
+        <w:tab/>
+      </w:r>
+      <w:r>
+        <w:tab/>
+      </w:r>
+      <w:r>
+        <w:tab/>
+      </w:r>
+    </w:p>
+    <w:p>
+      <w:r>
+        <w:tab/>
+      </w:r>
+      <w:r>
+        <w:tab/>
+      </w:r>
+      <w:r>
+        <w:tab/>
+      </w:r>
+      <w:r>
+        <w:tab/>
+      </w:r>
+      <w:r>
+        <w:tab/>
+      </w:r>
+      <w:r>
+        <w:tab/>
+      </w:r>
+    </w:p>
+    <w:p>
+      <w:r>
+        <w:lastRenderedPageBreak/>
+        <w:tab/>
+        <w:t>Bài tập 9: Nextcloud với MariaDB + Redis Caching</w:t>
+      </w:r>
+      <w:r>
+        <w:tab/>
+      </w:r>
+      <w:r>
+        <w:tab/>
+      </w:r>
+      <w:r>
+        <w:tab/>
+      </w:r>
+      <w:r>
+        <w:tab/>
+      </w:r>
+      <w:r>
+        <w:tab/>
+      </w:r>
+    </w:p>
+    <w:p>
+      <w:r>
+        <w:tab/>
+        <w:t>Mục tiêu: Triển khai Nextcloud (self-hosted cloud) với MariaDB và Redis.</w:t>
+      </w:r>
+      <w:r>
+        <w:tab/>
+      </w:r>
+      <w:r>
+        <w:tab/>
+      </w:r>
+      <w:r>
+        <w:tab/>
+      </w:r>
+      <w:r>
+        <w:tab/>
+      </w:r>
+      <w:r>
+        <w:tab/>
+      </w:r>
+    </w:p>
+    <w:p>
+      <w:r>
+        <w:tab/>
+        <w:t>Yêu cầu:</w:t>
+      </w:r>
+      <w:r>
+        <w:tab/>
+      </w:r>
+      <w:r>
+        <w:tab/>
+      </w:r>
+      <w:r>
+        <w:tab/>
+      </w:r>
+      <w:r>
+        <w:tab/>
+      </w:r>
+      <w:r>
+        <w:tab/>
+      </w:r>
+    </w:p>
+    <w:p>
+      <w:r>
+        <w:tab/>
+      </w:r>
+      <w:r>
+        <w:tab/>
+        <w:t>1. Nextcloud (port 80).</w:t>
+      </w:r>
+      <w:r>
+        <w:tab/>
+      </w:r>
+      <w:r>
+        <w:tab/>
+      </w:r>
+      <w:r>
+        <w:tab/>
+      </w:r>
+      <w:r>
+        <w:tab/>
+      </w:r>
+    </w:p>
+    <w:p>
+      <w:r>
+        <w:tab/>
+      </w:r>
+      <w:r>
+        <w:tab/>
+        <w:t>2. MariaDB (volume cho dữ liệu).</w:t>
+      </w:r>
+      <w:r>
+        <w:tab/>
+      </w:r>
+      <w:r>
+        <w:tab/>
+      </w:r>
+      <w:r>
+        <w:tab/>
+      </w:r>
+      <w:r>
+        <w:tab/>
+      </w:r>
+    </w:p>
+    <w:p>
+      <w:r>
+        <w:tab/>
+      </w:r>
+      <w:r>
+        <w:tab/>
+        <w:t>3. Redis cache.</w:t>
+      </w:r>
+      <w:r>
+        <w:tab/>
+      </w:r>
+      <w:r>
+        <w:tab/>
+      </w:r>
+      <w:r>
+        <w:tab/>
+      </w:r>
+      <w:r>
+        <w:tab/>
+      </w:r>
+    </w:p>
+    <w:p>
+      <w:r>
+        <w:tab/>
+      </w:r>
+      <w:r>
+        <w:tab/>
+      </w:r>
+      <w:r>
+        <w:tab/>
+      </w:r>
+      <w:r>
+        <w:tab/>
+      </w:r>
+      <w:r>
+        <w:tab/>
+      </w:r>
+      <w:r>
+        <w:tab/>
+      </w:r>
+    </w:p>
+    <w:p>
+      <w:r>
+        <w:tab/>
+        <w:t>Bài tập 10: Traefik as Reverse Proxy</w:t>
+      </w:r>
+      <w:r>
+        <w:tab/>
+      </w:r>
+      <w:r>
+        <w:tab/>
+      </w:r>
+      <w:r>
+        <w:tab/>
+      </w:r>
+      <w:r>
+        <w:tab/>
+      </w:r>
+      <w:r>
+        <w:tab/>
+      </w:r>
+    </w:p>
+    <w:p>
+      <w:r>
+        <w:tab/>
+        <w:t>Mục tiêu: Dùng Traefik để định tuyến request đến các service (Flask, WordPress, etc.).</w:t>
+      </w:r>
+      <w:r>
+        <w:tab/>
+      </w:r>
+      <w:r>
+        <w:tab/>
+      </w:r>
+      <w:r>
+        <w:tab/>
+      </w:r>
+      <w:r>
+        <w:tab/>
+      </w:r>
+      <w:r>
+        <w:tab/>
+      </w:r>
+    </w:p>
+    <w:p>
+      <w:r>
+        <w:tab/>
+        <w:t>Yêu cầu:</w:t>
+      </w:r>
+      <w:r>
+        <w:tab/>
+      </w:r>
+      <w:r>
+        <w:tab/>
+      </w:r>
+      <w:r>
+        <w:tab/>
+      </w:r>
+      <w:r>
+        <w:tab/>
+      </w:r>
+      <w:r>
+        <w:tab/>
+      </w:r>
+    </w:p>
+    <w:p>
+      <w:r>
+        <w:tab/>
+      </w:r>
+      <w:r>
+        <w:tab/>
+        <w:t>1. Cấu hình Traefik với Docker provider.</w:t>
+      </w:r>
+      <w:r>
+        <w:tab/>
+      </w:r>
+      <w:r>
+        <w:tab/>
+      </w:r>
+      <w:r>
+        <w:tab/>
+      </w:r>
+      <w:r>
+        <w:tab/>
+      </w:r>
+    </w:p>
+    <w:p>
+      <w:r>
+        <w:tab/>
+      </w:r>
+      <w:r>
+        <w:tab/>
+        <w:t>2. Đặt labels cho services để Traefik nhận diện.</w:t>
+      </w:r>
+      <w:r>
+        <w:tab/>
+      </w:r>
+      <w:r>
+        <w:tab/>
+      </w:r>
+      <w:r>
+        <w:tab/>
+      </w:r>
+      <w:r>
+        <w:tab/>
+      </w:r>
+    </w:p>
+    <w:p>
+      <w:r>
+        <w:tab/>
+      </w:r>
+      <w:r>
+        <w:tab/>
+      </w:r>
+      <w:r>
+        <w:tab/>
+      </w:r>
+      <w:r>
+        <w:tab/>
+      </w:r>
+      <w:r>
+        <w:tab/>
+      </w:r>
+      <w:r>
+        <w:tab/>
+      </w:r>
+    </w:p>
+    <w:p>
+      <w:r>
+        <w:tab/>
+        <w:t>Tips khi làm bài tập:</w:t>
+      </w:r>
+      <w:r>
+        <w:tab/>
+      </w:r>
+      <w:r>
+        <w:tab/>
+      </w:r>
+      <w:r>
+        <w:tab/>
+      </w:r>
+      <w:r>
+        <w:tab/>
+      </w:r>
+      <w:r>
+        <w:tab/>
+      </w:r>
+    </w:p>
+    <w:p>
+      <w:r>
+        <w:tab/>
+      </w:r>
+      <w:r>
+        <w:tab/>
+        <w:t>1. Luôn dùng docker-compose down -v để xóa volumes khi test lại.</w:t>
+      </w:r>
+      <w:r>
+        <w:tab/>
+      </w:r>
+      <w:r>
+        <w:tab/>
+      </w:r>
+      <w:r>
+        <w:tab/>
+      </w:r>
+      <w:r>
+        <w:tab/>
+      </w:r>
+    </w:p>
+    <w:p>
+      <w:r>
+        <w:tab/>
+      </w:r>
+      <w:r>
+        <w:tab/>
+        <w:t>2. Kiểm tra log bằng docker-compose logs &lt;service&gt;.</w:t>
+      </w:r>
+      <w:r>
+        <w:tab/>
+      </w:r>
+      <w:r>
+        <w:tab/>
+      </w:r>
+      <w:r>
+        <w:tab/>
+      </w:r>
+      <w:r>
+        <w:tab/>
+      </w:r>
+    </w:p>
+    <w:p>
+      <w:r>
+        <w:tab/>
+      </w:r>
+      <w:r>
+        <w:tab/>
+        <w:t>3. Sử dụng docker-compose config để validate file YAML.</w:t>
+      </w:r>
+      <w:r>
+        <w:tab/>
+      </w:r>
+      <w:r>
+        <w:tab/>
+      </w:r>
+      <w:r>
+        <w:tab/>
+      </w:r>
+      <w:r>
+        <w:tab/>
       </w:r>
       <w:r>
         <w:tab/>
@@ -2610,7 +4515,6 @@
   <w:style w:type="character" w:default="1" w:styleId="DefaultParagraphFont">
     <w:name w:val="Default Paragraph Font"/>
     <w:uiPriority w:val="1"/>
-    <w:semiHidden/>
     <w:unhideWhenUsed/>
   </w:style>
   <w:style w:type="table" w:default="1" w:styleId="TableNormal">

</xml_diff>

<commit_message>
phan 3 bai 2
</commit_message>
<xml_diff>
--- a/Tuan05/Baocao_LamNgocThanhPhu_22650381.docx
+++ b/Tuan05/Baocao_LamNgocThanhPhu_22650381.docx
@@ -2519,10 +2519,42 @@
     </w:p>
     <w:p>
       <w:r>
-        <w:tab/>
-      </w:r>
-      <w:r>
-        <w:tab/>
+        <w:lastRenderedPageBreak/>
+        <w:drawing>
+          <wp:inline distT="0" distB="0" distL="0" distR="0" wp14:anchorId="0C6E4F0C" wp14:editId="2E45C179">
+            <wp:extent cx="5943600" cy="2625090"/>
+            <wp:effectExtent l="0" t="0" r="0" b="3810"/>
+            <wp:docPr id="1607366621" name="Picture 1"/>
+            <wp:cNvGraphicFramePr>
+              <a:graphicFrameLocks xmlns:a="http://schemas.openxmlformats.org/drawingml/2006/main" noChangeAspect="1"/>
+            </wp:cNvGraphicFramePr>
+            <a:graphic xmlns:a="http://schemas.openxmlformats.org/drawingml/2006/main">
+              <a:graphicData uri="http://schemas.openxmlformats.org/drawingml/2006/picture">
+                <pic:pic xmlns:pic="http://schemas.openxmlformats.org/drawingml/2006/picture">
+                  <pic:nvPicPr>
+                    <pic:cNvPr id="1607366621" name=""/>
+                    <pic:cNvPicPr/>
+                  </pic:nvPicPr>
+                  <pic:blipFill>
+                    <a:blip r:embed="rId27"/>
+                    <a:stretch>
+                      <a:fillRect/>
+                    </a:stretch>
+                  </pic:blipFill>
+                  <pic:spPr>
+                    <a:xfrm>
+                      <a:off x="0" y="0"/>
+                      <a:ext cx="5943600" cy="2625090"/>
+                    </a:xfrm>
+                    <a:prstGeom prst="rect">
+                      <a:avLst/>
+                    </a:prstGeom>
+                  </pic:spPr>
+                </pic:pic>
+              </a:graphicData>
+            </a:graphic>
+          </wp:inline>
+        </w:drawing>
       </w:r>
       <w:r>
         <w:tab/>
@@ -2769,113 +2801,301 @@
     </w:p>
     <w:p>
       <w:r>
+        <w:tab/>
+      </w:r>
+      <w:r>
+        <w:tab/>
+        <w:t>1. Service Prometheus (port 9090) với file cấu hình thu thập metrics từ Docker.</w:t>
+      </w:r>
+      <w:r>
+        <w:tab/>
+      </w:r>
+      <w:r>
+        <w:tab/>
+      </w:r>
+      <w:r>
+        <w:tab/>
+      </w:r>
+      <w:r>
+        <w:tab/>
+      </w:r>
+    </w:p>
+    <w:p>
+      <w:r>
+        <w:tab/>
+      </w:r>
+      <w:r>
+        <w:tab/>
+        <w:t>2. Service Grafana (port 3000) kết nối đến Prometheus.</w:t>
+      </w:r>
+      <w:r>
+        <w:tab/>
+      </w:r>
+      <w:r>
+        <w:tab/>
+      </w:r>
+      <w:r>
+        <w:tab/>
+      </w:r>
+      <w:r>
+        <w:tab/>
+      </w:r>
+    </w:p>
+    <w:p>
+      <w:r>
+        <w:tab/>
+      </w:r>
+      <w:r>
+        <w:tab/>
+        <w:t>3. Volume để lưu dữ liệu Prometheus và Grafana.</w:t>
+      </w:r>
+      <w:r>
+        <w:tab/>
+      </w:r>
+      <w:r>
+        <w:tab/>
+      </w:r>
+      <w:r>
+        <w:tab/>
+      </w:r>
+      <w:r>
+        <w:tab/>
+      </w:r>
+    </w:p>
+    <w:p>
+      <w:r>
+        <w:tab/>
+      </w:r>
+      <w:r>
+        <w:tab/>
+      </w:r>
+      <w:r>
+        <w:tab/>
+      </w:r>
+      <w:r>
+        <w:tab/>
+      </w:r>
+      <w:r>
+        <w:tab/>
+      </w:r>
+      <w:r>
+        <w:tab/>
+      </w:r>
+    </w:p>
+    <w:p>
+      <w:r>
+        <w:tab/>
+        <w:t>Bài tập 5: Multi-tier Voting App</w:t>
+      </w:r>
+      <w:r>
+        <w:tab/>
+      </w:r>
+      <w:r>
+        <w:tab/>
+      </w:r>
+      <w:r>
+        <w:tab/>
+      </w:r>
+      <w:r>
+        <w:tab/>
+      </w:r>
+      <w:r>
+        <w:tab/>
+      </w:r>
+    </w:p>
+    <w:p>
+      <w:r>
+        <w:tab/>
+        <w:t>Mục tiêu: Triển khai ứng dụng voting gồm 5 services (Tham khảo từ Docker Docs).</w:t>
+      </w:r>
+      <w:r>
+        <w:tab/>
+      </w:r>
+      <w:r>
+        <w:tab/>
+      </w:r>
+      <w:r>
+        <w:tab/>
+      </w:r>
+      <w:r>
+        <w:tab/>
+      </w:r>
+      <w:r>
+        <w:tab/>
+      </w:r>
+    </w:p>
+    <w:p>
+      <w:r>
+        <w:tab/>
+        <w:t>Yêu cầu:</w:t>
+      </w:r>
+      <w:r>
+        <w:tab/>
+      </w:r>
+      <w:r>
+        <w:tab/>
+      </w:r>
+      <w:r>
+        <w:tab/>
+      </w:r>
+      <w:r>
+        <w:tab/>
+      </w:r>
+      <w:r>
+        <w:tab/>
+      </w:r>
+    </w:p>
+    <w:p>
+      <w:r>
+        <w:tab/>
+      </w:r>
+      <w:r>
+        <w:tab/>
+        <w:t>1. Frontend: vote (Python, port 5000).</w:t>
+      </w:r>
+      <w:r>
+        <w:tab/>
+      </w:r>
+      <w:r>
+        <w:tab/>
+      </w:r>
+      <w:r>
+        <w:tab/>
+      </w:r>
+      <w:r>
+        <w:tab/>
+      </w:r>
+    </w:p>
+    <w:p>
+      <w:r>
+        <w:tab/>
+      </w:r>
+      <w:r>
+        <w:tab/>
+        <w:t>2. Backend: result (Node.js, port 5001).</w:t>
+      </w:r>
+      <w:r>
+        <w:tab/>
+      </w:r>
+      <w:r>
+        <w:tab/>
+      </w:r>
+      <w:r>
+        <w:tab/>
+      </w:r>
+      <w:r>
+        <w:tab/>
+      </w:r>
+    </w:p>
+    <w:p>
+      <w:r>
+        <w:tab/>
+      </w:r>
+      <w:r>
+        <w:tab/>
+        <w:t>3. Redis (lưu tạm vote).</w:t>
+      </w:r>
+      <w:r>
+        <w:tab/>
+      </w:r>
+      <w:r>
+        <w:tab/>
+      </w:r>
+      <w:r>
+        <w:tab/>
+      </w:r>
+      <w:r>
+        <w:tab/>
+      </w:r>
+    </w:p>
+    <w:p>
+      <w:r>
+        <w:tab/>
+      </w:r>
+      <w:r>
+        <w:tab/>
+        <w:t>4. Worker (Java) xử lý vote từ Redis sang DB.</w:t>
+      </w:r>
+      <w:r>
+        <w:tab/>
+      </w:r>
+      <w:r>
+        <w:tab/>
+      </w:r>
+      <w:r>
+        <w:tab/>
+      </w:r>
+      <w:r>
+        <w:tab/>
+      </w:r>
+    </w:p>
+    <w:p>
+      <w:r>
+        <w:tab/>
+      </w:r>
+      <w:r>
+        <w:tab/>
+        <w:t>5. Postgres (lưu kết quả).</w:t>
+      </w:r>
+      <w:r>
+        <w:tab/>
+      </w:r>
+      <w:r>
+        <w:tab/>
+      </w:r>
+      <w:r>
+        <w:tab/>
+      </w:r>
+      <w:r>
+        <w:tab/>
+      </w:r>
+    </w:p>
+    <w:p>
+      <w:r>
+        <w:tab/>
+      </w:r>
+      <w:r>
+        <w:tab/>
+      </w:r>
+      <w:r>
+        <w:tab/>
+      </w:r>
+      <w:r>
+        <w:tab/>
+      </w:r>
+      <w:r>
+        <w:tab/>
+      </w:r>
+      <w:r>
+        <w:tab/>
+      </w:r>
+    </w:p>
+    <w:p>
+      <w:r>
+        <w:tab/>
+        <w:t>Bài tập 6: CI/CD Pipeline với Docker Compose</w:t>
+      </w:r>
+      <w:r>
+        <w:tab/>
+      </w:r>
+      <w:r>
+        <w:tab/>
+      </w:r>
+      <w:r>
+        <w:tab/>
+      </w:r>
+      <w:r>
+        <w:tab/>
+      </w:r>
+      <w:r>
+        <w:tab/>
+      </w:r>
+    </w:p>
+    <w:p>
+      <w:r>
         <w:lastRenderedPageBreak/>
         <w:tab/>
-      </w:r>
-      <w:r>
-        <w:tab/>
-        <w:t>1. Service Prometheus (port 9090) với file cấu hình thu thập metrics từ Docker.</w:t>
-      </w:r>
-      <w:r>
-        <w:tab/>
-      </w:r>
-      <w:r>
-        <w:tab/>
-      </w:r>
-      <w:r>
-        <w:tab/>
-      </w:r>
-      <w:r>
-        <w:tab/>
-      </w:r>
-    </w:p>
-    <w:p>
-      <w:r>
-        <w:tab/>
-      </w:r>
-      <w:r>
-        <w:tab/>
-        <w:t>2. Service Grafana (port 3000) kết nối đến Prometheus.</w:t>
-      </w:r>
-      <w:r>
-        <w:tab/>
-      </w:r>
-      <w:r>
-        <w:tab/>
-      </w:r>
-      <w:r>
-        <w:tab/>
-      </w:r>
-      <w:r>
-        <w:tab/>
-      </w:r>
-    </w:p>
-    <w:p>
-      <w:r>
-        <w:tab/>
-      </w:r>
-      <w:r>
-        <w:tab/>
-        <w:t>3. Volume để lưu dữ liệu Prometheus và Grafana.</w:t>
-      </w:r>
-      <w:r>
-        <w:tab/>
-      </w:r>
-      <w:r>
-        <w:tab/>
-      </w:r>
-      <w:r>
-        <w:tab/>
-      </w:r>
-      <w:r>
-        <w:tab/>
-      </w:r>
-    </w:p>
-    <w:p>
-      <w:r>
-        <w:tab/>
-      </w:r>
-      <w:r>
-        <w:tab/>
-      </w:r>
-      <w:r>
-        <w:tab/>
-      </w:r>
-      <w:r>
-        <w:tab/>
-      </w:r>
-      <w:r>
-        <w:tab/>
-      </w:r>
-      <w:r>
-        <w:tab/>
-      </w:r>
-    </w:p>
-    <w:p>
-      <w:r>
-        <w:tab/>
-        <w:t>Bài tập 5: Multi-tier Voting App</w:t>
-      </w:r>
-      <w:r>
-        <w:tab/>
-      </w:r>
-      <w:r>
-        <w:tab/>
-      </w:r>
-      <w:r>
-        <w:tab/>
-      </w:r>
-      <w:r>
-        <w:tab/>
-      </w:r>
-      <w:r>
-        <w:tab/>
-      </w:r>
-    </w:p>
-    <w:p>
-      <w:r>
-        <w:tab/>
-        <w:t>Mục tiêu: Triển khai ứng dụng voting gồm 5 services (Tham khảo từ Docker Docs).</w:t>
+        <w:t>Mục tiêu: Mô phỏng pipeline dev/test bằng Docker Compose.</w:t>
       </w:r>
       <w:r>
         <w:tab/>
@@ -2920,150 +3140,171 @@
       </w:r>
       <w:r>
         <w:tab/>
-        <w:t>1. Frontend: vote (Python, port 5000).</w:t>
-      </w:r>
-      <w:r>
-        <w:tab/>
-      </w:r>
-      <w:r>
-        <w:tab/>
-      </w:r>
-      <w:r>
-        <w:tab/>
-      </w:r>
-      <w:r>
-        <w:tab/>
-      </w:r>
-    </w:p>
-    <w:p>
-      <w:r>
-        <w:tab/>
-      </w:r>
-      <w:r>
-        <w:tab/>
-        <w:t>2. Backend: result (Node.js, port 5001).</w:t>
-      </w:r>
-      <w:r>
-        <w:tab/>
-      </w:r>
-      <w:r>
-        <w:tab/>
-      </w:r>
-      <w:r>
-        <w:tab/>
-      </w:r>
-      <w:r>
-        <w:tab/>
-      </w:r>
-    </w:p>
-    <w:p>
-      <w:r>
-        <w:tab/>
-      </w:r>
-      <w:r>
-        <w:tab/>
-        <w:t>3. Redis (lưu tạm vote).</w:t>
-      </w:r>
-      <w:r>
-        <w:tab/>
-      </w:r>
-      <w:r>
-        <w:tab/>
-      </w:r>
-      <w:r>
-        <w:tab/>
-      </w:r>
-      <w:r>
-        <w:tab/>
-      </w:r>
-    </w:p>
-    <w:p>
-      <w:r>
-        <w:tab/>
-      </w:r>
-      <w:r>
-        <w:tab/>
-        <w:t>4. Worker (Java) xử lý vote từ Redis sang DB.</w:t>
-      </w:r>
-      <w:r>
-        <w:tab/>
-      </w:r>
-      <w:r>
-        <w:tab/>
-      </w:r>
-      <w:r>
-        <w:tab/>
-      </w:r>
-      <w:r>
-        <w:tab/>
-      </w:r>
-    </w:p>
-    <w:p>
-      <w:r>
-        <w:tab/>
-      </w:r>
-      <w:r>
-        <w:tab/>
-        <w:t>5. Postgres (lưu kết quả).</w:t>
-      </w:r>
-      <w:r>
-        <w:tab/>
-      </w:r>
-      <w:r>
-        <w:tab/>
-      </w:r>
-      <w:r>
-        <w:tab/>
-      </w:r>
-      <w:r>
-        <w:tab/>
-      </w:r>
-    </w:p>
-    <w:p>
-      <w:r>
-        <w:tab/>
-      </w:r>
-      <w:r>
-        <w:tab/>
-      </w:r>
-      <w:r>
-        <w:tab/>
-      </w:r>
-      <w:r>
-        <w:tab/>
-      </w:r>
-      <w:r>
-        <w:tab/>
-      </w:r>
-      <w:r>
-        <w:tab/>
-      </w:r>
-    </w:p>
-    <w:p>
-      <w:r>
-        <w:tab/>
-        <w:t>Bài tập 6: CI/CD Pipeline với Docker Compose</w:t>
-      </w:r>
-      <w:r>
-        <w:tab/>
-      </w:r>
-      <w:r>
-        <w:tab/>
-      </w:r>
-      <w:r>
-        <w:tab/>
-      </w:r>
-      <w:r>
-        <w:tab/>
-      </w:r>
-      <w:r>
-        <w:tab/>
-      </w:r>
-    </w:p>
-    <w:p>
-      <w:r>
-        <w:tab/>
-        <w:t>Mục tiêu: Mô phỏng pipeline dev/test bằng Docker Compose.</w:t>
+        <w:t>1. Service app (Python/Node.js) với code được mount từ host (development mode).</w:t>
+      </w:r>
+      <w:r>
+        <w:tab/>
+      </w:r>
+      <w:r>
+        <w:tab/>
+      </w:r>
+      <w:r>
+        <w:tab/>
+      </w:r>
+      <w:r>
+        <w:tab/>
+      </w:r>
+    </w:p>
+    <w:p>
+      <w:r>
+        <w:tab/>
+      </w:r>
+      <w:r>
+        <w:tab/>
+        <w:t>2. Service tests chạy unit tests khi code thay đổi (sử dụng volumes + entrypoint).</w:t>
+      </w:r>
+      <w:r>
+        <w:tab/>
+      </w:r>
+      <w:r>
+        <w:tab/>
+      </w:r>
+      <w:r>
+        <w:tab/>
+      </w:r>
+      <w:r>
+        <w:tab/>
+      </w:r>
+    </w:p>
+    <w:p>
+      <w:r>
+        <w:tab/>
+      </w:r>
+      <w:r>
+        <w:tab/>
+        <w:t>3. Service nginx (production mode) dùng image build sẵn từ app.</w:t>
+      </w:r>
+      <w:r>
+        <w:tab/>
+      </w:r>
+      <w:r>
+        <w:tab/>
+      </w:r>
+      <w:r>
+        <w:tab/>
+      </w:r>
+      <w:r>
+        <w:tab/>
+      </w:r>
+    </w:p>
+    <w:p>
+      <w:r>
+        <w:tab/>
+        <w:t>Gợi ý:</w:t>
+      </w:r>
+      <w:r>
+        <w:tab/>
+      </w:r>
+      <w:r>
+        <w:tab/>
+      </w:r>
+      <w:r>
+        <w:tab/>
+      </w:r>
+      <w:r>
+        <w:tab/>
+      </w:r>
+      <w:r>
+        <w:tab/>
+      </w:r>
+    </w:p>
+    <w:p>
+      <w:r>
+        <w:tab/>
+      </w:r>
+      <w:r>
+        <w:tab/>
+        <w:t>1. Dùng 2 file compose khác nhau (docker-compose-dev.yml và docker-compose-prod.yml).</w:t>
+      </w:r>
+      <w:r>
+        <w:tab/>
+      </w:r>
+      <w:r>
+        <w:tab/>
+      </w:r>
+      <w:r>
+        <w:tab/>
+      </w:r>
+      <w:r>
+        <w:tab/>
+      </w:r>
+    </w:p>
+    <w:p>
+      <w:r>
+        <w:tab/>
+      </w:r>
+      <w:r>
+        <w:tab/>
+        <w:t>2. Sử dụng docker-compose -f &lt;file&gt; up để chọn môi trường.</w:t>
+      </w:r>
+      <w:r>
+        <w:tab/>
+      </w:r>
+      <w:r>
+        <w:tab/>
+      </w:r>
+      <w:r>
+        <w:tab/>
+      </w:r>
+      <w:r>
+        <w:tab/>
+      </w:r>
+    </w:p>
+    <w:p>
+      <w:r>
+        <w:tab/>
+      </w:r>
+      <w:r>
+        <w:tab/>
+      </w:r>
+      <w:r>
+        <w:tab/>
+      </w:r>
+      <w:r>
+        <w:tab/>
+      </w:r>
+      <w:r>
+        <w:tab/>
+      </w:r>
+      <w:r>
+        <w:tab/>
+      </w:r>
+    </w:p>
+    <w:p>
+      <w:r>
+        <w:tab/>
+        <w:t>Bài tập 7: Elasticsearch + Kibana</w:t>
+      </w:r>
+      <w:r>
+        <w:tab/>
+      </w:r>
+      <w:r>
+        <w:tab/>
+      </w:r>
+      <w:r>
+        <w:tab/>
+      </w:r>
+      <w:r>
+        <w:tab/>
+      </w:r>
+      <w:r>
+        <w:tab/>
+      </w:r>
+    </w:p>
+    <w:p>
+      <w:r>
+        <w:tab/>
+        <w:t>Mục tiêu: Triển khai ELK stack đơn giản.</w:t>
       </w:r>
       <w:r>
         <w:tab/>
@@ -3108,171 +3349,108 @@
       </w:r>
       <w:r>
         <w:tab/>
-        <w:t>1. Service app (Python/Node.js) với code được mount từ host (development mode).</w:t>
-      </w:r>
-      <w:r>
-        <w:tab/>
-      </w:r>
-      <w:r>
-        <w:tab/>
-      </w:r>
-      <w:r>
-        <w:tab/>
-      </w:r>
-      <w:r>
-        <w:tab/>
-      </w:r>
-    </w:p>
-    <w:p>
-      <w:r>
-        <w:tab/>
-      </w:r>
-      <w:r>
-        <w:tab/>
-        <w:t>2. Service tests chạy unit tests khi code thay đổi (sử dụng volumes + entrypoint).</w:t>
-      </w:r>
-      <w:r>
-        <w:tab/>
-      </w:r>
-      <w:r>
-        <w:tab/>
-      </w:r>
-      <w:r>
-        <w:tab/>
-      </w:r>
-      <w:r>
-        <w:tab/>
-      </w:r>
-    </w:p>
-    <w:p>
-      <w:r>
-        <w:tab/>
-      </w:r>
-      <w:r>
-        <w:tab/>
-        <w:t>3. Service nginx (production mode) dùng image build sẵn từ app.</w:t>
-      </w:r>
-      <w:r>
-        <w:tab/>
-      </w:r>
-      <w:r>
-        <w:tab/>
-      </w:r>
-      <w:r>
-        <w:tab/>
-      </w:r>
-      <w:r>
-        <w:tab/>
-      </w:r>
-    </w:p>
-    <w:p>
-      <w:r>
-        <w:tab/>
-        <w:t>Gợi ý:</w:t>
-      </w:r>
-      <w:r>
-        <w:tab/>
-      </w:r>
-      <w:r>
-        <w:tab/>
-      </w:r>
-      <w:r>
-        <w:tab/>
-      </w:r>
-      <w:r>
-        <w:tab/>
-      </w:r>
-      <w:r>
-        <w:tab/>
-      </w:r>
-    </w:p>
-    <w:p>
-      <w:r>
-        <w:tab/>
-      </w:r>
-      <w:r>
-        <w:tab/>
-        <w:t>1. Dùng 2 file compose khác nhau (docker-compose-dev.yml và docker-compose-prod.yml).</w:t>
-      </w:r>
-      <w:r>
-        <w:tab/>
-      </w:r>
-      <w:r>
-        <w:tab/>
-      </w:r>
-      <w:r>
-        <w:tab/>
-      </w:r>
-      <w:r>
-        <w:tab/>
-      </w:r>
-    </w:p>
-    <w:p>
-      <w:r>
-        <w:tab/>
-      </w:r>
-      <w:r>
-        <w:tab/>
-        <w:t>2. Sử dụng docker-compose -f &lt;file&gt; up để chọn môi trường.</w:t>
-      </w:r>
-      <w:r>
-        <w:tab/>
-      </w:r>
-      <w:r>
-        <w:tab/>
-      </w:r>
-      <w:r>
-        <w:tab/>
-      </w:r>
-      <w:r>
-        <w:tab/>
-      </w:r>
-    </w:p>
-    <w:p>
-      <w:r>
-        <w:tab/>
-      </w:r>
-      <w:r>
-        <w:tab/>
-      </w:r>
-      <w:r>
-        <w:tab/>
-      </w:r>
-      <w:r>
-        <w:tab/>
-      </w:r>
-      <w:r>
-        <w:tab/>
-      </w:r>
-      <w:r>
-        <w:tab/>
-      </w:r>
-    </w:p>
-    <w:p>
-      <w:r>
-        <w:tab/>
-        <w:t>Bài tập 7: Elasticsearch + Kibana</w:t>
-      </w:r>
-      <w:r>
-        <w:tab/>
-      </w:r>
-      <w:r>
-        <w:tab/>
-      </w:r>
-      <w:r>
-        <w:tab/>
-      </w:r>
-      <w:r>
-        <w:tab/>
-      </w:r>
-      <w:r>
-        <w:tab/>
-      </w:r>
-    </w:p>
-    <w:p>
-      <w:r>
-        <w:tab/>
-        <w:t>Mục tiêu: Triển khai ELK stack đơn giản.</w:t>
+        <w:t>1. Service Elasticsearch (port 9200) với volume.</w:t>
+      </w:r>
+      <w:r>
+        <w:tab/>
+      </w:r>
+      <w:r>
+        <w:tab/>
+      </w:r>
+      <w:r>
+        <w:tab/>
+      </w:r>
+      <w:r>
+        <w:tab/>
+      </w:r>
+    </w:p>
+    <w:p>
+      <w:r>
+        <w:tab/>
+      </w:r>
+      <w:r>
+        <w:tab/>
+        <w:t>2. Service Kibana (port 5601) kết nối với Elasticsearch.</w:t>
+      </w:r>
+      <w:r>
+        <w:tab/>
+      </w:r>
+      <w:r>
+        <w:tab/>
+      </w:r>
+      <w:r>
+        <w:tab/>
+      </w:r>
+      <w:r>
+        <w:tab/>
+      </w:r>
+    </w:p>
+    <w:p>
+      <w:r>
+        <w:tab/>
+      </w:r>
+      <w:r>
+        <w:tab/>
+        <w:t>3. Thiết lập environment variables cho credentials.</w:t>
+      </w:r>
+      <w:r>
+        <w:tab/>
+      </w:r>
+      <w:r>
+        <w:tab/>
+      </w:r>
+      <w:r>
+        <w:tab/>
+      </w:r>
+      <w:r>
+        <w:tab/>
+      </w:r>
+    </w:p>
+    <w:p>
+      <w:r>
+        <w:tab/>
+      </w:r>
+      <w:r>
+        <w:tab/>
+      </w:r>
+      <w:r>
+        <w:tab/>
+      </w:r>
+      <w:r>
+        <w:tab/>
+      </w:r>
+      <w:r>
+        <w:tab/>
+      </w:r>
+      <w:r>
+        <w:tab/>
+      </w:r>
+    </w:p>
+    <w:p>
+      <w:r>
+        <w:tab/>
+        <w:t>Bài tập 8: Django + Celery + Redis</w:t>
+      </w:r>
+      <w:r>
+        <w:tab/>
+      </w:r>
+      <w:r>
+        <w:tab/>
+      </w:r>
+      <w:r>
+        <w:tab/>
+      </w:r>
+      <w:r>
+        <w:tab/>
+      </w:r>
+      <w:r>
+        <w:tab/>
+      </w:r>
+    </w:p>
+    <w:p>
+      <w:r>
+        <w:tab/>
+        <w:t>Mục tiêu: Triển khai Django với Celery worker và Redis làm message broker.</w:t>
       </w:r>
       <w:r>
         <w:tab/>
@@ -3317,108 +3495,108 @@
       </w:r>
       <w:r>
         <w:tab/>
-        <w:t>1. Service Elasticsearch (port 9200) với volume.</w:t>
-      </w:r>
-      <w:r>
-        <w:tab/>
-      </w:r>
-      <w:r>
-        <w:tab/>
-      </w:r>
-      <w:r>
-        <w:tab/>
-      </w:r>
-      <w:r>
-        <w:tab/>
-      </w:r>
-    </w:p>
-    <w:p>
-      <w:r>
-        <w:tab/>
-      </w:r>
-      <w:r>
-        <w:tab/>
-        <w:t>2. Service Kibana (port 5601) kết nối với Elasticsearch.</w:t>
-      </w:r>
-      <w:r>
-        <w:tab/>
-      </w:r>
-      <w:r>
-        <w:tab/>
-      </w:r>
-      <w:r>
-        <w:tab/>
-      </w:r>
-      <w:r>
-        <w:tab/>
-      </w:r>
-    </w:p>
-    <w:p>
-      <w:r>
-        <w:tab/>
-      </w:r>
-      <w:r>
-        <w:tab/>
-        <w:t>3. Thiết lập environment variables cho credentials.</w:t>
-      </w:r>
-      <w:r>
-        <w:tab/>
-      </w:r>
-      <w:r>
-        <w:tab/>
-      </w:r>
-      <w:r>
-        <w:tab/>
-      </w:r>
-      <w:r>
-        <w:tab/>
-      </w:r>
-    </w:p>
-    <w:p>
-      <w:r>
-        <w:tab/>
-      </w:r>
-      <w:r>
-        <w:tab/>
-      </w:r>
-      <w:r>
-        <w:tab/>
-      </w:r>
-      <w:r>
-        <w:tab/>
-      </w:r>
-      <w:r>
-        <w:tab/>
-      </w:r>
-      <w:r>
-        <w:tab/>
-      </w:r>
-    </w:p>
-    <w:p>
-      <w:r>
-        <w:tab/>
-        <w:t>Bài tập 8: Django + Celery + Redis</w:t>
-      </w:r>
-      <w:r>
-        <w:tab/>
-      </w:r>
-      <w:r>
-        <w:tab/>
-      </w:r>
-      <w:r>
-        <w:tab/>
-      </w:r>
-      <w:r>
-        <w:tab/>
-      </w:r>
-      <w:r>
-        <w:tab/>
-      </w:r>
-    </w:p>
-    <w:p>
-      <w:r>
-        <w:tab/>
-        <w:t>Mục tiêu: Triển khai Django với Celery worker và Redis làm message broker.</w:t>
+        <w:t>1. Django app (port 8000).</w:t>
+      </w:r>
+      <w:r>
+        <w:tab/>
+      </w:r>
+      <w:r>
+        <w:tab/>
+      </w:r>
+      <w:r>
+        <w:tab/>
+      </w:r>
+      <w:r>
+        <w:tab/>
+      </w:r>
+    </w:p>
+    <w:p>
+      <w:r>
+        <w:tab/>
+      </w:r>
+      <w:r>
+        <w:tab/>
+        <w:t>2. Celery worker chạy song song.</w:t>
+      </w:r>
+      <w:r>
+        <w:tab/>
+      </w:r>
+      <w:r>
+        <w:tab/>
+      </w:r>
+      <w:r>
+        <w:tab/>
+      </w:r>
+      <w:r>
+        <w:tab/>
+      </w:r>
+    </w:p>
+    <w:p>
+      <w:r>
+        <w:tab/>
+      </w:r>
+      <w:r>
+        <w:tab/>
+        <w:t>3. Redis service cho task queue.</w:t>
+      </w:r>
+      <w:r>
+        <w:tab/>
+      </w:r>
+      <w:r>
+        <w:tab/>
+      </w:r>
+      <w:r>
+        <w:tab/>
+      </w:r>
+      <w:r>
+        <w:tab/>
+      </w:r>
+    </w:p>
+    <w:p>
+      <w:r>
+        <w:tab/>
+      </w:r>
+      <w:r>
+        <w:tab/>
+      </w:r>
+      <w:r>
+        <w:tab/>
+      </w:r>
+      <w:r>
+        <w:tab/>
+      </w:r>
+      <w:r>
+        <w:tab/>
+      </w:r>
+      <w:r>
+        <w:tab/>
+      </w:r>
+    </w:p>
+    <w:p>
+      <w:r>
+        <w:tab/>
+        <w:t>Bài tập 9: Nextcloud với MariaDB + Redis Caching</w:t>
+      </w:r>
+      <w:r>
+        <w:tab/>
+      </w:r>
+      <w:r>
+        <w:tab/>
+      </w:r>
+      <w:r>
+        <w:tab/>
+      </w:r>
+      <w:r>
+        <w:tab/>
+      </w:r>
+      <w:r>
+        <w:tab/>
+      </w:r>
+    </w:p>
+    <w:p>
+      <w:r>
+        <w:tab/>
+        <w:t>Mục tiêu: Triển khai Nextcloud (self-hosted cloud) với MariaDB và Redis.</w:t>
       </w:r>
       <w:r>
         <w:tab/>
@@ -3463,66 +3641,212 @@
       </w:r>
       <w:r>
         <w:tab/>
-        <w:t>1. Django app (port 8000).</w:t>
-      </w:r>
-      <w:r>
-        <w:tab/>
-      </w:r>
-      <w:r>
-        <w:tab/>
-      </w:r>
-      <w:r>
-        <w:tab/>
-      </w:r>
-      <w:r>
-        <w:tab/>
-      </w:r>
-    </w:p>
-    <w:p>
-      <w:r>
-        <w:tab/>
-      </w:r>
-      <w:r>
-        <w:tab/>
-        <w:t>2. Celery worker chạy song song.</w:t>
-      </w:r>
-      <w:r>
-        <w:tab/>
-      </w:r>
-      <w:r>
-        <w:tab/>
-      </w:r>
-      <w:r>
-        <w:tab/>
-      </w:r>
-      <w:r>
-        <w:tab/>
-      </w:r>
-    </w:p>
-    <w:p>
-      <w:r>
-        <w:tab/>
-      </w:r>
-      <w:r>
-        <w:tab/>
-        <w:t>3. Redis service cho task queue.</w:t>
-      </w:r>
-      <w:r>
-        <w:tab/>
-      </w:r>
-      <w:r>
-        <w:tab/>
-      </w:r>
-      <w:r>
-        <w:tab/>
-      </w:r>
-      <w:r>
-        <w:tab/>
-      </w:r>
-    </w:p>
-    <w:p>
-      <w:r>
-        <w:tab/>
+        <w:t>1. Nextcloud (port 80).</w:t>
+      </w:r>
+      <w:r>
+        <w:tab/>
+      </w:r>
+      <w:r>
+        <w:tab/>
+      </w:r>
+      <w:r>
+        <w:tab/>
+      </w:r>
+      <w:r>
+        <w:tab/>
+      </w:r>
+    </w:p>
+    <w:p>
+      <w:r>
+        <w:tab/>
+      </w:r>
+      <w:r>
+        <w:tab/>
+        <w:t>2. MariaDB (volume cho dữ liệu).</w:t>
+      </w:r>
+      <w:r>
+        <w:tab/>
+      </w:r>
+      <w:r>
+        <w:tab/>
+      </w:r>
+      <w:r>
+        <w:tab/>
+      </w:r>
+      <w:r>
+        <w:tab/>
+      </w:r>
+    </w:p>
+    <w:p>
+      <w:r>
+        <w:tab/>
+      </w:r>
+      <w:r>
+        <w:tab/>
+        <w:t>3. Redis cache.</w:t>
+      </w:r>
+      <w:r>
+        <w:tab/>
+      </w:r>
+      <w:r>
+        <w:tab/>
+      </w:r>
+      <w:r>
+        <w:tab/>
+      </w:r>
+      <w:r>
+        <w:tab/>
+      </w:r>
+    </w:p>
+    <w:p>
+      <w:r>
+        <w:tab/>
+      </w:r>
+      <w:r>
+        <w:tab/>
+      </w:r>
+      <w:r>
+        <w:tab/>
+      </w:r>
+      <w:r>
+        <w:tab/>
+      </w:r>
+      <w:r>
+        <w:tab/>
+      </w:r>
+      <w:r>
+        <w:tab/>
+      </w:r>
+    </w:p>
+    <w:p>
+      <w:r>
+        <w:tab/>
+        <w:t>Bài tập 10: Traefik as Reverse Proxy</w:t>
+      </w:r>
+      <w:r>
+        <w:tab/>
+      </w:r>
+      <w:r>
+        <w:tab/>
+      </w:r>
+      <w:r>
+        <w:tab/>
+      </w:r>
+      <w:r>
+        <w:tab/>
+      </w:r>
+      <w:r>
+        <w:tab/>
+      </w:r>
+    </w:p>
+    <w:p>
+      <w:r>
+        <w:tab/>
+        <w:t>Mục tiêu: Dùng Traefik để định tuyến request đến các service (Flask, WordPress, etc.).</w:t>
+      </w:r>
+      <w:r>
+        <w:tab/>
+      </w:r>
+      <w:r>
+        <w:tab/>
+      </w:r>
+      <w:r>
+        <w:tab/>
+      </w:r>
+      <w:r>
+        <w:tab/>
+      </w:r>
+      <w:r>
+        <w:tab/>
+      </w:r>
+    </w:p>
+    <w:p>
+      <w:r>
+        <w:tab/>
+        <w:t>Yêu cầu:</w:t>
+      </w:r>
+      <w:r>
+        <w:tab/>
+      </w:r>
+      <w:r>
+        <w:tab/>
+      </w:r>
+      <w:r>
+        <w:tab/>
+      </w:r>
+      <w:r>
+        <w:tab/>
+      </w:r>
+      <w:r>
+        <w:tab/>
+      </w:r>
+    </w:p>
+    <w:p>
+      <w:r>
+        <w:tab/>
+      </w:r>
+      <w:r>
+        <w:tab/>
+        <w:t>1. Cấu hình Traefik với Docker provider.</w:t>
+      </w:r>
+      <w:r>
+        <w:tab/>
+      </w:r>
+      <w:r>
+        <w:tab/>
+      </w:r>
+      <w:r>
+        <w:tab/>
+      </w:r>
+      <w:r>
+        <w:tab/>
+      </w:r>
+    </w:p>
+    <w:p>
+      <w:r>
+        <w:tab/>
+      </w:r>
+      <w:r>
+        <w:tab/>
+        <w:t>2. Đặt labels cho services để Traefik nhận diện.</w:t>
+      </w:r>
+      <w:r>
+        <w:tab/>
+      </w:r>
+      <w:r>
+        <w:tab/>
+      </w:r>
+      <w:r>
+        <w:tab/>
+      </w:r>
+      <w:r>
+        <w:tab/>
+      </w:r>
+    </w:p>
+    <w:p>
+      <w:r>
+        <w:tab/>
+      </w:r>
+      <w:r>
+        <w:tab/>
+      </w:r>
+      <w:r>
+        <w:tab/>
+      </w:r>
+      <w:r>
+        <w:tab/>
+      </w:r>
+      <w:r>
+        <w:tab/>
+      </w:r>
+      <w:r>
+        <w:tab/>
+      </w:r>
+    </w:p>
+    <w:p>
+      <w:r>
+        <w:tab/>
+        <w:t>Tips khi làm bài tập:</w:t>
       </w:r>
       <w:r>
         <w:tab/>
@@ -3543,298 +3867,6 @@
     <w:p>
       <w:r>
         <w:lastRenderedPageBreak/>
-        <w:tab/>
-        <w:t>Bài tập 9: Nextcloud với MariaDB + Redis Caching</w:t>
-      </w:r>
-      <w:r>
-        <w:tab/>
-      </w:r>
-      <w:r>
-        <w:tab/>
-      </w:r>
-      <w:r>
-        <w:tab/>
-      </w:r>
-      <w:r>
-        <w:tab/>
-      </w:r>
-      <w:r>
-        <w:tab/>
-      </w:r>
-    </w:p>
-    <w:p>
-      <w:r>
-        <w:tab/>
-        <w:t>Mục tiêu: Triển khai Nextcloud (self-hosted cloud) với MariaDB và Redis.</w:t>
-      </w:r>
-      <w:r>
-        <w:tab/>
-      </w:r>
-      <w:r>
-        <w:tab/>
-      </w:r>
-      <w:r>
-        <w:tab/>
-      </w:r>
-      <w:r>
-        <w:tab/>
-      </w:r>
-      <w:r>
-        <w:tab/>
-      </w:r>
-    </w:p>
-    <w:p>
-      <w:r>
-        <w:tab/>
-        <w:t>Yêu cầu:</w:t>
-      </w:r>
-      <w:r>
-        <w:tab/>
-      </w:r>
-      <w:r>
-        <w:tab/>
-      </w:r>
-      <w:r>
-        <w:tab/>
-      </w:r>
-      <w:r>
-        <w:tab/>
-      </w:r>
-      <w:r>
-        <w:tab/>
-      </w:r>
-    </w:p>
-    <w:p>
-      <w:r>
-        <w:tab/>
-      </w:r>
-      <w:r>
-        <w:tab/>
-        <w:t>1. Nextcloud (port 80).</w:t>
-      </w:r>
-      <w:r>
-        <w:tab/>
-      </w:r>
-      <w:r>
-        <w:tab/>
-      </w:r>
-      <w:r>
-        <w:tab/>
-      </w:r>
-      <w:r>
-        <w:tab/>
-      </w:r>
-    </w:p>
-    <w:p>
-      <w:r>
-        <w:tab/>
-      </w:r>
-      <w:r>
-        <w:tab/>
-        <w:t>2. MariaDB (volume cho dữ liệu).</w:t>
-      </w:r>
-      <w:r>
-        <w:tab/>
-      </w:r>
-      <w:r>
-        <w:tab/>
-      </w:r>
-      <w:r>
-        <w:tab/>
-      </w:r>
-      <w:r>
-        <w:tab/>
-      </w:r>
-    </w:p>
-    <w:p>
-      <w:r>
-        <w:tab/>
-      </w:r>
-      <w:r>
-        <w:tab/>
-        <w:t>3. Redis cache.</w:t>
-      </w:r>
-      <w:r>
-        <w:tab/>
-      </w:r>
-      <w:r>
-        <w:tab/>
-      </w:r>
-      <w:r>
-        <w:tab/>
-      </w:r>
-      <w:r>
-        <w:tab/>
-      </w:r>
-    </w:p>
-    <w:p>
-      <w:r>
-        <w:tab/>
-      </w:r>
-      <w:r>
-        <w:tab/>
-      </w:r>
-      <w:r>
-        <w:tab/>
-      </w:r>
-      <w:r>
-        <w:tab/>
-      </w:r>
-      <w:r>
-        <w:tab/>
-      </w:r>
-      <w:r>
-        <w:tab/>
-      </w:r>
-    </w:p>
-    <w:p>
-      <w:r>
-        <w:tab/>
-        <w:t>Bài tập 10: Traefik as Reverse Proxy</w:t>
-      </w:r>
-      <w:r>
-        <w:tab/>
-      </w:r>
-      <w:r>
-        <w:tab/>
-      </w:r>
-      <w:r>
-        <w:tab/>
-      </w:r>
-      <w:r>
-        <w:tab/>
-      </w:r>
-      <w:r>
-        <w:tab/>
-      </w:r>
-    </w:p>
-    <w:p>
-      <w:r>
-        <w:tab/>
-        <w:t>Mục tiêu: Dùng Traefik để định tuyến request đến các service (Flask, WordPress, etc.).</w:t>
-      </w:r>
-      <w:r>
-        <w:tab/>
-      </w:r>
-      <w:r>
-        <w:tab/>
-      </w:r>
-      <w:r>
-        <w:tab/>
-      </w:r>
-      <w:r>
-        <w:tab/>
-      </w:r>
-      <w:r>
-        <w:tab/>
-      </w:r>
-    </w:p>
-    <w:p>
-      <w:r>
-        <w:tab/>
-        <w:t>Yêu cầu:</w:t>
-      </w:r>
-      <w:r>
-        <w:tab/>
-      </w:r>
-      <w:r>
-        <w:tab/>
-      </w:r>
-      <w:r>
-        <w:tab/>
-      </w:r>
-      <w:r>
-        <w:tab/>
-      </w:r>
-      <w:r>
-        <w:tab/>
-      </w:r>
-    </w:p>
-    <w:p>
-      <w:r>
-        <w:tab/>
-      </w:r>
-      <w:r>
-        <w:tab/>
-        <w:t>1. Cấu hình Traefik với Docker provider.</w:t>
-      </w:r>
-      <w:r>
-        <w:tab/>
-      </w:r>
-      <w:r>
-        <w:tab/>
-      </w:r>
-      <w:r>
-        <w:tab/>
-      </w:r>
-      <w:r>
-        <w:tab/>
-      </w:r>
-    </w:p>
-    <w:p>
-      <w:r>
-        <w:tab/>
-      </w:r>
-      <w:r>
-        <w:tab/>
-        <w:t>2. Đặt labels cho services để Traefik nhận diện.</w:t>
-      </w:r>
-      <w:r>
-        <w:tab/>
-      </w:r>
-      <w:r>
-        <w:tab/>
-      </w:r>
-      <w:r>
-        <w:tab/>
-      </w:r>
-      <w:r>
-        <w:tab/>
-      </w:r>
-    </w:p>
-    <w:p>
-      <w:r>
-        <w:tab/>
-      </w:r>
-      <w:r>
-        <w:tab/>
-      </w:r>
-      <w:r>
-        <w:tab/>
-      </w:r>
-      <w:r>
-        <w:tab/>
-      </w:r>
-      <w:r>
-        <w:tab/>
-      </w:r>
-      <w:r>
-        <w:tab/>
-      </w:r>
-    </w:p>
-    <w:p>
-      <w:r>
-        <w:tab/>
-        <w:t>Tips khi làm bài tập:</w:t>
-      </w:r>
-      <w:r>
-        <w:tab/>
-      </w:r>
-      <w:r>
-        <w:tab/>
-      </w:r>
-      <w:r>
-        <w:tab/>
-      </w:r>
-      <w:r>
-        <w:tab/>
-      </w:r>
-      <w:r>
-        <w:tab/>
-      </w:r>
-    </w:p>
-    <w:p>
-      <w:r>
         <w:tab/>
       </w:r>
       <w:r>

</xml_diff>

<commit_message>
phan 3 bai 4
</commit_message>
<xml_diff>
--- a/Tuan05/Baocao_LamNgocThanhPhu_22650381.docx
+++ b/Tuan05/Baocao_LamNgocThanhPhu_22650381.docx
@@ -2521,10 +2521,10 @@
       <w:r>
         <w:lastRenderedPageBreak/>
         <w:drawing>
-          <wp:inline distT="0" distB="0" distL="0" distR="0" wp14:anchorId="0C6E4F0C" wp14:editId="2E45C179">
-            <wp:extent cx="5943600" cy="2625090"/>
-            <wp:effectExtent l="0" t="0" r="0" b="3810"/>
-            <wp:docPr id="1607366621" name="Picture 1"/>
+          <wp:inline distT="0" distB="0" distL="0" distR="0" wp14:anchorId="1016D9E3" wp14:editId="14C5B82B">
+            <wp:extent cx="5943600" cy="2226945"/>
+            <wp:effectExtent l="0" t="0" r="0" b="1905"/>
+            <wp:docPr id="514460702" name="Picture 1"/>
             <wp:cNvGraphicFramePr>
               <a:graphicFrameLocks xmlns:a="http://schemas.openxmlformats.org/drawingml/2006/main" noChangeAspect="1"/>
             </wp:cNvGraphicFramePr>
@@ -2532,7 +2532,7 @@
               <a:graphicData uri="http://schemas.openxmlformats.org/drawingml/2006/picture">
                 <pic:pic xmlns:pic="http://schemas.openxmlformats.org/drawingml/2006/picture">
                   <pic:nvPicPr>
-                    <pic:cNvPr id="1607366621" name=""/>
+                    <pic:cNvPr id="514460702" name=""/>
                     <pic:cNvPicPr/>
                   </pic:nvPicPr>
                   <pic:blipFill>
@@ -2544,7 +2544,7 @@
                   <pic:spPr>
                     <a:xfrm>
                       <a:off x="0" y="0"/>
-                      <a:ext cx="5943600" cy="2625090"/>
+                      <a:ext cx="5943600" cy="2226945"/>
                     </a:xfrm>
                     <a:prstGeom prst="rect">
                       <a:avLst/>
@@ -2557,43 +2557,119 @@
         </w:drawing>
       </w:r>
       <w:r>
-        <w:tab/>
-      </w:r>
-      <w:r>
-        <w:tab/>
-      </w:r>
-      <w:r>
-        <w:tab/>
-      </w:r>
-      <w:r>
-        <w:tab/>
-      </w:r>
-    </w:p>
-    <w:p>
-      <w:r>
-        <w:tab/>
-        <w:t>Bài tập 3: Load Balancing với Nginx + Flask</w:t>
-      </w:r>
-      <w:r>
-        <w:tab/>
-      </w:r>
-      <w:r>
-        <w:tab/>
-      </w:r>
-      <w:r>
-        <w:tab/>
-      </w:r>
-      <w:r>
-        <w:tab/>
-      </w:r>
-      <w:r>
-        <w:tab/>
-      </w:r>
-    </w:p>
-    <w:p>
-      <w:r>
-        <w:tab/>
-        <w:t>Mục tiêu: Cân bằng tải giữa 2 instance Flask dùng Nginx.</w:t>
+        <w:drawing>
+          <wp:inline distT="0" distB="0" distL="0" distR="0" wp14:anchorId="5BB3874F" wp14:editId="56AC83EA">
+            <wp:extent cx="5943600" cy="3792855"/>
+            <wp:effectExtent l="0" t="0" r="0" b="0"/>
+            <wp:docPr id="365628606" name="Picture 1"/>
+            <wp:cNvGraphicFramePr>
+              <a:graphicFrameLocks xmlns:a="http://schemas.openxmlformats.org/drawingml/2006/main" noChangeAspect="1"/>
+            </wp:cNvGraphicFramePr>
+            <a:graphic xmlns:a="http://schemas.openxmlformats.org/drawingml/2006/main">
+              <a:graphicData uri="http://schemas.openxmlformats.org/drawingml/2006/picture">
+                <pic:pic xmlns:pic="http://schemas.openxmlformats.org/drawingml/2006/picture">
+                  <pic:nvPicPr>
+                    <pic:cNvPr id="365628606" name=""/>
+                    <pic:cNvPicPr/>
+                  </pic:nvPicPr>
+                  <pic:blipFill>
+                    <a:blip r:embed="rId28"/>
+                    <a:stretch>
+                      <a:fillRect/>
+                    </a:stretch>
+                  </pic:blipFill>
+                  <pic:spPr>
+                    <a:xfrm>
+                      <a:off x="0" y="0"/>
+                      <a:ext cx="5943600" cy="3792855"/>
+                    </a:xfrm>
+                    <a:prstGeom prst="rect">
+                      <a:avLst/>
+                    </a:prstGeom>
+                  </pic:spPr>
+                </pic:pic>
+              </a:graphicData>
+            </a:graphic>
+          </wp:inline>
+        </w:drawing>
+      </w:r>
+      <w:r>
+        <w:drawing>
+          <wp:inline distT="0" distB="0" distL="0" distR="0" wp14:anchorId="279A0D42" wp14:editId="400E6654">
+            <wp:extent cx="5943600" cy="1153795"/>
+            <wp:effectExtent l="0" t="0" r="0" b="8255"/>
+            <wp:docPr id="629013972" name="Picture 1"/>
+            <wp:cNvGraphicFramePr>
+              <a:graphicFrameLocks xmlns:a="http://schemas.openxmlformats.org/drawingml/2006/main" noChangeAspect="1"/>
+            </wp:cNvGraphicFramePr>
+            <a:graphic xmlns:a="http://schemas.openxmlformats.org/drawingml/2006/main">
+              <a:graphicData uri="http://schemas.openxmlformats.org/drawingml/2006/picture">
+                <pic:pic xmlns:pic="http://schemas.openxmlformats.org/drawingml/2006/picture">
+                  <pic:nvPicPr>
+                    <pic:cNvPr id="629013972" name=""/>
+                    <pic:cNvPicPr/>
+                  </pic:nvPicPr>
+                  <pic:blipFill>
+                    <a:blip r:embed="rId29"/>
+                    <a:stretch>
+                      <a:fillRect/>
+                    </a:stretch>
+                  </pic:blipFill>
+                  <pic:spPr>
+                    <a:xfrm>
+                      <a:off x="0" y="0"/>
+                      <a:ext cx="5943600" cy="1153795"/>
+                    </a:xfrm>
+                    <a:prstGeom prst="rect">
+                      <a:avLst/>
+                    </a:prstGeom>
+                  </pic:spPr>
+                </pic:pic>
+              </a:graphicData>
+            </a:graphic>
+          </wp:inline>
+        </w:drawing>
+      </w:r>
+    </w:p>
+    <w:p>
+      <w:r>
+        <w:tab/>
+      </w:r>
+      <w:r>
+        <w:tab/>
+      </w:r>
+      <w:r>
+        <w:tab/>
+      </w:r>
+      <w:r>
+        <w:tab/>
+      </w:r>
+    </w:p>
+    <w:p>
+      <w:r>
+        <w:tab/>
+        <w:t>Bài tập 4: Prometheus + Grafana Monitoring</w:t>
+      </w:r>
+      <w:r>
+        <w:tab/>
+      </w:r>
+      <w:r>
+        <w:tab/>
+      </w:r>
+      <w:r>
+        <w:tab/>
+      </w:r>
+      <w:r>
+        <w:tab/>
+      </w:r>
+      <w:r>
+        <w:tab/>
+      </w:r>
+    </w:p>
+    <w:p>
+      <w:r>
+        <w:tab/>
+        <w:t>Mục tiêu: Giám sát Docker containers dùng Prometheus và Grafana.</w:t>
       </w:r>
       <w:r>
         <w:tab/>
@@ -2634,152 +2710,199 @@
     </w:p>
     <w:p>
       <w:r>
-        <w:tab/>
-      </w:r>
-      <w:r>
-        <w:tab/>
-        <w:t>1. 2 service Flask (sử dụng app.py từ bài tập trước, port 5000).</w:t>
-      </w:r>
-      <w:r>
-        <w:tab/>
-      </w:r>
-      <w:r>
-        <w:tab/>
-      </w:r>
-      <w:r>
-        <w:tab/>
-      </w:r>
-      <w:r>
-        <w:tab/>
-      </w:r>
-    </w:p>
-    <w:p>
-      <w:r>
-        <w:tab/>
-      </w:r>
-      <w:r>
-        <w:tab/>
-        <w:t>2. 1 service Nginx (port 8080) cấu hình làm reverse proxy:</w:t>
-      </w:r>
-      <w:r>
-        <w:tab/>
-      </w:r>
-      <w:r>
-        <w:tab/>
-      </w:r>
-      <w:r>
-        <w:tab/>
-      </w:r>
-      <w:r>
-        <w:tab/>
-      </w:r>
-    </w:p>
-    <w:p>
-      <w:r>
-        <w:tab/>
-      </w:r>
-      <w:r>
-        <w:tab/>
-      </w:r>
-      <w:r>
-        <w:tab/>
-        <w:t>Chuyển request / đến các Flask instance (round-robin).</w:t>
-      </w:r>
-      <w:r>
-        <w:tab/>
-      </w:r>
-      <w:r>
-        <w:tab/>
-      </w:r>
-      <w:r>
-        <w:tab/>
-      </w:r>
-    </w:p>
-    <w:p>
-      <w:r>
-        <w:tab/>
-      </w:r>
-      <w:r>
-        <w:tab/>
-        <w:t>3. Tạo custom network và Nginx config.</w:t>
-      </w:r>
-      <w:r>
-        <w:tab/>
-      </w:r>
-      <w:r>
-        <w:tab/>
-      </w:r>
-      <w:r>
-        <w:tab/>
-      </w:r>
-      <w:r>
-        <w:tab/>
-      </w:r>
-    </w:p>
-    <w:p>
-      <w:r>
-        <w:tab/>
-      </w:r>
-      <w:r>
-        <w:tab/>
-      </w:r>
-      <w:r>
-        <w:tab/>
-      </w:r>
-      <w:r>
-        <w:tab/>
-      </w:r>
-      <w:r>
-        <w:tab/>
-      </w:r>
-      <w:r>
-        <w:tab/>
-      </w:r>
-    </w:p>
-    <w:p>
-      <w:r>
-        <w:tab/>
-        <w:t>Bài tập 4: Prometheus + Grafana Monitoring</w:t>
-      </w:r>
-      <w:r>
-        <w:tab/>
-      </w:r>
-      <w:r>
-        <w:tab/>
-      </w:r>
-      <w:r>
-        <w:tab/>
-      </w:r>
-      <w:r>
-        <w:tab/>
-      </w:r>
-      <w:r>
-        <w:tab/>
-      </w:r>
-    </w:p>
-    <w:p>
-      <w:r>
-        <w:tab/>
-        <w:t>Mục tiêu: Giám sát Docker containers dùng Prometheus và Grafana.</w:t>
-      </w:r>
-      <w:r>
-        <w:tab/>
-      </w:r>
-      <w:r>
-        <w:tab/>
-      </w:r>
-      <w:r>
-        <w:tab/>
-      </w:r>
-      <w:r>
-        <w:tab/>
-      </w:r>
-      <w:r>
-        <w:tab/>
-      </w:r>
-    </w:p>
-    <w:p>
-      <w:r>
+        <w:lastRenderedPageBreak/>
+        <w:tab/>
+      </w:r>
+      <w:r>
+        <w:tab/>
+        <w:t>1. Service Prometheus (port 9090) với file cấu hình thu thập metrics từ Docker.</w:t>
+      </w:r>
+      <w:r>
+        <w:tab/>
+      </w:r>
+      <w:r>
+        <w:tab/>
+      </w:r>
+      <w:r>
+        <w:tab/>
+      </w:r>
+      <w:r>
+        <w:tab/>
+      </w:r>
+      <w:r>
+        <w:drawing>
+          <wp:inline distT="0" distB="0" distL="0" distR="0" wp14:anchorId="6A8823CE" wp14:editId="03D293DF">
+            <wp:extent cx="5296639" cy="3496163"/>
+            <wp:effectExtent l="0" t="0" r="0" b="9525"/>
+            <wp:docPr id="1145459876" name="Picture 1"/>
+            <wp:cNvGraphicFramePr>
+              <a:graphicFrameLocks xmlns:a="http://schemas.openxmlformats.org/drawingml/2006/main" noChangeAspect="1"/>
+            </wp:cNvGraphicFramePr>
+            <a:graphic xmlns:a="http://schemas.openxmlformats.org/drawingml/2006/main">
+              <a:graphicData uri="http://schemas.openxmlformats.org/drawingml/2006/picture">
+                <pic:pic xmlns:pic="http://schemas.openxmlformats.org/drawingml/2006/picture">
+                  <pic:nvPicPr>
+                    <pic:cNvPr id="1145459876" name=""/>
+                    <pic:cNvPicPr/>
+                  </pic:nvPicPr>
+                  <pic:blipFill>
+                    <a:blip r:embed="rId30"/>
+                    <a:stretch>
+                      <a:fillRect/>
+                    </a:stretch>
+                  </pic:blipFill>
+                  <pic:spPr>
+                    <a:xfrm>
+                      <a:off x="0" y="0"/>
+                      <a:ext cx="5296639" cy="3496163"/>
+                    </a:xfrm>
+                    <a:prstGeom prst="rect">
+                      <a:avLst/>
+                    </a:prstGeom>
+                  </pic:spPr>
+                </pic:pic>
+              </a:graphicData>
+            </a:graphic>
+          </wp:inline>
+        </w:drawing>
+      </w:r>
+    </w:p>
+    <w:p>
+      <w:r>
+        <w:tab/>
+      </w:r>
+      <w:r>
+        <w:tab/>
+        <w:t>2. Service Grafana (port 3000) kết nối đến Prometheus.</w:t>
+      </w:r>
+      <w:r>
+        <w:tab/>
+      </w:r>
+      <w:r>
+        <w:tab/>
+      </w:r>
+      <w:r>
+        <w:tab/>
+      </w:r>
+      <w:r>
+        <w:tab/>
+      </w:r>
+    </w:p>
+    <w:p>
+      <w:r>
+        <w:tab/>
+      </w:r>
+      <w:r>
+        <w:tab/>
+        <w:t>3. Volume để lưu dữ liệu Prometheus và Grafana.</w:t>
+      </w:r>
+      <w:r>
+        <w:tab/>
+      </w:r>
+      <w:r>
+        <w:tab/>
+      </w:r>
+      <w:r>
+        <w:tab/>
+      </w:r>
+      <w:r>
+        <w:tab/>
+      </w:r>
+    </w:p>
+    <w:p>
+      <w:r>
+        <w:lastRenderedPageBreak/>
+        <w:tab/>
+      </w:r>
+      <w:r>
+        <w:drawing>
+          <wp:inline distT="0" distB="0" distL="0" distR="0" wp14:anchorId="4528B5BE" wp14:editId="4A523018">
+            <wp:extent cx="5943600" cy="7179310"/>
+            <wp:effectExtent l="0" t="0" r="0" b="2540"/>
+            <wp:docPr id="1197872547" name="Picture 1"/>
+            <wp:cNvGraphicFramePr>
+              <a:graphicFrameLocks xmlns:a="http://schemas.openxmlformats.org/drawingml/2006/main" noChangeAspect="1"/>
+            </wp:cNvGraphicFramePr>
+            <a:graphic xmlns:a="http://schemas.openxmlformats.org/drawingml/2006/main">
+              <a:graphicData uri="http://schemas.openxmlformats.org/drawingml/2006/picture">
+                <pic:pic xmlns:pic="http://schemas.openxmlformats.org/drawingml/2006/picture">
+                  <pic:nvPicPr>
+                    <pic:cNvPr id="1197872547" name=""/>
+                    <pic:cNvPicPr/>
+                  </pic:nvPicPr>
+                  <pic:blipFill>
+                    <a:blip r:embed="rId31"/>
+                    <a:stretch>
+                      <a:fillRect/>
+                    </a:stretch>
+                  </pic:blipFill>
+                  <pic:spPr>
+                    <a:xfrm>
+                      <a:off x="0" y="0"/>
+                      <a:ext cx="5943600" cy="7179310"/>
+                    </a:xfrm>
+                    <a:prstGeom prst="rect">
+                      <a:avLst/>
+                    </a:prstGeom>
+                  </pic:spPr>
+                </pic:pic>
+              </a:graphicData>
+            </a:graphic>
+          </wp:inline>
+        </w:drawing>
+      </w:r>
+      <w:r>
+        <w:tab/>
+      </w:r>
+      <w:r>
+        <w:tab/>
+      </w:r>
+    </w:p>
+    <w:p>
+      <w:r>
+        <w:tab/>
+        <w:t>Bài tập 5: Multi-tier Voting App</w:t>
+      </w:r>
+      <w:r>
+        <w:tab/>
+      </w:r>
+      <w:r>
+        <w:tab/>
+      </w:r>
+      <w:r>
+        <w:tab/>
+      </w:r>
+      <w:r>
+        <w:tab/>
+      </w:r>
+      <w:r>
+        <w:tab/>
+      </w:r>
+    </w:p>
+    <w:p>
+      <w:r>
+        <w:tab/>
+        <w:t>Mục tiêu: Triển khai ứng dụng voting gồm 5 services (Tham khảo từ Docker Docs).</w:t>
+      </w:r>
+      <w:r>
+        <w:tab/>
+      </w:r>
+      <w:r>
+        <w:tab/>
+      </w:r>
+      <w:r>
+        <w:tab/>
+      </w:r>
+      <w:r>
+        <w:tab/>
+      </w:r>
+      <w:r>
+        <w:tab/>
+      </w:r>
+    </w:p>
+    <w:p>
+      <w:r>
+        <w:lastRenderedPageBreak/>
         <w:tab/>
         <w:t>Yêu cầu:</w:t>
       </w:r>
@@ -2805,108 +2928,150 @@
       </w:r>
       <w:r>
         <w:tab/>
-        <w:t>1. Service Prometheus (port 9090) với file cấu hình thu thập metrics từ Docker.</w:t>
-      </w:r>
-      <w:r>
-        <w:tab/>
-      </w:r>
-      <w:r>
-        <w:tab/>
-      </w:r>
-      <w:r>
-        <w:tab/>
-      </w:r>
-      <w:r>
-        <w:tab/>
-      </w:r>
-    </w:p>
-    <w:p>
-      <w:r>
-        <w:tab/>
-      </w:r>
-      <w:r>
-        <w:tab/>
-        <w:t>2. Service Grafana (port 3000) kết nối đến Prometheus.</w:t>
-      </w:r>
-      <w:r>
-        <w:tab/>
-      </w:r>
-      <w:r>
-        <w:tab/>
-      </w:r>
-      <w:r>
-        <w:tab/>
-      </w:r>
-      <w:r>
-        <w:tab/>
-      </w:r>
-    </w:p>
-    <w:p>
-      <w:r>
-        <w:tab/>
-      </w:r>
-      <w:r>
-        <w:tab/>
-        <w:t>3. Volume để lưu dữ liệu Prometheus và Grafana.</w:t>
-      </w:r>
-      <w:r>
-        <w:tab/>
-      </w:r>
-      <w:r>
-        <w:tab/>
-      </w:r>
-      <w:r>
-        <w:tab/>
-      </w:r>
-      <w:r>
-        <w:tab/>
-      </w:r>
-    </w:p>
-    <w:p>
-      <w:r>
-        <w:tab/>
-      </w:r>
-      <w:r>
-        <w:tab/>
-      </w:r>
-      <w:r>
-        <w:tab/>
-      </w:r>
-      <w:r>
-        <w:tab/>
-      </w:r>
-      <w:r>
-        <w:tab/>
-      </w:r>
-      <w:r>
-        <w:tab/>
-      </w:r>
-    </w:p>
-    <w:p>
-      <w:r>
-        <w:tab/>
-        <w:t>Bài tập 5: Multi-tier Voting App</w:t>
-      </w:r>
-      <w:r>
-        <w:tab/>
-      </w:r>
-      <w:r>
-        <w:tab/>
-      </w:r>
-      <w:r>
-        <w:tab/>
-      </w:r>
-      <w:r>
-        <w:tab/>
-      </w:r>
-      <w:r>
-        <w:tab/>
-      </w:r>
-    </w:p>
-    <w:p>
-      <w:r>
-        <w:tab/>
-        <w:t>Mục tiêu: Triển khai ứng dụng voting gồm 5 services (Tham khảo từ Docker Docs).</w:t>
+        <w:t>1. Frontend: vote (Python, port 5000).</w:t>
+      </w:r>
+      <w:r>
+        <w:tab/>
+      </w:r>
+      <w:r>
+        <w:tab/>
+      </w:r>
+      <w:r>
+        <w:tab/>
+      </w:r>
+      <w:r>
+        <w:tab/>
+      </w:r>
+    </w:p>
+    <w:p>
+      <w:r>
+        <w:tab/>
+      </w:r>
+      <w:r>
+        <w:tab/>
+        <w:t>2. Backend: result (Node.js, port 5001).</w:t>
+      </w:r>
+      <w:r>
+        <w:tab/>
+      </w:r>
+      <w:r>
+        <w:tab/>
+      </w:r>
+      <w:r>
+        <w:tab/>
+      </w:r>
+      <w:r>
+        <w:tab/>
+      </w:r>
+    </w:p>
+    <w:p>
+      <w:r>
+        <w:tab/>
+      </w:r>
+      <w:r>
+        <w:tab/>
+        <w:t>3. Redis (lưu tạm vote).</w:t>
+      </w:r>
+      <w:r>
+        <w:tab/>
+      </w:r>
+      <w:r>
+        <w:tab/>
+      </w:r>
+      <w:r>
+        <w:tab/>
+      </w:r>
+      <w:r>
+        <w:tab/>
+      </w:r>
+    </w:p>
+    <w:p>
+      <w:r>
+        <w:tab/>
+      </w:r>
+      <w:r>
+        <w:tab/>
+        <w:t>4. Worker (Java) xử lý vote từ Redis sang DB.</w:t>
+      </w:r>
+      <w:r>
+        <w:tab/>
+      </w:r>
+      <w:r>
+        <w:tab/>
+      </w:r>
+      <w:r>
+        <w:tab/>
+      </w:r>
+      <w:r>
+        <w:tab/>
+      </w:r>
+    </w:p>
+    <w:p>
+      <w:r>
+        <w:tab/>
+      </w:r>
+      <w:r>
+        <w:tab/>
+        <w:t>5. Postgres (lưu kết quả).</w:t>
+      </w:r>
+      <w:r>
+        <w:tab/>
+      </w:r>
+      <w:r>
+        <w:tab/>
+      </w:r>
+      <w:r>
+        <w:tab/>
+      </w:r>
+      <w:r>
+        <w:tab/>
+      </w:r>
+    </w:p>
+    <w:p>
+      <w:r>
+        <w:tab/>
+      </w:r>
+      <w:r>
+        <w:tab/>
+      </w:r>
+      <w:r>
+        <w:tab/>
+      </w:r>
+      <w:r>
+        <w:tab/>
+      </w:r>
+      <w:r>
+        <w:tab/>
+      </w:r>
+      <w:r>
+        <w:tab/>
+      </w:r>
+    </w:p>
+    <w:p>
+      <w:r>
+        <w:tab/>
+        <w:t>Bài tập 6: CI/CD Pipeline với Docker Compose</w:t>
+      </w:r>
+      <w:r>
+        <w:tab/>
+      </w:r>
+      <w:r>
+        <w:tab/>
+      </w:r>
+      <w:r>
+        <w:tab/>
+      </w:r>
+      <w:r>
+        <w:tab/>
+      </w:r>
+      <w:r>
+        <w:tab/>
+      </w:r>
+    </w:p>
+    <w:p>
+      <w:r>
+        <w:tab/>
+        <w:t>Mục tiêu: Mô phỏng pipeline dev/test bằng Docker Compose.</w:t>
       </w:r>
       <w:r>
         <w:tab/>
@@ -2951,129 +3116,567 @@
       </w:r>
       <w:r>
         <w:tab/>
-        <w:t>1. Frontend: vote (Python, port 5000).</w:t>
-      </w:r>
-      <w:r>
-        <w:tab/>
-      </w:r>
-      <w:r>
-        <w:tab/>
-      </w:r>
-      <w:r>
-        <w:tab/>
-      </w:r>
-      <w:r>
-        <w:tab/>
-      </w:r>
-    </w:p>
-    <w:p>
-      <w:r>
-        <w:tab/>
-      </w:r>
-      <w:r>
-        <w:tab/>
-        <w:t>2. Backend: result (Node.js, port 5001).</w:t>
-      </w:r>
-      <w:r>
-        <w:tab/>
-      </w:r>
-      <w:r>
-        <w:tab/>
-      </w:r>
-      <w:r>
-        <w:tab/>
-      </w:r>
-      <w:r>
-        <w:tab/>
-      </w:r>
-    </w:p>
-    <w:p>
-      <w:r>
-        <w:tab/>
-      </w:r>
-      <w:r>
-        <w:tab/>
-        <w:t>3. Redis (lưu tạm vote).</w:t>
-      </w:r>
-      <w:r>
-        <w:tab/>
-      </w:r>
-      <w:r>
-        <w:tab/>
-      </w:r>
-      <w:r>
-        <w:tab/>
-      </w:r>
-      <w:r>
-        <w:tab/>
-      </w:r>
-    </w:p>
-    <w:p>
-      <w:r>
-        <w:tab/>
-      </w:r>
-      <w:r>
-        <w:tab/>
-        <w:t>4. Worker (Java) xử lý vote từ Redis sang DB.</w:t>
-      </w:r>
-      <w:r>
-        <w:tab/>
-      </w:r>
-      <w:r>
-        <w:tab/>
-      </w:r>
-      <w:r>
-        <w:tab/>
-      </w:r>
-      <w:r>
-        <w:tab/>
-      </w:r>
-    </w:p>
-    <w:p>
-      <w:r>
-        <w:tab/>
-      </w:r>
-      <w:r>
-        <w:tab/>
-        <w:t>5. Postgres (lưu kết quả).</w:t>
-      </w:r>
-      <w:r>
-        <w:tab/>
-      </w:r>
-      <w:r>
-        <w:tab/>
-      </w:r>
-      <w:r>
-        <w:tab/>
-      </w:r>
-      <w:r>
-        <w:tab/>
-      </w:r>
-    </w:p>
-    <w:p>
-      <w:r>
-        <w:tab/>
-      </w:r>
-      <w:r>
-        <w:tab/>
-      </w:r>
-      <w:r>
-        <w:tab/>
-      </w:r>
-      <w:r>
-        <w:tab/>
-      </w:r>
-      <w:r>
-        <w:tab/>
-      </w:r>
-      <w:r>
-        <w:tab/>
-      </w:r>
-    </w:p>
-    <w:p>
-      <w:r>
-        <w:tab/>
-        <w:t>Bài tập 6: CI/CD Pipeline với Docker Compose</w:t>
+        <w:t>1. Service app (Python/Node.js) với code được mount từ host (development mode).</w:t>
+      </w:r>
+      <w:r>
+        <w:tab/>
+      </w:r>
+      <w:r>
+        <w:tab/>
+      </w:r>
+      <w:r>
+        <w:tab/>
+      </w:r>
+      <w:r>
+        <w:tab/>
+      </w:r>
+    </w:p>
+    <w:p>
+      <w:r>
+        <w:tab/>
+      </w:r>
+      <w:r>
+        <w:tab/>
+        <w:t>2. Service tests chạy unit tests khi code thay đổi (sử dụng volumes + entrypoint).</w:t>
+      </w:r>
+      <w:r>
+        <w:tab/>
+      </w:r>
+      <w:r>
+        <w:tab/>
+      </w:r>
+      <w:r>
+        <w:tab/>
+      </w:r>
+      <w:r>
+        <w:tab/>
+      </w:r>
+    </w:p>
+    <w:p>
+      <w:r>
+        <w:tab/>
+      </w:r>
+      <w:r>
+        <w:tab/>
+        <w:t>3. Service nginx (production mode) dùng image build sẵn từ app.</w:t>
+      </w:r>
+      <w:r>
+        <w:tab/>
+      </w:r>
+      <w:r>
+        <w:tab/>
+      </w:r>
+      <w:r>
+        <w:tab/>
+      </w:r>
+      <w:r>
+        <w:tab/>
+      </w:r>
+    </w:p>
+    <w:p>
+      <w:r>
+        <w:tab/>
+        <w:t>Gợi ý:</w:t>
+      </w:r>
+      <w:r>
+        <w:tab/>
+      </w:r>
+      <w:r>
+        <w:tab/>
+      </w:r>
+      <w:r>
+        <w:tab/>
+      </w:r>
+      <w:r>
+        <w:tab/>
+      </w:r>
+      <w:r>
+        <w:tab/>
+      </w:r>
+    </w:p>
+    <w:p>
+      <w:r>
+        <w:tab/>
+      </w:r>
+      <w:r>
+        <w:tab/>
+        <w:t>1. Dùng 2 file compose khác nhau (docker-compose-dev.yml và docker-compose-prod.yml).</w:t>
+      </w:r>
+      <w:r>
+        <w:tab/>
+      </w:r>
+      <w:r>
+        <w:tab/>
+      </w:r>
+      <w:r>
+        <w:tab/>
+      </w:r>
+      <w:r>
+        <w:tab/>
+      </w:r>
+    </w:p>
+    <w:p>
+      <w:r>
+        <w:tab/>
+      </w:r>
+      <w:r>
+        <w:tab/>
+        <w:t>2. Sử dụng docker-compose -f &lt;file&gt; up để chọn môi trường.</w:t>
+      </w:r>
+      <w:r>
+        <w:tab/>
+      </w:r>
+      <w:r>
+        <w:tab/>
+      </w:r>
+      <w:r>
+        <w:tab/>
+      </w:r>
+      <w:r>
+        <w:tab/>
+      </w:r>
+    </w:p>
+    <w:p>
+      <w:r>
+        <w:tab/>
+      </w:r>
+      <w:r>
+        <w:tab/>
+      </w:r>
+      <w:r>
+        <w:tab/>
+      </w:r>
+      <w:r>
+        <w:tab/>
+      </w:r>
+      <w:r>
+        <w:tab/>
+      </w:r>
+      <w:r>
+        <w:tab/>
+      </w:r>
+    </w:p>
+    <w:p>
+      <w:r>
+        <w:tab/>
+        <w:t>Bài tập 7: Elasticsearch + Kibana</w:t>
+      </w:r>
+      <w:r>
+        <w:tab/>
+      </w:r>
+      <w:r>
+        <w:tab/>
+      </w:r>
+      <w:r>
+        <w:tab/>
+      </w:r>
+      <w:r>
+        <w:tab/>
+      </w:r>
+      <w:r>
+        <w:tab/>
+      </w:r>
+    </w:p>
+    <w:p>
+      <w:r>
+        <w:tab/>
+        <w:t>Mục tiêu: Triển khai ELK stack đơn giản.</w:t>
+      </w:r>
+      <w:r>
+        <w:tab/>
+      </w:r>
+      <w:r>
+        <w:tab/>
+      </w:r>
+      <w:r>
+        <w:tab/>
+      </w:r>
+      <w:r>
+        <w:tab/>
+      </w:r>
+      <w:r>
+        <w:tab/>
+      </w:r>
+    </w:p>
+    <w:p>
+      <w:r>
+        <w:tab/>
+        <w:t>Yêu cầu:</w:t>
+      </w:r>
+      <w:r>
+        <w:tab/>
+      </w:r>
+      <w:r>
+        <w:tab/>
+      </w:r>
+      <w:r>
+        <w:tab/>
+      </w:r>
+      <w:r>
+        <w:tab/>
+      </w:r>
+      <w:r>
+        <w:tab/>
+      </w:r>
+    </w:p>
+    <w:p>
+      <w:r>
+        <w:tab/>
+      </w:r>
+      <w:r>
+        <w:tab/>
+        <w:t>1. Service Elasticsearch (port 9200) với volume.</w:t>
+      </w:r>
+      <w:r>
+        <w:tab/>
+      </w:r>
+      <w:r>
+        <w:tab/>
+      </w:r>
+      <w:r>
+        <w:tab/>
+      </w:r>
+      <w:r>
+        <w:tab/>
+      </w:r>
+    </w:p>
+    <w:p>
+      <w:r>
+        <w:tab/>
+      </w:r>
+      <w:r>
+        <w:tab/>
+        <w:t>2. Service Kibana (port 5601) kết nối với Elasticsearch.</w:t>
+      </w:r>
+      <w:r>
+        <w:tab/>
+      </w:r>
+      <w:r>
+        <w:tab/>
+      </w:r>
+      <w:r>
+        <w:tab/>
+      </w:r>
+      <w:r>
+        <w:tab/>
+      </w:r>
+    </w:p>
+    <w:p>
+      <w:r>
+        <w:tab/>
+      </w:r>
+      <w:r>
+        <w:tab/>
+        <w:t>3. Thiết lập environment variables cho credentials.</w:t>
+      </w:r>
+      <w:r>
+        <w:tab/>
+      </w:r>
+      <w:r>
+        <w:tab/>
+      </w:r>
+      <w:r>
+        <w:tab/>
+      </w:r>
+      <w:r>
+        <w:tab/>
+      </w:r>
+    </w:p>
+    <w:p>
+      <w:r>
+        <w:tab/>
+      </w:r>
+      <w:r>
+        <w:tab/>
+      </w:r>
+      <w:r>
+        <w:tab/>
+      </w:r>
+      <w:r>
+        <w:tab/>
+      </w:r>
+      <w:r>
+        <w:tab/>
+      </w:r>
+      <w:r>
+        <w:tab/>
+      </w:r>
+    </w:p>
+    <w:p>
+      <w:r>
+        <w:tab/>
+        <w:t>Bài tập 8: Django + Celery + Redis</w:t>
+      </w:r>
+      <w:r>
+        <w:tab/>
+      </w:r>
+      <w:r>
+        <w:tab/>
+      </w:r>
+      <w:r>
+        <w:tab/>
+      </w:r>
+      <w:r>
+        <w:tab/>
+      </w:r>
+      <w:r>
+        <w:tab/>
+      </w:r>
+    </w:p>
+    <w:p>
+      <w:r>
+        <w:tab/>
+        <w:t>Mục tiêu: Triển khai Django với Celery worker và Redis làm message broker.</w:t>
+      </w:r>
+      <w:r>
+        <w:tab/>
+      </w:r>
+      <w:r>
+        <w:tab/>
+      </w:r>
+      <w:r>
+        <w:tab/>
+      </w:r>
+      <w:r>
+        <w:tab/>
+      </w:r>
+      <w:r>
+        <w:tab/>
+      </w:r>
+    </w:p>
+    <w:p>
+      <w:r>
+        <w:tab/>
+        <w:t>Yêu cầu:</w:t>
+      </w:r>
+      <w:r>
+        <w:tab/>
+      </w:r>
+      <w:r>
+        <w:tab/>
+      </w:r>
+      <w:r>
+        <w:tab/>
+      </w:r>
+      <w:r>
+        <w:tab/>
+      </w:r>
+      <w:r>
+        <w:tab/>
+      </w:r>
+    </w:p>
+    <w:p>
+      <w:r>
+        <w:tab/>
+      </w:r>
+      <w:r>
+        <w:tab/>
+        <w:t>1. Django app (port 8000).</w:t>
+      </w:r>
+      <w:r>
+        <w:tab/>
+      </w:r>
+      <w:r>
+        <w:tab/>
+      </w:r>
+      <w:r>
+        <w:tab/>
+      </w:r>
+      <w:r>
+        <w:tab/>
+      </w:r>
+    </w:p>
+    <w:p>
+      <w:r>
+        <w:tab/>
+      </w:r>
+      <w:r>
+        <w:tab/>
+        <w:t>2. Celery worker chạy song song.</w:t>
+      </w:r>
+      <w:r>
+        <w:tab/>
+      </w:r>
+      <w:r>
+        <w:tab/>
+      </w:r>
+      <w:r>
+        <w:tab/>
+      </w:r>
+      <w:r>
+        <w:tab/>
+      </w:r>
+    </w:p>
+    <w:p>
+      <w:r>
+        <w:tab/>
+      </w:r>
+      <w:r>
+        <w:tab/>
+        <w:t>3. Redis service cho task queue.</w:t>
+      </w:r>
+      <w:r>
+        <w:tab/>
+      </w:r>
+      <w:r>
+        <w:tab/>
+      </w:r>
+      <w:r>
+        <w:tab/>
+      </w:r>
+      <w:r>
+        <w:tab/>
+      </w:r>
+    </w:p>
+    <w:p>
+      <w:r>
+        <w:tab/>
+      </w:r>
+      <w:r>
+        <w:tab/>
+      </w:r>
+      <w:r>
+        <w:tab/>
+      </w:r>
+      <w:r>
+        <w:tab/>
+      </w:r>
+      <w:r>
+        <w:tab/>
+      </w:r>
+      <w:r>
+        <w:tab/>
+      </w:r>
+    </w:p>
+    <w:p>
+      <w:r>
+        <w:tab/>
+        <w:t>Bài tập 9: Nextcloud với MariaDB + Redis Caching</w:t>
+      </w:r>
+      <w:r>
+        <w:tab/>
+      </w:r>
+      <w:r>
+        <w:tab/>
+      </w:r>
+      <w:r>
+        <w:tab/>
+      </w:r>
+      <w:r>
+        <w:tab/>
+      </w:r>
+      <w:r>
+        <w:tab/>
+      </w:r>
+    </w:p>
+    <w:p>
+      <w:r>
+        <w:tab/>
+        <w:t>Mục tiêu: Triển khai Nextcloud (self-hosted cloud) với MariaDB và Redis.</w:t>
+      </w:r>
+      <w:r>
+        <w:tab/>
+      </w:r>
+      <w:r>
+        <w:tab/>
+      </w:r>
+      <w:r>
+        <w:tab/>
+      </w:r>
+      <w:r>
+        <w:tab/>
+      </w:r>
+      <w:r>
+        <w:tab/>
+      </w:r>
+    </w:p>
+    <w:p>
+      <w:r>
+        <w:tab/>
+        <w:t>Yêu cầu:</w:t>
+      </w:r>
+      <w:r>
+        <w:tab/>
+      </w:r>
+      <w:r>
+        <w:tab/>
+      </w:r>
+      <w:r>
+        <w:tab/>
+      </w:r>
+      <w:r>
+        <w:tab/>
+      </w:r>
+      <w:r>
+        <w:tab/>
+      </w:r>
+    </w:p>
+    <w:p>
+      <w:r>
+        <w:tab/>
+      </w:r>
+      <w:r>
+        <w:tab/>
+        <w:t>1. Nextcloud (port 80).</w:t>
+      </w:r>
+      <w:r>
+        <w:tab/>
+      </w:r>
+      <w:r>
+        <w:tab/>
+      </w:r>
+      <w:r>
+        <w:tab/>
+      </w:r>
+      <w:r>
+        <w:tab/>
+      </w:r>
+    </w:p>
+    <w:p>
+      <w:r>
+        <w:tab/>
+      </w:r>
+      <w:r>
+        <w:tab/>
+        <w:t>2. MariaDB (volume cho dữ liệu).</w:t>
+      </w:r>
+      <w:r>
+        <w:tab/>
+      </w:r>
+      <w:r>
+        <w:tab/>
+      </w:r>
+      <w:r>
+        <w:tab/>
+      </w:r>
+      <w:r>
+        <w:tab/>
+      </w:r>
+    </w:p>
+    <w:p>
+      <w:r>
+        <w:tab/>
+      </w:r>
+      <w:r>
+        <w:tab/>
+        <w:t>3. Redis cache.</w:t>
+      </w:r>
+      <w:r>
+        <w:tab/>
+      </w:r>
+      <w:r>
+        <w:tab/>
+      </w:r>
+      <w:r>
+        <w:tab/>
+      </w:r>
+      <w:r>
+        <w:tab/>
+      </w:r>
+    </w:p>
+    <w:p>
+      <w:r>
+        <w:tab/>
       </w:r>
       <w:r>
         <w:tab/>
@@ -3095,7 +3698,28 @@
       <w:r>
         <w:lastRenderedPageBreak/>
         <w:tab/>
-        <w:t>Mục tiêu: Mô phỏng pipeline dev/test bằng Docker Compose.</w:t>
+        <w:t>Bài tập 10: Traefik as Reverse Proxy</w:t>
+      </w:r>
+      <w:r>
+        <w:tab/>
+      </w:r>
+      <w:r>
+        <w:tab/>
+      </w:r>
+      <w:r>
+        <w:tab/>
+      </w:r>
+      <w:r>
+        <w:tab/>
+      </w:r>
+      <w:r>
+        <w:tab/>
+      </w:r>
+    </w:p>
+    <w:p>
+      <w:r>
+        <w:tab/>
+        <w:t>Mục tiêu: Dùng Traefik để định tuyến request đến các service (Flask, WordPress, etc.).</w:t>
       </w:r>
       <w:r>
         <w:tab/>
@@ -3140,653 +3764,6 @@
       </w:r>
       <w:r>
         <w:tab/>
-        <w:t>1. Service app (Python/Node.js) với code được mount từ host (development mode).</w:t>
-      </w:r>
-      <w:r>
-        <w:tab/>
-      </w:r>
-      <w:r>
-        <w:tab/>
-      </w:r>
-      <w:r>
-        <w:tab/>
-      </w:r>
-      <w:r>
-        <w:tab/>
-      </w:r>
-    </w:p>
-    <w:p>
-      <w:r>
-        <w:tab/>
-      </w:r>
-      <w:r>
-        <w:tab/>
-        <w:t>2. Service tests chạy unit tests khi code thay đổi (sử dụng volumes + entrypoint).</w:t>
-      </w:r>
-      <w:r>
-        <w:tab/>
-      </w:r>
-      <w:r>
-        <w:tab/>
-      </w:r>
-      <w:r>
-        <w:tab/>
-      </w:r>
-      <w:r>
-        <w:tab/>
-      </w:r>
-    </w:p>
-    <w:p>
-      <w:r>
-        <w:tab/>
-      </w:r>
-      <w:r>
-        <w:tab/>
-        <w:t>3. Service nginx (production mode) dùng image build sẵn từ app.</w:t>
-      </w:r>
-      <w:r>
-        <w:tab/>
-      </w:r>
-      <w:r>
-        <w:tab/>
-      </w:r>
-      <w:r>
-        <w:tab/>
-      </w:r>
-      <w:r>
-        <w:tab/>
-      </w:r>
-    </w:p>
-    <w:p>
-      <w:r>
-        <w:tab/>
-        <w:t>Gợi ý:</w:t>
-      </w:r>
-      <w:r>
-        <w:tab/>
-      </w:r>
-      <w:r>
-        <w:tab/>
-      </w:r>
-      <w:r>
-        <w:tab/>
-      </w:r>
-      <w:r>
-        <w:tab/>
-      </w:r>
-      <w:r>
-        <w:tab/>
-      </w:r>
-    </w:p>
-    <w:p>
-      <w:r>
-        <w:tab/>
-      </w:r>
-      <w:r>
-        <w:tab/>
-        <w:t>1. Dùng 2 file compose khác nhau (docker-compose-dev.yml và docker-compose-prod.yml).</w:t>
-      </w:r>
-      <w:r>
-        <w:tab/>
-      </w:r>
-      <w:r>
-        <w:tab/>
-      </w:r>
-      <w:r>
-        <w:tab/>
-      </w:r>
-      <w:r>
-        <w:tab/>
-      </w:r>
-    </w:p>
-    <w:p>
-      <w:r>
-        <w:tab/>
-      </w:r>
-      <w:r>
-        <w:tab/>
-        <w:t>2. Sử dụng docker-compose -f &lt;file&gt; up để chọn môi trường.</w:t>
-      </w:r>
-      <w:r>
-        <w:tab/>
-      </w:r>
-      <w:r>
-        <w:tab/>
-      </w:r>
-      <w:r>
-        <w:tab/>
-      </w:r>
-      <w:r>
-        <w:tab/>
-      </w:r>
-    </w:p>
-    <w:p>
-      <w:r>
-        <w:tab/>
-      </w:r>
-      <w:r>
-        <w:tab/>
-      </w:r>
-      <w:r>
-        <w:tab/>
-      </w:r>
-      <w:r>
-        <w:tab/>
-      </w:r>
-      <w:r>
-        <w:tab/>
-      </w:r>
-      <w:r>
-        <w:tab/>
-      </w:r>
-    </w:p>
-    <w:p>
-      <w:r>
-        <w:tab/>
-        <w:t>Bài tập 7: Elasticsearch + Kibana</w:t>
-      </w:r>
-      <w:r>
-        <w:tab/>
-      </w:r>
-      <w:r>
-        <w:tab/>
-      </w:r>
-      <w:r>
-        <w:tab/>
-      </w:r>
-      <w:r>
-        <w:tab/>
-      </w:r>
-      <w:r>
-        <w:tab/>
-      </w:r>
-    </w:p>
-    <w:p>
-      <w:r>
-        <w:tab/>
-        <w:t>Mục tiêu: Triển khai ELK stack đơn giản.</w:t>
-      </w:r>
-      <w:r>
-        <w:tab/>
-      </w:r>
-      <w:r>
-        <w:tab/>
-      </w:r>
-      <w:r>
-        <w:tab/>
-      </w:r>
-      <w:r>
-        <w:tab/>
-      </w:r>
-      <w:r>
-        <w:tab/>
-      </w:r>
-    </w:p>
-    <w:p>
-      <w:r>
-        <w:tab/>
-        <w:t>Yêu cầu:</w:t>
-      </w:r>
-      <w:r>
-        <w:tab/>
-      </w:r>
-      <w:r>
-        <w:tab/>
-      </w:r>
-      <w:r>
-        <w:tab/>
-      </w:r>
-      <w:r>
-        <w:tab/>
-      </w:r>
-      <w:r>
-        <w:tab/>
-      </w:r>
-    </w:p>
-    <w:p>
-      <w:r>
-        <w:tab/>
-      </w:r>
-      <w:r>
-        <w:tab/>
-        <w:t>1. Service Elasticsearch (port 9200) với volume.</w:t>
-      </w:r>
-      <w:r>
-        <w:tab/>
-      </w:r>
-      <w:r>
-        <w:tab/>
-      </w:r>
-      <w:r>
-        <w:tab/>
-      </w:r>
-      <w:r>
-        <w:tab/>
-      </w:r>
-    </w:p>
-    <w:p>
-      <w:r>
-        <w:tab/>
-      </w:r>
-      <w:r>
-        <w:tab/>
-        <w:t>2. Service Kibana (port 5601) kết nối với Elasticsearch.</w:t>
-      </w:r>
-      <w:r>
-        <w:tab/>
-      </w:r>
-      <w:r>
-        <w:tab/>
-      </w:r>
-      <w:r>
-        <w:tab/>
-      </w:r>
-      <w:r>
-        <w:tab/>
-      </w:r>
-    </w:p>
-    <w:p>
-      <w:r>
-        <w:tab/>
-      </w:r>
-      <w:r>
-        <w:tab/>
-        <w:t>3. Thiết lập environment variables cho credentials.</w:t>
-      </w:r>
-      <w:r>
-        <w:tab/>
-      </w:r>
-      <w:r>
-        <w:tab/>
-      </w:r>
-      <w:r>
-        <w:tab/>
-      </w:r>
-      <w:r>
-        <w:tab/>
-      </w:r>
-    </w:p>
-    <w:p>
-      <w:r>
-        <w:tab/>
-      </w:r>
-      <w:r>
-        <w:tab/>
-      </w:r>
-      <w:r>
-        <w:tab/>
-      </w:r>
-      <w:r>
-        <w:tab/>
-      </w:r>
-      <w:r>
-        <w:tab/>
-      </w:r>
-      <w:r>
-        <w:tab/>
-      </w:r>
-    </w:p>
-    <w:p>
-      <w:r>
-        <w:tab/>
-        <w:t>Bài tập 8: Django + Celery + Redis</w:t>
-      </w:r>
-      <w:r>
-        <w:tab/>
-      </w:r>
-      <w:r>
-        <w:tab/>
-      </w:r>
-      <w:r>
-        <w:tab/>
-      </w:r>
-      <w:r>
-        <w:tab/>
-      </w:r>
-      <w:r>
-        <w:tab/>
-      </w:r>
-    </w:p>
-    <w:p>
-      <w:r>
-        <w:tab/>
-        <w:t>Mục tiêu: Triển khai Django với Celery worker và Redis làm message broker.</w:t>
-      </w:r>
-      <w:r>
-        <w:tab/>
-      </w:r>
-      <w:r>
-        <w:tab/>
-      </w:r>
-      <w:r>
-        <w:tab/>
-      </w:r>
-      <w:r>
-        <w:tab/>
-      </w:r>
-      <w:r>
-        <w:tab/>
-      </w:r>
-    </w:p>
-    <w:p>
-      <w:r>
-        <w:tab/>
-        <w:t>Yêu cầu:</w:t>
-      </w:r>
-      <w:r>
-        <w:tab/>
-      </w:r>
-      <w:r>
-        <w:tab/>
-      </w:r>
-      <w:r>
-        <w:tab/>
-      </w:r>
-      <w:r>
-        <w:tab/>
-      </w:r>
-      <w:r>
-        <w:tab/>
-      </w:r>
-    </w:p>
-    <w:p>
-      <w:r>
-        <w:tab/>
-      </w:r>
-      <w:r>
-        <w:tab/>
-        <w:t>1. Django app (port 8000).</w:t>
-      </w:r>
-      <w:r>
-        <w:tab/>
-      </w:r>
-      <w:r>
-        <w:tab/>
-      </w:r>
-      <w:r>
-        <w:tab/>
-      </w:r>
-      <w:r>
-        <w:tab/>
-      </w:r>
-    </w:p>
-    <w:p>
-      <w:r>
-        <w:tab/>
-      </w:r>
-      <w:r>
-        <w:tab/>
-        <w:t>2. Celery worker chạy song song.</w:t>
-      </w:r>
-      <w:r>
-        <w:tab/>
-      </w:r>
-      <w:r>
-        <w:tab/>
-      </w:r>
-      <w:r>
-        <w:tab/>
-      </w:r>
-      <w:r>
-        <w:tab/>
-      </w:r>
-    </w:p>
-    <w:p>
-      <w:r>
-        <w:tab/>
-      </w:r>
-      <w:r>
-        <w:tab/>
-        <w:t>3. Redis service cho task queue.</w:t>
-      </w:r>
-      <w:r>
-        <w:tab/>
-      </w:r>
-      <w:r>
-        <w:tab/>
-      </w:r>
-      <w:r>
-        <w:tab/>
-      </w:r>
-      <w:r>
-        <w:tab/>
-      </w:r>
-    </w:p>
-    <w:p>
-      <w:r>
-        <w:tab/>
-      </w:r>
-      <w:r>
-        <w:tab/>
-      </w:r>
-      <w:r>
-        <w:tab/>
-      </w:r>
-      <w:r>
-        <w:tab/>
-      </w:r>
-      <w:r>
-        <w:tab/>
-      </w:r>
-      <w:r>
-        <w:tab/>
-      </w:r>
-    </w:p>
-    <w:p>
-      <w:r>
-        <w:tab/>
-        <w:t>Bài tập 9: Nextcloud với MariaDB + Redis Caching</w:t>
-      </w:r>
-      <w:r>
-        <w:tab/>
-      </w:r>
-      <w:r>
-        <w:tab/>
-      </w:r>
-      <w:r>
-        <w:tab/>
-      </w:r>
-      <w:r>
-        <w:tab/>
-      </w:r>
-      <w:r>
-        <w:tab/>
-      </w:r>
-    </w:p>
-    <w:p>
-      <w:r>
-        <w:tab/>
-        <w:t>Mục tiêu: Triển khai Nextcloud (self-hosted cloud) với MariaDB và Redis.</w:t>
-      </w:r>
-      <w:r>
-        <w:tab/>
-      </w:r>
-      <w:r>
-        <w:tab/>
-      </w:r>
-      <w:r>
-        <w:tab/>
-      </w:r>
-      <w:r>
-        <w:tab/>
-      </w:r>
-      <w:r>
-        <w:tab/>
-      </w:r>
-    </w:p>
-    <w:p>
-      <w:r>
-        <w:tab/>
-        <w:t>Yêu cầu:</w:t>
-      </w:r>
-      <w:r>
-        <w:tab/>
-      </w:r>
-      <w:r>
-        <w:tab/>
-      </w:r>
-      <w:r>
-        <w:tab/>
-      </w:r>
-      <w:r>
-        <w:tab/>
-      </w:r>
-      <w:r>
-        <w:tab/>
-      </w:r>
-    </w:p>
-    <w:p>
-      <w:r>
-        <w:tab/>
-      </w:r>
-      <w:r>
-        <w:tab/>
-        <w:t>1. Nextcloud (port 80).</w:t>
-      </w:r>
-      <w:r>
-        <w:tab/>
-      </w:r>
-      <w:r>
-        <w:tab/>
-      </w:r>
-      <w:r>
-        <w:tab/>
-      </w:r>
-      <w:r>
-        <w:tab/>
-      </w:r>
-    </w:p>
-    <w:p>
-      <w:r>
-        <w:tab/>
-      </w:r>
-      <w:r>
-        <w:tab/>
-        <w:t>2. MariaDB (volume cho dữ liệu).</w:t>
-      </w:r>
-      <w:r>
-        <w:tab/>
-      </w:r>
-      <w:r>
-        <w:tab/>
-      </w:r>
-      <w:r>
-        <w:tab/>
-      </w:r>
-      <w:r>
-        <w:tab/>
-      </w:r>
-    </w:p>
-    <w:p>
-      <w:r>
-        <w:tab/>
-      </w:r>
-      <w:r>
-        <w:tab/>
-        <w:t>3. Redis cache.</w:t>
-      </w:r>
-      <w:r>
-        <w:tab/>
-      </w:r>
-      <w:r>
-        <w:tab/>
-      </w:r>
-      <w:r>
-        <w:tab/>
-      </w:r>
-      <w:r>
-        <w:tab/>
-      </w:r>
-    </w:p>
-    <w:p>
-      <w:r>
-        <w:tab/>
-      </w:r>
-      <w:r>
-        <w:tab/>
-      </w:r>
-      <w:r>
-        <w:tab/>
-      </w:r>
-      <w:r>
-        <w:tab/>
-      </w:r>
-      <w:r>
-        <w:tab/>
-      </w:r>
-      <w:r>
-        <w:tab/>
-      </w:r>
-    </w:p>
-    <w:p>
-      <w:r>
-        <w:tab/>
-        <w:t>Bài tập 10: Traefik as Reverse Proxy</w:t>
-      </w:r>
-      <w:r>
-        <w:tab/>
-      </w:r>
-      <w:r>
-        <w:tab/>
-      </w:r>
-      <w:r>
-        <w:tab/>
-      </w:r>
-      <w:r>
-        <w:tab/>
-      </w:r>
-      <w:r>
-        <w:tab/>
-      </w:r>
-    </w:p>
-    <w:p>
-      <w:r>
-        <w:tab/>
-        <w:t>Mục tiêu: Dùng Traefik để định tuyến request đến các service (Flask, WordPress, etc.).</w:t>
-      </w:r>
-      <w:r>
-        <w:tab/>
-      </w:r>
-      <w:r>
-        <w:tab/>
-      </w:r>
-      <w:r>
-        <w:tab/>
-      </w:r>
-      <w:r>
-        <w:tab/>
-      </w:r>
-      <w:r>
-        <w:tab/>
-      </w:r>
-    </w:p>
-    <w:p>
-      <w:r>
-        <w:tab/>
-        <w:t>Yêu cầu:</w:t>
-      </w:r>
-      <w:r>
-        <w:tab/>
-      </w:r>
-      <w:r>
-        <w:tab/>
-      </w:r>
-      <w:r>
-        <w:tab/>
-      </w:r>
-      <w:r>
-        <w:tab/>
-      </w:r>
-      <w:r>
-        <w:tab/>
-      </w:r>
-    </w:p>
-    <w:p>
-      <w:r>
-        <w:tab/>
-      </w:r>
-      <w:r>
-        <w:tab/>
         <w:t>1. Cấu hình Traefik với Docker provider.</w:t>
       </w:r>
       <w:r>
@@ -3866,7 +3843,6 @@
     </w:p>
     <w:p>
       <w:r>
-        <w:lastRenderedPageBreak/>
         <w:tab/>
       </w:r>
       <w:r>

</xml_diff>

<commit_message>
phan 3 bai 5
</commit_message>
<xml_diff>
--- a/Tuan05/Baocao_LamNgocThanhPhu_22650381.docx
+++ b/Tuan05/Baocao_LamNgocThanhPhu_22650381.docx
@@ -3032,6 +3032,81 @@
         <w:tab/>
       </w:r>
       <w:r>
+        <w:drawing>
+          <wp:inline distT="0" distB="0" distL="0" distR="0" wp14:anchorId="0324870C" wp14:editId="63932F44">
+            <wp:extent cx="5943600" cy="5129530"/>
+            <wp:effectExtent l="0" t="0" r="0" b="0"/>
+            <wp:docPr id="1274615888" name="Picture 1"/>
+            <wp:cNvGraphicFramePr>
+              <a:graphicFrameLocks xmlns:a="http://schemas.openxmlformats.org/drawingml/2006/main" noChangeAspect="1"/>
+            </wp:cNvGraphicFramePr>
+            <a:graphic xmlns:a="http://schemas.openxmlformats.org/drawingml/2006/main">
+              <a:graphicData uri="http://schemas.openxmlformats.org/drawingml/2006/picture">
+                <pic:pic xmlns:pic="http://schemas.openxmlformats.org/drawingml/2006/picture">
+                  <pic:nvPicPr>
+                    <pic:cNvPr id="1274615888" name=""/>
+                    <pic:cNvPicPr/>
+                  </pic:nvPicPr>
+                  <pic:blipFill>
+                    <a:blip r:embed="rId32"/>
+                    <a:stretch>
+                      <a:fillRect/>
+                    </a:stretch>
+                  </pic:blipFill>
+                  <pic:spPr>
+                    <a:xfrm>
+                      <a:off x="0" y="0"/>
+                      <a:ext cx="5943600" cy="5129530"/>
+                    </a:xfrm>
+                    <a:prstGeom prst="rect">
+                      <a:avLst/>
+                    </a:prstGeom>
+                  </pic:spPr>
+                </pic:pic>
+              </a:graphicData>
+            </a:graphic>
+          </wp:inline>
+        </w:drawing>
+      </w:r>
+      <w:r>
+        <w:lastRenderedPageBreak/>
+        <w:drawing>
+          <wp:inline distT="0" distB="0" distL="0" distR="0" wp14:anchorId="5AA9373B" wp14:editId="77331F98">
+            <wp:extent cx="5943600" cy="3946525"/>
+            <wp:effectExtent l="0" t="0" r="0" b="0"/>
+            <wp:docPr id="1194502633" name="Picture 1"/>
+            <wp:cNvGraphicFramePr>
+              <a:graphicFrameLocks xmlns:a="http://schemas.openxmlformats.org/drawingml/2006/main" noChangeAspect="1"/>
+            </wp:cNvGraphicFramePr>
+            <a:graphic xmlns:a="http://schemas.openxmlformats.org/drawingml/2006/main">
+              <a:graphicData uri="http://schemas.openxmlformats.org/drawingml/2006/picture">
+                <pic:pic xmlns:pic="http://schemas.openxmlformats.org/drawingml/2006/picture">
+                  <pic:nvPicPr>
+                    <pic:cNvPr id="1194502633" name=""/>
+                    <pic:cNvPicPr/>
+                  </pic:nvPicPr>
+                  <pic:blipFill>
+                    <a:blip r:embed="rId33"/>
+                    <a:stretch>
+                      <a:fillRect/>
+                    </a:stretch>
+                  </pic:blipFill>
+                  <pic:spPr>
+                    <a:xfrm>
+                      <a:off x="0" y="0"/>
+                      <a:ext cx="5943600" cy="3946525"/>
+                    </a:xfrm>
+                    <a:prstGeom prst="rect">
+                      <a:avLst/>
+                    </a:prstGeom>
+                  </pic:spPr>
+                </pic:pic>
+              </a:graphicData>
+            </a:graphic>
+          </wp:inline>
+        </w:drawing>
+      </w:r>
+      <w:r>
         <w:tab/>
       </w:r>
       <w:r>
@@ -3404,6 +3479,7 @@
     </w:p>
     <w:p>
       <w:r>
+        <w:lastRenderedPageBreak/>
         <w:tab/>
         <w:t>Bài tập 8: Django + Celery + Redis</w:t>
       </w:r>
@@ -3696,7 +3772,6 @@
     </w:p>
     <w:p>
       <w:r>
-        <w:lastRenderedPageBreak/>
         <w:tab/>
         <w:t>Bài tập 10: Traefik as Reverse Proxy</w:t>
       </w:r>

</xml_diff>

<commit_message>
phan 3 bai 7
</commit_message>
<xml_diff>
--- a/Tuan05/Baocao_LamNgocThanhPhu_22650381.docx
+++ b/Tuan05/Baocao_LamNgocThanhPhu_22650381.docx
@@ -3033,9 +3033,9 @@
       </w:r>
       <w:r>
         <w:drawing>
-          <wp:inline distT="0" distB="0" distL="0" distR="0" wp14:anchorId="0324870C" wp14:editId="63932F44">
-            <wp:extent cx="5943600" cy="5129530"/>
-            <wp:effectExtent l="0" t="0" r="0" b="0"/>
+          <wp:inline distT="0" distB="0" distL="0" distR="0" wp14:anchorId="0324870C" wp14:editId="6507F799">
+            <wp:extent cx="3519113" cy="3037115"/>
+            <wp:effectExtent l="0" t="0" r="5715" b="0"/>
             <wp:docPr id="1274615888" name="Picture 1"/>
             <wp:cNvGraphicFramePr>
               <a:graphicFrameLocks xmlns:a="http://schemas.openxmlformats.org/drawingml/2006/main" noChangeAspect="1"/>
@@ -3056,7 +3056,7 @@
                   <pic:spPr>
                     <a:xfrm>
                       <a:off x="0" y="0"/>
-                      <a:ext cx="5943600" cy="5129530"/>
+                      <a:ext cx="3523537" cy="3040933"/>
                     </a:xfrm>
                     <a:prstGeom prst="rect">
                       <a:avLst/>
@@ -3069,11 +3069,10 @@
         </w:drawing>
       </w:r>
       <w:r>
-        <w:lastRenderedPageBreak/>
         <w:drawing>
-          <wp:inline distT="0" distB="0" distL="0" distR="0" wp14:anchorId="5AA9373B" wp14:editId="77331F98">
-            <wp:extent cx="5943600" cy="3946525"/>
-            <wp:effectExtent l="0" t="0" r="0" b="0"/>
+          <wp:inline distT="0" distB="0" distL="0" distR="0" wp14:anchorId="5AA9373B" wp14:editId="09B87D04">
+            <wp:extent cx="3347357" cy="2222631"/>
+            <wp:effectExtent l="0" t="0" r="5715" b="6350"/>
             <wp:docPr id="1194502633" name="Picture 1"/>
             <wp:cNvGraphicFramePr>
               <a:graphicFrameLocks xmlns:a="http://schemas.openxmlformats.org/drawingml/2006/main" noChangeAspect="1"/>
@@ -3094,7 +3093,7 @@
                   <pic:spPr>
                     <a:xfrm>
                       <a:off x="0" y="0"/>
-                      <a:ext cx="5943600" cy="3946525"/>
+                      <a:ext cx="3349074" cy="2223771"/>
                     </a:xfrm>
                     <a:prstGeom prst="rect">
                       <a:avLst/>
@@ -3107,10 +3106,41 @@
         </w:drawing>
       </w:r>
       <w:r>
-        <w:tab/>
-      </w:r>
-      <w:r>
-        <w:tab/>
+        <w:drawing>
+          <wp:inline distT="0" distB="0" distL="0" distR="0" wp14:anchorId="7F918A71" wp14:editId="219761A7">
+            <wp:extent cx="3086100" cy="1546347"/>
+            <wp:effectExtent l="0" t="0" r="0" b="0"/>
+            <wp:docPr id="1140403315" name="Picture 1"/>
+            <wp:cNvGraphicFramePr>
+              <a:graphicFrameLocks xmlns:a="http://schemas.openxmlformats.org/drawingml/2006/main" noChangeAspect="1"/>
+            </wp:cNvGraphicFramePr>
+            <a:graphic xmlns:a="http://schemas.openxmlformats.org/drawingml/2006/main">
+              <a:graphicData uri="http://schemas.openxmlformats.org/drawingml/2006/picture">
+                <pic:pic xmlns:pic="http://schemas.openxmlformats.org/drawingml/2006/picture">
+                  <pic:nvPicPr>
+                    <pic:cNvPr id="1140403315" name=""/>
+                    <pic:cNvPicPr/>
+                  </pic:nvPicPr>
+                  <pic:blipFill>
+                    <a:blip r:embed="rId34"/>
+                    <a:stretch>
+                      <a:fillRect/>
+                    </a:stretch>
+                  </pic:blipFill>
+                  <pic:spPr>
+                    <a:xfrm>
+                      <a:off x="0" y="0"/>
+                      <a:ext cx="3088788" cy="1547694"/>
+                    </a:xfrm>
+                    <a:prstGeom prst="rect">
+                      <a:avLst/>
+                    </a:prstGeom>
+                  </pic:spPr>
+                </pic:pic>
+              </a:graphicData>
+            </a:graphic>
+          </wp:inline>
+        </w:drawing>
       </w:r>
       <w:r>
         <w:tab/>
@@ -3145,6 +3175,7 @@
     </w:p>
     <w:p>
       <w:r>
+        <w:lastRenderedPageBreak/>
         <w:tab/>
         <w:t>Mục tiêu: Mô phỏng pipeline dev/test bằng Docker Compose.</w:t>
       </w:r>
@@ -3462,24 +3493,98 @@
         <w:tab/>
       </w:r>
       <w:r>
-        <w:tab/>
-      </w:r>
-      <w:r>
-        <w:tab/>
-      </w:r>
-      <w:r>
-        <w:tab/>
-      </w:r>
-      <w:r>
-        <w:tab/>
-      </w:r>
-      <w:r>
-        <w:tab/>
-      </w:r>
-    </w:p>
-    <w:p>
+        <w:drawing>
+          <wp:inline distT="0" distB="0" distL="0" distR="0" wp14:anchorId="2FC07103" wp14:editId="16BF62D6">
+            <wp:extent cx="5943600" cy="3978910"/>
+            <wp:effectExtent l="0" t="0" r="0" b="2540"/>
+            <wp:docPr id="607726788" name="Picture 1"/>
+            <wp:cNvGraphicFramePr>
+              <a:graphicFrameLocks xmlns:a="http://schemas.openxmlformats.org/drawingml/2006/main" noChangeAspect="1"/>
+            </wp:cNvGraphicFramePr>
+            <a:graphic xmlns:a="http://schemas.openxmlformats.org/drawingml/2006/main">
+              <a:graphicData uri="http://schemas.openxmlformats.org/drawingml/2006/picture">
+                <pic:pic xmlns:pic="http://schemas.openxmlformats.org/drawingml/2006/picture">
+                  <pic:nvPicPr>
+                    <pic:cNvPr id="607726788" name=""/>
+                    <pic:cNvPicPr/>
+                  </pic:nvPicPr>
+                  <pic:blipFill>
+                    <a:blip r:embed="rId35"/>
+                    <a:stretch>
+                      <a:fillRect/>
+                    </a:stretch>
+                  </pic:blipFill>
+                  <pic:spPr>
+                    <a:xfrm>
+                      <a:off x="0" y="0"/>
+                      <a:ext cx="5943600" cy="3978910"/>
+                    </a:xfrm>
+                    <a:prstGeom prst="rect">
+                      <a:avLst/>
+                    </a:prstGeom>
+                  </pic:spPr>
+                </pic:pic>
+              </a:graphicData>
+            </a:graphic>
+          </wp:inline>
+        </w:drawing>
+      </w:r>
       <w:r>
         <w:lastRenderedPageBreak/>
+        <w:drawing>
+          <wp:inline distT="0" distB="0" distL="0" distR="0" wp14:anchorId="2477DDE8" wp14:editId="533846A8">
+            <wp:extent cx="5943600" cy="2973070"/>
+            <wp:effectExtent l="0" t="0" r="0" b="0"/>
+            <wp:docPr id="1573385667" name="Picture 1"/>
+            <wp:cNvGraphicFramePr>
+              <a:graphicFrameLocks xmlns:a="http://schemas.openxmlformats.org/drawingml/2006/main" noChangeAspect="1"/>
+            </wp:cNvGraphicFramePr>
+            <a:graphic xmlns:a="http://schemas.openxmlformats.org/drawingml/2006/main">
+              <a:graphicData uri="http://schemas.openxmlformats.org/drawingml/2006/picture">
+                <pic:pic xmlns:pic="http://schemas.openxmlformats.org/drawingml/2006/picture">
+                  <pic:nvPicPr>
+                    <pic:cNvPr id="1573385667" name=""/>
+                    <pic:cNvPicPr/>
+                  </pic:nvPicPr>
+                  <pic:blipFill>
+                    <a:blip r:embed="rId36"/>
+                    <a:stretch>
+                      <a:fillRect/>
+                    </a:stretch>
+                  </pic:blipFill>
+                  <pic:spPr>
+                    <a:xfrm>
+                      <a:off x="0" y="0"/>
+                      <a:ext cx="5943600" cy="2973070"/>
+                    </a:xfrm>
+                    <a:prstGeom prst="rect">
+                      <a:avLst/>
+                    </a:prstGeom>
+                  </pic:spPr>
+                </pic:pic>
+              </a:graphicData>
+            </a:graphic>
+          </wp:inline>
+        </w:drawing>
+      </w:r>
+      <w:r>
+        <w:tab/>
+      </w:r>
+      <w:r>
+        <w:tab/>
+      </w:r>
+      <w:r>
+        <w:tab/>
+      </w:r>
+      <w:r>
+        <w:tab/>
+      </w:r>
+      <w:r>
+        <w:tab/>
+      </w:r>
+    </w:p>
+    <w:p>
+      <w:r>
         <w:tab/>
         <w:t>Bài tập 8: Django + Celery + Redis</w:t>
       </w:r>
@@ -3960,6 +4065,7 @@
     </w:p>
     <w:p>
       <w:r>
+        <w:lastRenderedPageBreak/>
         <w:tab/>
       </w:r>
       <w:r>

</xml_diff>

<commit_message>
phan 3 bai 8
</commit_message>
<xml_diff>
--- a/Tuan05/Baocao_LamNgocThanhPhu_22650381.docx
+++ b/Tuan05/Baocao_LamNgocThanhPhu_22650381.docx
@@ -3714,6 +3714,43 @@
         <w:tab/>
       </w:r>
       <w:r>
+        <w:drawing>
+          <wp:inline distT="0" distB="0" distL="0" distR="0" wp14:anchorId="7294BF8E" wp14:editId="58F1A8D1">
+            <wp:extent cx="5943600" cy="2959100"/>
+            <wp:effectExtent l="0" t="0" r="0" b="0"/>
+            <wp:docPr id="725096122" name="Picture 1"/>
+            <wp:cNvGraphicFramePr>
+              <a:graphicFrameLocks xmlns:a="http://schemas.openxmlformats.org/drawingml/2006/main" noChangeAspect="1"/>
+            </wp:cNvGraphicFramePr>
+            <a:graphic xmlns:a="http://schemas.openxmlformats.org/drawingml/2006/main">
+              <a:graphicData uri="http://schemas.openxmlformats.org/drawingml/2006/picture">
+                <pic:pic xmlns:pic="http://schemas.openxmlformats.org/drawingml/2006/picture">
+                  <pic:nvPicPr>
+                    <pic:cNvPr id="725096122" name=""/>
+                    <pic:cNvPicPr/>
+                  </pic:nvPicPr>
+                  <pic:blipFill>
+                    <a:blip r:embed="rId37"/>
+                    <a:stretch>
+                      <a:fillRect/>
+                    </a:stretch>
+                  </pic:blipFill>
+                  <pic:spPr>
+                    <a:xfrm>
+                      <a:off x="0" y="0"/>
+                      <a:ext cx="5943600" cy="2959100"/>
+                    </a:xfrm>
+                    <a:prstGeom prst="rect">
+                      <a:avLst/>
+                    </a:prstGeom>
+                  </pic:spPr>
+                </pic:pic>
+              </a:graphicData>
+            </a:graphic>
+          </wp:inline>
+        </w:drawing>
+      </w:r>
+      <w:r>
         <w:tab/>
       </w:r>
       <w:r>
@@ -3773,6 +3810,7 @@
     </w:p>
     <w:p>
       <w:r>
+        <w:lastRenderedPageBreak/>
         <w:tab/>
         <w:t>Yêu cầu:</w:t>
       </w:r>
@@ -4065,7 +4103,6 @@
     </w:p>
     <w:p>
       <w:r>
-        <w:lastRenderedPageBreak/>
         <w:tab/>
       </w:r>
       <w:r>

</xml_diff>

<commit_message>
phan 3 bai 9
</commit_message>
<xml_diff>
--- a/Tuan05/Baocao_LamNgocThanhPhu_22650381.docx
+++ b/Tuan05/Baocao_LamNgocThanhPhu_22650381.docx
@@ -3894,240 +3894,100 @@
       </w:r>
     </w:p>
     <w:p>
-      <w:r>
-        <w:tab/>
-      </w:r>
-      <w:r>
-        <w:tab/>
-      </w:r>
-      <w:r>
-        <w:tab/>
-      </w:r>
-      <w:r>
-        <w:tab/>
-      </w:r>
-      <w:r>
-        <w:tab/>
-      </w:r>
-      <w:r>
-        <w:tab/>
-      </w:r>
-    </w:p>
-    <w:p>
-      <w:r>
-        <w:tab/>
-        <w:t>Bài tập 10: Traefik as Reverse Proxy</w:t>
-      </w:r>
-      <w:r>
-        <w:tab/>
-      </w:r>
-      <w:r>
-        <w:tab/>
-      </w:r>
-      <w:r>
-        <w:tab/>
-      </w:r>
-      <w:r>
-        <w:tab/>
-      </w:r>
-      <w:r>
-        <w:tab/>
-      </w:r>
-    </w:p>
-    <w:p>
-      <w:r>
-        <w:tab/>
-        <w:t>Mục tiêu: Dùng Traefik để định tuyến request đến các service (Flask, WordPress, etc.).</w:t>
-      </w:r>
-      <w:r>
-        <w:tab/>
-      </w:r>
-      <w:r>
-        <w:tab/>
-      </w:r>
-      <w:r>
-        <w:tab/>
-      </w:r>
-      <w:r>
-        <w:tab/>
-      </w:r>
-      <w:r>
-        <w:tab/>
-      </w:r>
-    </w:p>
-    <w:p>
-      <w:r>
-        <w:tab/>
-        <w:t>Yêu cầu:</w:t>
-      </w:r>
-      <w:r>
-        <w:tab/>
-      </w:r>
-      <w:r>
-        <w:tab/>
-      </w:r>
-      <w:r>
-        <w:tab/>
-      </w:r>
-      <w:r>
-        <w:tab/>
-      </w:r>
-      <w:r>
-        <w:tab/>
-      </w:r>
-    </w:p>
-    <w:p>
-      <w:r>
-        <w:tab/>
-      </w:r>
-      <w:r>
-        <w:tab/>
-        <w:t>1. Cấu hình Traefik với Docker provider.</w:t>
-      </w:r>
-      <w:r>
-        <w:tab/>
-      </w:r>
-      <w:r>
-        <w:tab/>
-      </w:r>
-      <w:r>
-        <w:tab/>
-      </w:r>
-      <w:r>
-        <w:tab/>
-      </w:r>
-    </w:p>
-    <w:p>
-      <w:r>
-        <w:tab/>
-      </w:r>
-      <w:r>
-        <w:tab/>
-        <w:t>2. Đặt labels cho services để Traefik nhận diện.</w:t>
-      </w:r>
-      <w:r>
-        <w:tab/>
-      </w:r>
-      <w:r>
-        <w:tab/>
-      </w:r>
-      <w:r>
-        <w:tab/>
-      </w:r>
-      <w:r>
-        <w:tab/>
-      </w:r>
-    </w:p>
-    <w:p>
-      <w:r>
-        <w:tab/>
-      </w:r>
-      <w:r>
-        <w:tab/>
-      </w:r>
-      <w:r>
-        <w:tab/>
-      </w:r>
-      <w:r>
-        <w:tab/>
-      </w:r>
-      <w:r>
-        <w:tab/>
-      </w:r>
-      <w:r>
-        <w:tab/>
-      </w:r>
-    </w:p>
-    <w:p>
-      <w:r>
-        <w:tab/>
-        <w:t>Tips khi làm bài tập:</w:t>
-      </w:r>
-      <w:r>
-        <w:tab/>
-      </w:r>
-      <w:r>
-        <w:tab/>
-      </w:r>
-      <w:r>
-        <w:tab/>
-      </w:r>
-      <w:r>
-        <w:tab/>
-      </w:r>
-      <w:r>
-        <w:tab/>
-      </w:r>
-    </w:p>
-    <w:p>
-      <w:r>
-        <w:tab/>
-      </w:r>
-      <w:r>
-        <w:tab/>
-        <w:t>1. Luôn dùng docker-compose down -v để xóa volumes khi test lại.</w:t>
-      </w:r>
-      <w:r>
-        <w:tab/>
-      </w:r>
-      <w:r>
-        <w:tab/>
-      </w:r>
-      <w:r>
-        <w:tab/>
-      </w:r>
-      <w:r>
-        <w:tab/>
-      </w:r>
-    </w:p>
-    <w:p>
-      <w:r>
-        <w:tab/>
-      </w:r>
-      <w:r>
-        <w:tab/>
-        <w:t>2. Kiểm tra log bằng docker-compose logs &lt;service&gt;.</w:t>
-      </w:r>
-      <w:r>
-        <w:tab/>
-      </w:r>
-      <w:r>
-        <w:tab/>
-      </w:r>
-      <w:r>
-        <w:tab/>
-      </w:r>
-      <w:r>
-        <w:tab/>
-      </w:r>
-    </w:p>
-    <w:p>
-      <w:r>
-        <w:tab/>
-      </w:r>
-      <w:r>
-        <w:tab/>
-        <w:t>3. Sử dụng docker-compose config để validate file YAML.</w:t>
-      </w:r>
-      <w:r>
-        <w:tab/>
-      </w:r>
-      <w:r>
-        <w:tab/>
-      </w:r>
-      <w:r>
-        <w:tab/>
-      </w:r>
-      <w:r>
-        <w:tab/>
-      </w:r>
-      <w:r>
-        <w:tab/>
-      </w:r>
-      <w:r>
-        <w:tab/>
-      </w:r>
-    </w:p>
+      <w:pPr>
+        <w:rPr>
+          <w:lang w:val="en-US"/>
+        </w:rPr>
+      </w:pPr>
+      <w:r>
+        <w:tab/>
+      </w:r>
+      <w:r>
+        <w:drawing>
+          <wp:inline distT="0" distB="0" distL="0" distR="0" wp14:anchorId="6CE1DE15" wp14:editId="662CD7C7">
+            <wp:extent cx="5943600" cy="4475480"/>
+            <wp:effectExtent l="0" t="0" r="0" b="1270"/>
+            <wp:docPr id="387736617" name="Picture 1"/>
+            <wp:cNvGraphicFramePr>
+              <a:graphicFrameLocks xmlns:a="http://schemas.openxmlformats.org/drawingml/2006/main" noChangeAspect="1"/>
+            </wp:cNvGraphicFramePr>
+            <a:graphic xmlns:a="http://schemas.openxmlformats.org/drawingml/2006/main">
+              <a:graphicData uri="http://schemas.openxmlformats.org/drawingml/2006/picture">
+                <pic:pic xmlns:pic="http://schemas.openxmlformats.org/drawingml/2006/picture">
+                  <pic:nvPicPr>
+                    <pic:cNvPr id="387736617" name=""/>
+                    <pic:cNvPicPr/>
+                  </pic:nvPicPr>
+                  <pic:blipFill>
+                    <a:blip r:embed="rId38"/>
+                    <a:stretch>
+                      <a:fillRect/>
+                    </a:stretch>
+                  </pic:blipFill>
+                  <pic:spPr>
+                    <a:xfrm>
+                      <a:off x="0" y="0"/>
+                      <a:ext cx="5943600" cy="4475480"/>
+                    </a:xfrm>
+                    <a:prstGeom prst="rect">
+                      <a:avLst/>
+                    </a:prstGeom>
+                  </pic:spPr>
+                </pic:pic>
+              </a:graphicData>
+            </a:graphic>
+          </wp:inline>
+        </w:drawing>
+      </w:r>
+    </w:p>
+    <w:p>
+      <w:pPr>
+        <w:rPr>
+          <w:lang w:val="en-US"/>
+        </w:rPr>
+      </w:pPr>
+      <w:r>
+        <w:rPr>
+          <w:lang w:val="en-US"/>
+        </w:rPr>
+        <w:drawing>
+          <wp:inline distT="0" distB="0" distL="0" distR="0" wp14:anchorId="286F6F06" wp14:editId="018EC440">
+            <wp:extent cx="5943600" cy="2486660"/>
+            <wp:effectExtent l="0" t="0" r="0" b="8890"/>
+            <wp:docPr id="2007585938" name="Picture 1"/>
+            <wp:cNvGraphicFramePr>
+              <a:graphicFrameLocks xmlns:a="http://schemas.openxmlformats.org/drawingml/2006/main" noChangeAspect="1"/>
+            </wp:cNvGraphicFramePr>
+            <a:graphic xmlns:a="http://schemas.openxmlformats.org/drawingml/2006/main">
+              <a:graphicData uri="http://schemas.openxmlformats.org/drawingml/2006/picture">
+                <pic:pic xmlns:pic="http://schemas.openxmlformats.org/drawingml/2006/picture">
+                  <pic:nvPicPr>
+                    <pic:cNvPr id="2007585938" name=""/>
+                    <pic:cNvPicPr/>
+                  </pic:nvPicPr>
+                  <pic:blipFill>
+                    <a:blip r:embed="rId39"/>
+                    <a:stretch>
+                      <a:fillRect/>
+                    </a:stretch>
+                  </pic:blipFill>
+                  <pic:spPr>
+                    <a:xfrm>
+                      <a:off x="0" y="0"/>
+                      <a:ext cx="5943600" cy="2486660"/>
+                    </a:xfrm>
+                    <a:prstGeom prst="rect">
+                      <a:avLst/>
+                    </a:prstGeom>
+                  </pic:spPr>
+                </pic:pic>
+              </a:graphicData>
+            </a:graphic>
+          </wp:inline>
+        </w:drawing>
+      </w:r>
+    </w:p>
+    <w:p/>
     <w:sectPr>
       <w:pgSz w:w="12240" w:h="15840"/>
       <w:pgMar w:top="1440" w:right="1440" w:bottom="1440" w:left="1440" w:header="720" w:footer="720" w:gutter="0"/>

</xml_diff>